<commit_message>
Add the missing cost-and-latency table and correct its cost claim
Table 9 was a caption with no table. When the earlier audit found three
caption-only tables I built those three and missed this one, since it was
Table 11 before the numbering gaps were closed. It is now a 20-row table of
measured calls, cost, per-call cost, and mean and p95 latency for every model
and condition, generated from results/revision_cost_latency.csv.

Its caption previously described a hypothetical token budget (about 538 input
and 200 output tokens per instance) that does not match the runs: Condition B
averages roughly 2,559 input and 87 output tokens for GPT-4.1 Nano. The caption
now describes the measured data and states that latency is wall-clock, so it
includes provider queueing.

The accompanying claim that visual references add $0.14 to $7.27 per model was
stale. Measured Condition C and D cost is $0.23 to $3.64 per model.

Every table caption in the paper now has a table beside it.
</commit_message>
<xml_diff>
--- a/manuscripts/can_llm_web_agents_verify_their_own_work_R1.docx
+++ b/manuscripts/can_llm_web_agents_verify_their_own_work_R1.docx
@@ -22077,9 +22077,4666 @@
         <w:pStyle w:val="Normal"/>
       </w:pPr>
       <w:r>
-        <w:t xml:space="preserve">Table 9: Estimated cost and latency for verifying 909 instances. Text-only verification assumes ~538 input tokens and ~200 output tokens per instance.</w:t>
-      </w:r>
-    </w:p>
+        <w:t xml:space="preserve">Table 9: Measured cost and latency per model and condition over the runs reported in this paper. Cost uses the provider list prices in config.py at the time of the runs; latency is wall-clock per API call, so it includes provider queueing.</w:t>
+      </w:r>
+    </w:p>
+    <w:tbl>
+      <w:tblPr>
+        <w:tblStyle w:val="Table5"/>
+        <w:tblW w:w="4130.0" w:type="dxa"/>
+        <w:jc w:val="left"/>
+        <w:tblBorders>
+          <w:top w:color="000000" w:space="0" w:sz="8" w:val="single"/>
+          <w:left w:color="000000" w:space="0" w:sz="8" w:val="single"/>
+          <w:bottom w:color="000000" w:space="0" w:sz="8" w:val="single"/>
+          <w:right w:color="000000" w:space="0" w:sz="8" w:val="single"/>
+          <w:insideH w:color="000000" w:space="0" w:sz="8" w:val="single"/>
+          <w:insideV w:color="000000" w:space="0" w:sz="8" w:val="single"/>
+        </w:tblBorders>
+        <w:tblLayout w:type="fixed"/>
+        <w:tblLook w:val="0600"/>
+      </w:tblPr>
+      <w:tblGrid>
+        <w:gridCol w:w="1000"/>
+        <w:gridCol w:w="380"/>
+        <w:gridCol w:w="470"/>
+        <w:gridCol w:w="620"/>
+        <w:gridCol w:w="620"/>
+        <w:gridCol w:w="520"/>
+        <w:gridCol w:w="520"/>
+      </w:tblGrid>
+      <w:tr>
+        <w:trPr>
+          <w:cantSplit w:val="0"/>
+          <w:tblHeader w:val="1"/>
+        </w:trPr>
+        <w:tc>
+          <w:tcPr>
+            <w:shd w:fill="auto" w:val="clear"/>
+            <w:tcMar>
+              <w:top w:w="100.0" w:type="dxa"/>
+              <w:left w:w="100.0" w:type="dxa"/>
+              <w:bottom w:w="100.0" w:type="dxa"/>
+              <w:right w:w="100.0" w:type="dxa"/>
+            </w:tcMar>
+            <w:vAlign w:val="top"/>
+          </w:tcPr>
+          <w:p>
+            <w:pPr>
+              <w:jc w:val="left"/>
+              <w:rPr>
+                <w:rFonts w:ascii="Times New Roman" w:cs="Times New Roman" w:eastAsia="Times New Roman" w:hAnsi="Times New Roman"/>
+                <w:b w:val="1"/>
+                <w:bCs w:val="1"/>
+                <w:sz w:val="16"/>
+                <w:szCs w:val="16"/>
+              </w:rPr>
+            </w:pPr>
+            <w:r>
+              <w:rPr>
+                <w:rFonts w:ascii="Times New Roman" w:cs="Times New Roman" w:eastAsia="Times New Roman" w:hAnsi="Times New Roman"/>
+                <w:b w:val="1"/>
+                <w:bCs w:val="1"/>
+                <w:sz w:val="16"/>
+                <w:szCs w:val="16"/>
+                <w:rtl w:val="0"/>
+              </w:rPr>
+              <w:t xml:space="preserve">Model</w:t>
+            </w:r>
+          </w:p>
+        </w:tc>
+        <w:tc>
+          <w:tcPr>
+            <w:shd w:fill="auto" w:val="clear"/>
+            <w:tcMar>
+              <w:top w:w="100.0" w:type="dxa"/>
+              <w:left w:w="100.0" w:type="dxa"/>
+              <w:bottom w:w="100.0" w:type="dxa"/>
+              <w:right w:w="100.0" w:type="dxa"/>
+            </w:tcMar>
+            <w:vAlign w:val="top"/>
+          </w:tcPr>
+          <w:p>
+            <w:pPr>
+              <w:jc w:val="left"/>
+              <w:rPr>
+                <w:rFonts w:ascii="Times New Roman" w:cs="Times New Roman" w:eastAsia="Times New Roman" w:hAnsi="Times New Roman"/>
+                <w:b w:val="1"/>
+                <w:bCs w:val="1"/>
+                <w:sz w:val="16"/>
+                <w:szCs w:val="16"/>
+              </w:rPr>
+            </w:pPr>
+            <w:r>
+              <w:rPr>
+                <w:rFonts w:ascii="Times New Roman" w:cs="Times New Roman" w:eastAsia="Times New Roman" w:hAnsi="Times New Roman"/>
+                <w:b w:val="1"/>
+                <w:bCs w:val="1"/>
+                <w:sz w:val="16"/>
+                <w:szCs w:val="16"/>
+                <w:rtl w:val="0"/>
+              </w:rPr>
+              <w:t xml:space="preserve">Cond</w:t>
+            </w:r>
+          </w:p>
+        </w:tc>
+        <w:tc>
+          <w:tcPr>
+            <w:shd w:fill="auto" w:val="clear"/>
+            <w:tcMar>
+              <w:top w:w="100.0" w:type="dxa"/>
+              <w:left w:w="100.0" w:type="dxa"/>
+              <w:bottom w:w="100.0" w:type="dxa"/>
+              <w:right w:w="100.0" w:type="dxa"/>
+            </w:tcMar>
+            <w:vAlign w:val="top"/>
+          </w:tcPr>
+          <w:p>
+            <w:pPr>
+              <w:jc w:val="left"/>
+              <w:rPr>
+                <w:rFonts w:ascii="Times New Roman" w:cs="Times New Roman" w:eastAsia="Times New Roman" w:hAnsi="Times New Roman"/>
+                <w:b w:val="1"/>
+                <w:bCs w:val="1"/>
+                <w:sz w:val="16"/>
+                <w:szCs w:val="16"/>
+              </w:rPr>
+            </w:pPr>
+            <w:r>
+              <w:rPr>
+                <w:rFonts w:ascii="Times New Roman" w:cs="Times New Roman" w:eastAsia="Times New Roman" w:hAnsi="Times New Roman"/>
+                <w:b w:val="1"/>
+                <w:bCs w:val="1"/>
+                <w:sz w:val="16"/>
+                <w:szCs w:val="16"/>
+                <w:rtl w:val="0"/>
+              </w:rPr>
+              <w:t xml:space="preserve">Calls</w:t>
+            </w:r>
+          </w:p>
+        </w:tc>
+        <w:tc>
+          <w:tcPr>
+            <w:shd w:fill="auto" w:val="clear"/>
+            <w:tcMar>
+              <w:top w:w="100.0" w:type="dxa"/>
+              <w:left w:w="100.0" w:type="dxa"/>
+              <w:bottom w:w="100.0" w:type="dxa"/>
+              <w:right w:w="100.0" w:type="dxa"/>
+            </w:tcMar>
+            <w:vAlign w:val="top"/>
+          </w:tcPr>
+          <w:p>
+            <w:pPr>
+              <w:jc w:val="left"/>
+              <w:rPr>
+                <w:rFonts w:ascii="Times New Roman" w:cs="Times New Roman" w:eastAsia="Times New Roman" w:hAnsi="Times New Roman"/>
+                <w:b w:val="1"/>
+                <w:bCs w:val="1"/>
+                <w:sz w:val="16"/>
+                <w:szCs w:val="16"/>
+              </w:rPr>
+            </w:pPr>
+            <w:r>
+              <w:rPr>
+                <w:rFonts w:ascii="Times New Roman" w:cs="Times New Roman" w:eastAsia="Times New Roman" w:hAnsi="Times New Roman"/>
+                <w:b w:val="1"/>
+                <w:bCs w:val="1"/>
+                <w:sz w:val="16"/>
+                <w:szCs w:val="16"/>
+                <w:rtl w:val="0"/>
+              </w:rPr>
+              <w:t xml:space="preserve">Cost (USD)</w:t>
+            </w:r>
+          </w:p>
+        </w:tc>
+        <w:tc>
+          <w:tcPr>
+            <w:shd w:fill="auto" w:val="clear"/>
+            <w:tcMar>
+              <w:top w:w="100.0" w:type="dxa"/>
+              <w:left w:w="100.0" w:type="dxa"/>
+              <w:bottom w:w="100.0" w:type="dxa"/>
+              <w:right w:w="100.0" w:type="dxa"/>
+            </w:tcMar>
+            <w:vAlign w:val="top"/>
+          </w:tcPr>
+          <w:p>
+            <w:pPr>
+              <w:jc w:val="left"/>
+              <w:rPr>
+                <w:rFonts w:ascii="Times New Roman" w:cs="Times New Roman" w:eastAsia="Times New Roman" w:hAnsi="Times New Roman"/>
+                <w:b w:val="1"/>
+                <w:bCs w:val="1"/>
+                <w:sz w:val="16"/>
+                <w:szCs w:val="16"/>
+              </w:rPr>
+            </w:pPr>
+            <w:r>
+              <w:rPr>
+                <w:rFonts w:ascii="Times New Roman" w:cs="Times New Roman" w:eastAsia="Times New Roman" w:hAnsi="Times New Roman"/>
+                <w:b w:val="1"/>
+                <w:bCs w:val="1"/>
+                <w:sz w:val="16"/>
+                <w:szCs w:val="16"/>
+                <w:rtl w:val="0"/>
+              </w:rPr>
+              <w:t xml:space="preserve">Per call</w:t>
+            </w:r>
+          </w:p>
+        </w:tc>
+        <w:tc>
+          <w:tcPr>
+            <w:shd w:fill="auto" w:val="clear"/>
+            <w:tcMar>
+              <w:top w:w="100.0" w:type="dxa"/>
+              <w:left w:w="100.0" w:type="dxa"/>
+              <w:bottom w:w="100.0" w:type="dxa"/>
+              <w:right w:w="100.0" w:type="dxa"/>
+            </w:tcMar>
+            <w:vAlign w:val="top"/>
+          </w:tcPr>
+          <w:p>
+            <w:pPr>
+              <w:jc w:val="left"/>
+              <w:rPr>
+                <w:rFonts w:ascii="Times New Roman" w:cs="Times New Roman" w:eastAsia="Times New Roman" w:hAnsi="Times New Roman"/>
+                <w:b w:val="1"/>
+                <w:bCs w:val="1"/>
+                <w:sz w:val="16"/>
+                <w:szCs w:val="16"/>
+              </w:rPr>
+            </w:pPr>
+            <w:r>
+              <w:rPr>
+                <w:rFonts w:ascii="Times New Roman" w:cs="Times New Roman" w:eastAsia="Times New Roman" w:hAnsi="Times New Roman"/>
+                <w:b w:val="1"/>
+                <w:bCs w:val="1"/>
+                <w:sz w:val="16"/>
+                <w:szCs w:val="16"/>
+                <w:rtl w:val="0"/>
+              </w:rPr>
+              <w:t xml:space="preserve">Mean lat.</w:t>
+            </w:r>
+          </w:p>
+        </w:tc>
+        <w:tc>
+          <w:tcPr>
+            <w:shd w:fill="auto" w:val="clear"/>
+            <w:tcMar>
+              <w:top w:w="100.0" w:type="dxa"/>
+              <w:left w:w="100.0" w:type="dxa"/>
+              <w:bottom w:w="100.0" w:type="dxa"/>
+              <w:right w:w="100.0" w:type="dxa"/>
+            </w:tcMar>
+            <w:vAlign w:val="top"/>
+          </w:tcPr>
+          <w:p>
+            <w:pPr>
+              <w:jc w:val="left"/>
+              <w:rPr>
+                <w:rFonts w:ascii="Times New Roman" w:cs="Times New Roman" w:eastAsia="Times New Roman" w:hAnsi="Times New Roman"/>
+                <w:b w:val="1"/>
+                <w:bCs w:val="1"/>
+                <w:sz w:val="16"/>
+                <w:szCs w:val="16"/>
+              </w:rPr>
+            </w:pPr>
+            <w:r>
+              <w:rPr>
+                <w:rFonts w:ascii="Times New Roman" w:cs="Times New Roman" w:eastAsia="Times New Roman" w:hAnsi="Times New Roman"/>
+                <w:b w:val="1"/>
+                <w:bCs w:val="1"/>
+                <w:sz w:val="16"/>
+                <w:szCs w:val="16"/>
+                <w:rtl w:val="0"/>
+              </w:rPr>
+              <w:t xml:space="preserve">p95 lat.</w:t>
+            </w:r>
+          </w:p>
+        </w:tc>
+      </w:tr>
+      <w:tr>
+        <w:tc>
+          <w:tcPr>
+            <w:shd w:fill="auto" w:val="clear"/>
+            <w:tcMar>
+              <w:top w:w="100.0" w:type="dxa"/>
+              <w:left w:w="100.0" w:type="dxa"/>
+              <w:bottom w:w="100.0" w:type="dxa"/>
+              <w:right w:w="100.0" w:type="dxa"/>
+            </w:tcMar>
+            <w:vAlign w:val="top"/>
+          </w:tcPr>
+          <w:p>
+            <w:pPr>
+              <w:jc w:val="left"/>
+              <w:rPr>
+                <w:rFonts w:ascii="Times New Roman" w:cs="Times New Roman" w:eastAsia="Times New Roman" w:hAnsi="Times New Roman"/>
+                <w:sz w:val="16"/>
+                <w:szCs w:val="16"/>
+              </w:rPr>
+            </w:pPr>
+            <w:r>
+              <w:rPr>
+                <w:rFonts w:ascii="Times New Roman" w:cs="Times New Roman" w:eastAsia="Times New Roman" w:hAnsi="Times New Roman"/>
+                <w:sz w:val="16"/>
+                <w:szCs w:val="16"/>
+                <w:rtl w:val="0"/>
+              </w:rPr>
+              <w:t xml:space="preserve">GPT-4.1 Nano</w:t>
+            </w:r>
+          </w:p>
+        </w:tc>
+        <w:tc>
+          <w:tcPr>
+            <w:shd w:fill="auto" w:val="clear"/>
+            <w:tcMar>
+              <w:top w:w="100.0" w:type="dxa"/>
+              <w:left w:w="100.0" w:type="dxa"/>
+              <w:bottom w:w="100.0" w:type="dxa"/>
+              <w:right w:w="100.0" w:type="dxa"/>
+            </w:tcMar>
+            <w:vAlign w:val="top"/>
+          </w:tcPr>
+          <w:p>
+            <w:pPr>
+              <w:jc w:val="left"/>
+              <w:rPr>
+                <w:rFonts w:ascii="Times New Roman" w:cs="Times New Roman" w:eastAsia="Times New Roman" w:hAnsi="Times New Roman"/>
+                <w:sz w:val="16"/>
+                <w:szCs w:val="16"/>
+              </w:rPr>
+            </w:pPr>
+            <w:r>
+              <w:rPr>
+                <w:rFonts w:ascii="Times New Roman" w:cs="Times New Roman" w:eastAsia="Times New Roman" w:hAnsi="Times New Roman"/>
+                <w:sz w:val="16"/>
+                <w:szCs w:val="16"/>
+                <w:rtl w:val="0"/>
+              </w:rPr>
+              <w:t xml:space="preserve">A</w:t>
+            </w:r>
+          </w:p>
+        </w:tc>
+        <w:tc>
+          <w:tcPr>
+            <w:shd w:fill="auto" w:val="clear"/>
+            <w:tcMar>
+              <w:top w:w="100.0" w:type="dxa"/>
+              <w:left w:w="100.0" w:type="dxa"/>
+              <w:bottom w:w="100.0" w:type="dxa"/>
+              <w:right w:w="100.0" w:type="dxa"/>
+            </w:tcMar>
+            <w:vAlign w:val="top"/>
+          </w:tcPr>
+          <w:p>
+            <w:pPr>
+              <w:jc w:val="left"/>
+              <w:rPr>
+                <w:rFonts w:ascii="Times New Roman" w:cs="Times New Roman" w:eastAsia="Times New Roman" w:hAnsi="Times New Roman"/>
+                <w:sz w:val="16"/>
+                <w:szCs w:val="16"/>
+              </w:rPr>
+            </w:pPr>
+            <w:r>
+              <w:rPr>
+                <w:rFonts w:ascii="Times New Roman" w:cs="Times New Roman" w:eastAsia="Times New Roman" w:hAnsi="Times New Roman"/>
+                <w:sz w:val="16"/>
+                <w:szCs w:val="16"/>
+                <w:rtl w:val="0"/>
+              </w:rPr>
+              <w:t xml:space="preserve">909</w:t>
+            </w:r>
+          </w:p>
+        </w:tc>
+        <w:tc>
+          <w:tcPr>
+            <w:shd w:fill="auto" w:val="clear"/>
+            <w:tcMar>
+              <w:top w:w="100.0" w:type="dxa"/>
+              <w:left w:w="100.0" w:type="dxa"/>
+              <w:bottom w:w="100.0" w:type="dxa"/>
+              <w:right w:w="100.0" w:type="dxa"/>
+            </w:tcMar>
+            <w:vAlign w:val="top"/>
+          </w:tcPr>
+          <w:p>
+            <w:pPr>
+              <w:jc w:val="left"/>
+              <w:rPr>
+                <w:rFonts w:ascii="Times New Roman" w:cs="Times New Roman" w:eastAsia="Times New Roman" w:hAnsi="Times New Roman"/>
+                <w:sz w:val="16"/>
+                <w:szCs w:val="16"/>
+              </w:rPr>
+            </w:pPr>
+            <w:r>
+              <w:rPr>
+                <w:rFonts w:ascii="Times New Roman" w:cs="Times New Roman" w:eastAsia="Times New Roman" w:hAnsi="Times New Roman"/>
+                <w:sz w:val="16"/>
+                <w:szCs w:val="16"/>
+                <w:rtl w:val="0"/>
+              </w:rPr>
+              <w:t xml:space="preserve">$0.26</w:t>
+            </w:r>
+          </w:p>
+        </w:tc>
+        <w:tc>
+          <w:tcPr>
+            <w:shd w:fill="auto" w:val="clear"/>
+            <w:tcMar>
+              <w:top w:w="100.0" w:type="dxa"/>
+              <w:left w:w="100.0" w:type="dxa"/>
+              <w:bottom w:w="100.0" w:type="dxa"/>
+              <w:right w:w="100.0" w:type="dxa"/>
+            </w:tcMar>
+            <w:vAlign w:val="top"/>
+          </w:tcPr>
+          <w:p>
+            <w:pPr>
+              <w:jc w:val="left"/>
+              <w:rPr>
+                <w:rFonts w:ascii="Times New Roman" w:cs="Times New Roman" w:eastAsia="Times New Roman" w:hAnsi="Times New Roman"/>
+                <w:sz w:val="16"/>
+                <w:szCs w:val="16"/>
+              </w:rPr>
+            </w:pPr>
+            <w:r>
+              <w:rPr>
+                <w:rFonts w:ascii="Times New Roman" w:cs="Times New Roman" w:eastAsia="Times New Roman" w:hAnsi="Times New Roman"/>
+                <w:sz w:val="16"/>
+                <w:szCs w:val="16"/>
+                <w:rtl w:val="0"/>
+              </w:rPr>
+              <w:t xml:space="preserve">$0.00028</w:t>
+            </w:r>
+          </w:p>
+        </w:tc>
+        <w:tc>
+          <w:tcPr>
+            <w:shd w:fill="auto" w:val="clear"/>
+            <w:tcMar>
+              <w:top w:w="100.0" w:type="dxa"/>
+              <w:left w:w="100.0" w:type="dxa"/>
+              <w:bottom w:w="100.0" w:type="dxa"/>
+              <w:right w:w="100.0" w:type="dxa"/>
+            </w:tcMar>
+            <w:vAlign w:val="top"/>
+          </w:tcPr>
+          <w:p>
+            <w:pPr>
+              <w:jc w:val="left"/>
+              <w:rPr>
+                <w:rFonts w:ascii="Times New Roman" w:cs="Times New Roman" w:eastAsia="Times New Roman" w:hAnsi="Times New Roman"/>
+                <w:sz w:val="16"/>
+                <w:szCs w:val="16"/>
+              </w:rPr>
+            </w:pPr>
+            <w:r>
+              <w:rPr>
+                <w:rFonts w:ascii="Times New Roman" w:cs="Times New Roman" w:eastAsia="Times New Roman" w:hAnsi="Times New Roman"/>
+                <w:sz w:val="16"/>
+                <w:szCs w:val="16"/>
+                <w:rtl w:val="0"/>
+              </w:rPr>
+              <w:t xml:space="preserve">4.4s</w:t>
+            </w:r>
+          </w:p>
+        </w:tc>
+        <w:tc>
+          <w:tcPr>
+            <w:shd w:fill="auto" w:val="clear"/>
+            <w:tcMar>
+              <w:top w:w="100.0" w:type="dxa"/>
+              <w:left w:w="100.0" w:type="dxa"/>
+              <w:bottom w:w="100.0" w:type="dxa"/>
+              <w:right w:w="100.0" w:type="dxa"/>
+            </w:tcMar>
+            <w:vAlign w:val="top"/>
+          </w:tcPr>
+          <w:p>
+            <w:pPr>
+              <w:jc w:val="left"/>
+              <w:rPr>
+                <w:rFonts w:ascii="Times New Roman" w:cs="Times New Roman" w:eastAsia="Times New Roman" w:hAnsi="Times New Roman"/>
+                <w:sz w:val="16"/>
+                <w:szCs w:val="16"/>
+              </w:rPr>
+            </w:pPr>
+            <w:r>
+              <w:rPr>
+                <w:rFonts w:ascii="Times New Roman" w:cs="Times New Roman" w:eastAsia="Times New Roman" w:hAnsi="Times New Roman"/>
+                <w:sz w:val="16"/>
+                <w:szCs w:val="16"/>
+                <w:rtl w:val="0"/>
+              </w:rPr>
+              <w:t xml:space="preserve">12.2s</w:t>
+            </w:r>
+          </w:p>
+        </w:tc>
+      </w:tr>
+      <w:tr>
+        <w:tc>
+          <w:tcPr>
+            <w:shd w:fill="auto" w:val="clear"/>
+            <w:tcMar>
+              <w:top w:w="100.0" w:type="dxa"/>
+              <w:left w:w="100.0" w:type="dxa"/>
+              <w:bottom w:w="100.0" w:type="dxa"/>
+              <w:right w:w="100.0" w:type="dxa"/>
+            </w:tcMar>
+            <w:vAlign w:val="top"/>
+          </w:tcPr>
+          <w:p>
+            <w:pPr>
+              <w:jc w:val="left"/>
+              <w:rPr>
+                <w:rFonts w:ascii="Times New Roman" w:cs="Times New Roman" w:eastAsia="Times New Roman" w:hAnsi="Times New Roman"/>
+                <w:sz w:val="16"/>
+                <w:szCs w:val="16"/>
+              </w:rPr>
+            </w:pPr>
+            <w:r>
+              <w:rPr>
+                <w:rFonts w:ascii="Times New Roman" w:cs="Times New Roman" w:eastAsia="Times New Roman" w:hAnsi="Times New Roman"/>
+                <w:sz w:val="16"/>
+                <w:szCs w:val="16"/>
+                <w:rtl w:val="0"/>
+              </w:rPr>
+              <w:t xml:space="preserve"/>
+            </w:r>
+          </w:p>
+        </w:tc>
+        <w:tc>
+          <w:tcPr>
+            <w:shd w:fill="auto" w:val="clear"/>
+            <w:tcMar>
+              <w:top w:w="100.0" w:type="dxa"/>
+              <w:left w:w="100.0" w:type="dxa"/>
+              <w:bottom w:w="100.0" w:type="dxa"/>
+              <w:right w:w="100.0" w:type="dxa"/>
+            </w:tcMar>
+            <w:vAlign w:val="top"/>
+          </w:tcPr>
+          <w:p>
+            <w:pPr>
+              <w:jc w:val="left"/>
+              <w:rPr>
+                <w:rFonts w:ascii="Times New Roman" w:cs="Times New Roman" w:eastAsia="Times New Roman" w:hAnsi="Times New Roman"/>
+                <w:sz w:val="16"/>
+                <w:szCs w:val="16"/>
+              </w:rPr>
+            </w:pPr>
+            <w:r>
+              <w:rPr>
+                <w:rFonts w:ascii="Times New Roman" w:cs="Times New Roman" w:eastAsia="Times New Roman" w:hAnsi="Times New Roman"/>
+                <w:sz w:val="16"/>
+                <w:szCs w:val="16"/>
+                <w:rtl w:val="0"/>
+              </w:rPr>
+              <w:t xml:space="preserve">B</w:t>
+            </w:r>
+          </w:p>
+        </w:tc>
+        <w:tc>
+          <w:tcPr>
+            <w:shd w:fill="auto" w:val="clear"/>
+            <w:tcMar>
+              <w:top w:w="100.0" w:type="dxa"/>
+              <w:left w:w="100.0" w:type="dxa"/>
+              <w:bottom w:w="100.0" w:type="dxa"/>
+              <w:right w:w="100.0" w:type="dxa"/>
+            </w:tcMar>
+            <w:vAlign w:val="top"/>
+          </w:tcPr>
+          <w:p>
+            <w:pPr>
+              <w:jc w:val="left"/>
+              <w:rPr>
+                <w:rFonts w:ascii="Times New Roman" w:cs="Times New Roman" w:eastAsia="Times New Roman" w:hAnsi="Times New Roman"/>
+                <w:sz w:val="16"/>
+                <w:szCs w:val="16"/>
+              </w:rPr>
+            </w:pPr>
+            <w:r>
+              <w:rPr>
+                <w:rFonts w:ascii="Times New Roman" w:cs="Times New Roman" w:eastAsia="Times New Roman" w:hAnsi="Times New Roman"/>
+                <w:sz w:val="16"/>
+                <w:szCs w:val="16"/>
+                <w:rtl w:val="0"/>
+              </w:rPr>
+              <w:t xml:space="preserve">909</w:t>
+            </w:r>
+          </w:p>
+        </w:tc>
+        <w:tc>
+          <w:tcPr>
+            <w:shd w:fill="auto" w:val="clear"/>
+            <w:tcMar>
+              <w:top w:w="100.0" w:type="dxa"/>
+              <w:left w:w="100.0" w:type="dxa"/>
+              <w:bottom w:w="100.0" w:type="dxa"/>
+              <w:right w:w="100.0" w:type="dxa"/>
+            </w:tcMar>
+            <w:vAlign w:val="top"/>
+          </w:tcPr>
+          <w:p>
+            <w:pPr>
+              <w:jc w:val="left"/>
+              <w:rPr>
+                <w:rFonts w:ascii="Times New Roman" w:cs="Times New Roman" w:eastAsia="Times New Roman" w:hAnsi="Times New Roman"/>
+                <w:sz w:val="16"/>
+                <w:szCs w:val="16"/>
+              </w:rPr>
+            </w:pPr>
+            <w:r>
+              <w:rPr>
+                <w:rFonts w:ascii="Times New Roman" w:cs="Times New Roman" w:eastAsia="Times New Roman" w:hAnsi="Times New Roman"/>
+                <w:sz w:val="16"/>
+                <w:szCs w:val="16"/>
+                <w:rtl w:val="0"/>
+              </w:rPr>
+              <w:t xml:space="preserve">$0.26</w:t>
+            </w:r>
+          </w:p>
+        </w:tc>
+        <w:tc>
+          <w:tcPr>
+            <w:shd w:fill="auto" w:val="clear"/>
+            <w:tcMar>
+              <w:top w:w="100.0" w:type="dxa"/>
+              <w:left w:w="100.0" w:type="dxa"/>
+              <w:bottom w:w="100.0" w:type="dxa"/>
+              <w:right w:w="100.0" w:type="dxa"/>
+            </w:tcMar>
+            <w:vAlign w:val="top"/>
+          </w:tcPr>
+          <w:p>
+            <w:pPr>
+              <w:jc w:val="left"/>
+              <w:rPr>
+                <w:rFonts w:ascii="Times New Roman" w:cs="Times New Roman" w:eastAsia="Times New Roman" w:hAnsi="Times New Roman"/>
+                <w:sz w:val="16"/>
+                <w:szCs w:val="16"/>
+              </w:rPr>
+            </w:pPr>
+            <w:r>
+              <w:rPr>
+                <w:rFonts w:ascii="Times New Roman" w:cs="Times New Roman" w:eastAsia="Times New Roman" w:hAnsi="Times New Roman"/>
+                <w:sz w:val="16"/>
+                <w:szCs w:val="16"/>
+                <w:rtl w:val="0"/>
+              </w:rPr>
+              <w:t xml:space="preserve">$0.00029</w:t>
+            </w:r>
+          </w:p>
+        </w:tc>
+        <w:tc>
+          <w:tcPr>
+            <w:shd w:fill="auto" w:val="clear"/>
+            <w:tcMar>
+              <w:top w:w="100.0" w:type="dxa"/>
+              <w:left w:w="100.0" w:type="dxa"/>
+              <w:bottom w:w="100.0" w:type="dxa"/>
+              <w:right w:w="100.0" w:type="dxa"/>
+            </w:tcMar>
+            <w:vAlign w:val="top"/>
+          </w:tcPr>
+          <w:p>
+            <w:pPr>
+              <w:jc w:val="left"/>
+              <w:rPr>
+                <w:rFonts w:ascii="Times New Roman" w:cs="Times New Roman" w:eastAsia="Times New Roman" w:hAnsi="Times New Roman"/>
+                <w:sz w:val="16"/>
+                <w:szCs w:val="16"/>
+              </w:rPr>
+            </w:pPr>
+            <w:r>
+              <w:rPr>
+                <w:rFonts w:ascii="Times New Roman" w:cs="Times New Roman" w:eastAsia="Times New Roman" w:hAnsi="Times New Roman"/>
+                <w:sz w:val="16"/>
+                <w:szCs w:val="16"/>
+                <w:rtl w:val="0"/>
+              </w:rPr>
+              <w:t xml:space="preserve">3.8s</w:t>
+            </w:r>
+          </w:p>
+        </w:tc>
+        <w:tc>
+          <w:tcPr>
+            <w:shd w:fill="auto" w:val="clear"/>
+            <w:tcMar>
+              <w:top w:w="100.0" w:type="dxa"/>
+              <w:left w:w="100.0" w:type="dxa"/>
+              <w:bottom w:w="100.0" w:type="dxa"/>
+              <w:right w:w="100.0" w:type="dxa"/>
+            </w:tcMar>
+            <w:vAlign w:val="top"/>
+          </w:tcPr>
+          <w:p>
+            <w:pPr>
+              <w:jc w:val="left"/>
+              <w:rPr>
+                <w:rFonts w:ascii="Times New Roman" w:cs="Times New Roman" w:eastAsia="Times New Roman" w:hAnsi="Times New Roman"/>
+                <w:sz w:val="16"/>
+                <w:szCs w:val="16"/>
+              </w:rPr>
+            </w:pPr>
+            <w:r>
+              <w:rPr>
+                <w:rFonts w:ascii="Times New Roman" w:cs="Times New Roman" w:eastAsia="Times New Roman" w:hAnsi="Times New Roman"/>
+                <w:sz w:val="16"/>
+                <w:szCs w:val="16"/>
+                <w:rtl w:val="0"/>
+              </w:rPr>
+              <w:t xml:space="preserve">7.8s</w:t>
+            </w:r>
+          </w:p>
+        </w:tc>
+      </w:tr>
+      <w:tr>
+        <w:tc>
+          <w:tcPr>
+            <w:shd w:fill="auto" w:val="clear"/>
+            <w:tcMar>
+              <w:top w:w="100.0" w:type="dxa"/>
+              <w:left w:w="100.0" w:type="dxa"/>
+              <w:bottom w:w="100.0" w:type="dxa"/>
+              <w:right w:w="100.0" w:type="dxa"/>
+            </w:tcMar>
+            <w:vAlign w:val="top"/>
+          </w:tcPr>
+          <w:p>
+            <w:pPr>
+              <w:jc w:val="left"/>
+              <w:rPr>
+                <w:rFonts w:ascii="Times New Roman" w:cs="Times New Roman" w:eastAsia="Times New Roman" w:hAnsi="Times New Roman"/>
+                <w:sz w:val="16"/>
+                <w:szCs w:val="16"/>
+              </w:rPr>
+            </w:pPr>
+            <w:r>
+              <w:rPr>
+                <w:rFonts w:ascii="Times New Roman" w:cs="Times New Roman" w:eastAsia="Times New Roman" w:hAnsi="Times New Roman"/>
+                <w:sz w:val="16"/>
+                <w:szCs w:val="16"/>
+                <w:rtl w:val="0"/>
+              </w:rPr>
+              <w:t xml:space="preserve"/>
+            </w:r>
+          </w:p>
+        </w:tc>
+        <w:tc>
+          <w:tcPr>
+            <w:shd w:fill="auto" w:val="clear"/>
+            <w:tcMar>
+              <w:top w:w="100.0" w:type="dxa"/>
+              <w:left w:w="100.0" w:type="dxa"/>
+              <w:bottom w:w="100.0" w:type="dxa"/>
+              <w:right w:w="100.0" w:type="dxa"/>
+            </w:tcMar>
+            <w:vAlign w:val="top"/>
+          </w:tcPr>
+          <w:p>
+            <w:pPr>
+              <w:jc w:val="left"/>
+              <w:rPr>
+                <w:rFonts w:ascii="Times New Roman" w:cs="Times New Roman" w:eastAsia="Times New Roman" w:hAnsi="Times New Roman"/>
+                <w:sz w:val="16"/>
+                <w:szCs w:val="16"/>
+              </w:rPr>
+            </w:pPr>
+            <w:r>
+              <w:rPr>
+                <w:rFonts w:ascii="Times New Roman" w:cs="Times New Roman" w:eastAsia="Times New Roman" w:hAnsi="Times New Roman"/>
+                <w:sz w:val="16"/>
+                <w:szCs w:val="16"/>
+                <w:rtl w:val="0"/>
+              </w:rPr>
+              <w:t xml:space="preserve">C</w:t>
+            </w:r>
+          </w:p>
+        </w:tc>
+        <w:tc>
+          <w:tcPr>
+            <w:shd w:fill="auto" w:val="clear"/>
+            <w:tcMar>
+              <w:top w:w="100.0" w:type="dxa"/>
+              <w:left w:w="100.0" w:type="dxa"/>
+              <w:bottom w:w="100.0" w:type="dxa"/>
+              <w:right w:w="100.0" w:type="dxa"/>
+            </w:tcMar>
+            <w:vAlign w:val="top"/>
+          </w:tcPr>
+          <w:p>
+            <w:pPr>
+              <w:jc w:val="left"/>
+              <w:rPr>
+                <w:rFonts w:ascii="Times New Roman" w:cs="Times New Roman" w:eastAsia="Times New Roman" w:hAnsi="Times New Roman"/>
+                <w:sz w:val="16"/>
+                <w:szCs w:val="16"/>
+              </w:rPr>
+            </w:pPr>
+            <w:r>
+              <w:rPr>
+                <w:rFonts w:ascii="Times New Roman" w:cs="Times New Roman" w:eastAsia="Times New Roman" w:hAnsi="Times New Roman"/>
+                <w:sz w:val="16"/>
+                <w:szCs w:val="16"/>
+                <w:rtl w:val="0"/>
+              </w:rPr>
+              <w:t xml:space="preserve">147</w:t>
+            </w:r>
+          </w:p>
+        </w:tc>
+        <w:tc>
+          <w:tcPr>
+            <w:shd w:fill="auto" w:val="clear"/>
+            <w:tcMar>
+              <w:top w:w="100.0" w:type="dxa"/>
+              <w:left w:w="100.0" w:type="dxa"/>
+              <w:bottom w:w="100.0" w:type="dxa"/>
+              <w:right w:w="100.0" w:type="dxa"/>
+            </w:tcMar>
+            <w:vAlign w:val="top"/>
+          </w:tcPr>
+          <w:p>
+            <w:pPr>
+              <w:jc w:val="left"/>
+              <w:rPr>
+                <w:rFonts w:ascii="Times New Roman" w:cs="Times New Roman" w:eastAsia="Times New Roman" w:hAnsi="Times New Roman"/>
+                <w:sz w:val="16"/>
+                <w:szCs w:val="16"/>
+              </w:rPr>
+            </w:pPr>
+            <w:r>
+              <w:rPr>
+                <w:rFonts w:ascii="Times New Roman" w:cs="Times New Roman" w:eastAsia="Times New Roman" w:hAnsi="Times New Roman"/>
+                <w:sz w:val="16"/>
+                <w:szCs w:val="16"/>
+                <w:rtl w:val="0"/>
+              </w:rPr>
+              <w:t xml:space="preserve">$0.11</w:t>
+            </w:r>
+          </w:p>
+        </w:tc>
+        <w:tc>
+          <w:tcPr>
+            <w:shd w:fill="auto" w:val="clear"/>
+            <w:tcMar>
+              <w:top w:w="100.0" w:type="dxa"/>
+              <w:left w:w="100.0" w:type="dxa"/>
+              <w:bottom w:w="100.0" w:type="dxa"/>
+              <w:right w:w="100.0" w:type="dxa"/>
+            </w:tcMar>
+            <w:vAlign w:val="top"/>
+          </w:tcPr>
+          <w:p>
+            <w:pPr>
+              <w:jc w:val="left"/>
+              <w:rPr>
+                <w:rFonts w:ascii="Times New Roman" w:cs="Times New Roman" w:eastAsia="Times New Roman" w:hAnsi="Times New Roman"/>
+                <w:sz w:val="16"/>
+                <w:szCs w:val="16"/>
+              </w:rPr>
+            </w:pPr>
+            <w:r>
+              <w:rPr>
+                <w:rFonts w:ascii="Times New Roman" w:cs="Times New Roman" w:eastAsia="Times New Roman" w:hAnsi="Times New Roman"/>
+                <w:sz w:val="16"/>
+                <w:szCs w:val="16"/>
+                <w:rtl w:val="0"/>
+              </w:rPr>
+              <w:t xml:space="preserve">$0.00077</w:t>
+            </w:r>
+          </w:p>
+        </w:tc>
+        <w:tc>
+          <w:tcPr>
+            <w:shd w:fill="auto" w:val="clear"/>
+            <w:tcMar>
+              <w:top w:w="100.0" w:type="dxa"/>
+              <w:left w:w="100.0" w:type="dxa"/>
+              <w:bottom w:w="100.0" w:type="dxa"/>
+              <w:right w:w="100.0" w:type="dxa"/>
+            </w:tcMar>
+            <w:vAlign w:val="top"/>
+          </w:tcPr>
+          <w:p>
+            <w:pPr>
+              <w:jc w:val="left"/>
+              <w:rPr>
+                <w:rFonts w:ascii="Times New Roman" w:cs="Times New Roman" w:eastAsia="Times New Roman" w:hAnsi="Times New Roman"/>
+                <w:sz w:val="16"/>
+                <w:szCs w:val="16"/>
+              </w:rPr>
+            </w:pPr>
+            <w:r>
+              <w:rPr>
+                <w:rFonts w:ascii="Times New Roman" w:cs="Times New Roman" w:eastAsia="Times New Roman" w:hAnsi="Times New Roman"/>
+                <w:sz w:val="16"/>
+                <w:szCs w:val="16"/>
+                <w:rtl w:val="0"/>
+              </w:rPr>
+              <w:t xml:space="preserve">1.4s</w:t>
+            </w:r>
+          </w:p>
+        </w:tc>
+        <w:tc>
+          <w:tcPr>
+            <w:shd w:fill="auto" w:val="clear"/>
+            <w:tcMar>
+              <w:top w:w="100.0" w:type="dxa"/>
+              <w:left w:w="100.0" w:type="dxa"/>
+              <w:bottom w:w="100.0" w:type="dxa"/>
+              <w:right w:w="100.0" w:type="dxa"/>
+            </w:tcMar>
+            <w:vAlign w:val="top"/>
+          </w:tcPr>
+          <w:p>
+            <w:pPr>
+              <w:jc w:val="left"/>
+              <w:rPr>
+                <w:rFonts w:ascii="Times New Roman" w:cs="Times New Roman" w:eastAsia="Times New Roman" w:hAnsi="Times New Roman"/>
+                <w:sz w:val="16"/>
+                <w:szCs w:val="16"/>
+              </w:rPr>
+            </w:pPr>
+            <w:r>
+              <w:rPr>
+                <w:rFonts w:ascii="Times New Roman" w:cs="Times New Roman" w:eastAsia="Times New Roman" w:hAnsi="Times New Roman"/>
+                <w:sz w:val="16"/>
+                <w:szCs w:val="16"/>
+                <w:rtl w:val="0"/>
+              </w:rPr>
+              <w:t xml:space="preserve">2.1s</w:t>
+            </w:r>
+          </w:p>
+        </w:tc>
+      </w:tr>
+      <w:tr>
+        <w:tc>
+          <w:tcPr>
+            <w:shd w:fill="auto" w:val="clear"/>
+            <w:tcMar>
+              <w:top w:w="100.0" w:type="dxa"/>
+              <w:left w:w="100.0" w:type="dxa"/>
+              <w:bottom w:w="100.0" w:type="dxa"/>
+              <w:right w:w="100.0" w:type="dxa"/>
+            </w:tcMar>
+            <w:vAlign w:val="top"/>
+          </w:tcPr>
+          <w:p>
+            <w:pPr>
+              <w:jc w:val="left"/>
+              <w:rPr>
+                <w:rFonts w:ascii="Times New Roman" w:cs="Times New Roman" w:eastAsia="Times New Roman" w:hAnsi="Times New Roman"/>
+                <w:sz w:val="16"/>
+                <w:szCs w:val="16"/>
+              </w:rPr>
+            </w:pPr>
+            <w:r>
+              <w:rPr>
+                <w:rFonts w:ascii="Times New Roman" w:cs="Times New Roman" w:eastAsia="Times New Roman" w:hAnsi="Times New Roman"/>
+                <w:sz w:val="16"/>
+                <w:szCs w:val="16"/>
+                <w:rtl w:val="0"/>
+              </w:rPr>
+              <w:t xml:space="preserve"/>
+            </w:r>
+          </w:p>
+        </w:tc>
+        <w:tc>
+          <w:tcPr>
+            <w:shd w:fill="auto" w:val="clear"/>
+            <w:tcMar>
+              <w:top w:w="100.0" w:type="dxa"/>
+              <w:left w:w="100.0" w:type="dxa"/>
+              <w:bottom w:w="100.0" w:type="dxa"/>
+              <w:right w:w="100.0" w:type="dxa"/>
+            </w:tcMar>
+            <w:vAlign w:val="top"/>
+          </w:tcPr>
+          <w:p>
+            <w:pPr>
+              <w:jc w:val="left"/>
+              <w:rPr>
+                <w:rFonts w:ascii="Times New Roman" w:cs="Times New Roman" w:eastAsia="Times New Roman" w:hAnsi="Times New Roman"/>
+                <w:sz w:val="16"/>
+                <w:szCs w:val="16"/>
+              </w:rPr>
+            </w:pPr>
+            <w:r>
+              <w:rPr>
+                <w:rFonts w:ascii="Times New Roman" w:cs="Times New Roman" w:eastAsia="Times New Roman" w:hAnsi="Times New Roman"/>
+                <w:sz w:val="16"/>
+                <w:szCs w:val="16"/>
+                <w:rtl w:val="0"/>
+              </w:rPr>
+              <w:t xml:space="preserve">D</w:t>
+            </w:r>
+          </w:p>
+        </w:tc>
+        <w:tc>
+          <w:tcPr>
+            <w:shd w:fill="auto" w:val="clear"/>
+            <w:tcMar>
+              <w:top w:w="100.0" w:type="dxa"/>
+              <w:left w:w="100.0" w:type="dxa"/>
+              <w:bottom w:w="100.0" w:type="dxa"/>
+              <w:right w:w="100.0" w:type="dxa"/>
+            </w:tcMar>
+            <w:vAlign w:val="top"/>
+          </w:tcPr>
+          <w:p>
+            <w:pPr>
+              <w:jc w:val="left"/>
+              <w:rPr>
+                <w:rFonts w:ascii="Times New Roman" w:cs="Times New Roman" w:eastAsia="Times New Roman" w:hAnsi="Times New Roman"/>
+                <w:sz w:val="16"/>
+                <w:szCs w:val="16"/>
+              </w:rPr>
+            </w:pPr>
+            <w:r>
+              <w:rPr>
+                <w:rFonts w:ascii="Times New Roman" w:cs="Times New Roman" w:eastAsia="Times New Roman" w:hAnsi="Times New Roman"/>
+                <w:sz w:val="16"/>
+                <w:szCs w:val="16"/>
+                <w:rtl w:val="0"/>
+              </w:rPr>
+              <w:t xml:space="preserve">147</w:t>
+            </w:r>
+          </w:p>
+        </w:tc>
+        <w:tc>
+          <w:tcPr>
+            <w:shd w:fill="auto" w:val="clear"/>
+            <w:tcMar>
+              <w:top w:w="100.0" w:type="dxa"/>
+              <w:left w:w="100.0" w:type="dxa"/>
+              <w:bottom w:w="100.0" w:type="dxa"/>
+              <w:right w:w="100.0" w:type="dxa"/>
+            </w:tcMar>
+            <w:vAlign w:val="top"/>
+          </w:tcPr>
+          <w:p>
+            <w:pPr>
+              <w:jc w:val="left"/>
+              <w:rPr>
+                <w:rFonts w:ascii="Times New Roman" w:cs="Times New Roman" w:eastAsia="Times New Roman" w:hAnsi="Times New Roman"/>
+                <w:sz w:val="16"/>
+                <w:szCs w:val="16"/>
+              </w:rPr>
+            </w:pPr>
+            <w:r>
+              <w:rPr>
+                <w:rFonts w:ascii="Times New Roman" w:cs="Times New Roman" w:eastAsia="Times New Roman" w:hAnsi="Times New Roman"/>
+                <w:sz w:val="16"/>
+                <w:szCs w:val="16"/>
+                <w:rtl w:val="0"/>
+              </w:rPr>
+              <w:t xml:space="preserve">$0.11</w:t>
+            </w:r>
+          </w:p>
+        </w:tc>
+        <w:tc>
+          <w:tcPr>
+            <w:shd w:fill="auto" w:val="clear"/>
+            <w:tcMar>
+              <w:top w:w="100.0" w:type="dxa"/>
+              <w:left w:w="100.0" w:type="dxa"/>
+              <w:bottom w:w="100.0" w:type="dxa"/>
+              <w:right w:w="100.0" w:type="dxa"/>
+            </w:tcMar>
+            <w:vAlign w:val="top"/>
+          </w:tcPr>
+          <w:p>
+            <w:pPr>
+              <w:jc w:val="left"/>
+              <w:rPr>
+                <w:rFonts w:ascii="Times New Roman" w:cs="Times New Roman" w:eastAsia="Times New Roman" w:hAnsi="Times New Roman"/>
+                <w:sz w:val="16"/>
+                <w:szCs w:val="16"/>
+              </w:rPr>
+            </w:pPr>
+            <w:r>
+              <w:rPr>
+                <w:rFonts w:ascii="Times New Roman" w:cs="Times New Roman" w:eastAsia="Times New Roman" w:hAnsi="Times New Roman"/>
+                <w:sz w:val="16"/>
+                <w:szCs w:val="16"/>
+                <w:rtl w:val="0"/>
+              </w:rPr>
+              <w:t xml:space="preserve">$0.00077</w:t>
+            </w:r>
+          </w:p>
+        </w:tc>
+        <w:tc>
+          <w:tcPr>
+            <w:shd w:fill="auto" w:val="clear"/>
+            <w:tcMar>
+              <w:top w:w="100.0" w:type="dxa"/>
+              <w:left w:w="100.0" w:type="dxa"/>
+              <w:bottom w:w="100.0" w:type="dxa"/>
+              <w:right w:w="100.0" w:type="dxa"/>
+            </w:tcMar>
+            <w:vAlign w:val="top"/>
+          </w:tcPr>
+          <w:p>
+            <w:pPr>
+              <w:jc w:val="left"/>
+              <w:rPr>
+                <w:rFonts w:ascii="Times New Roman" w:cs="Times New Roman" w:eastAsia="Times New Roman" w:hAnsi="Times New Roman"/>
+                <w:sz w:val="16"/>
+                <w:szCs w:val="16"/>
+              </w:rPr>
+            </w:pPr>
+            <w:r>
+              <w:rPr>
+                <w:rFonts w:ascii="Times New Roman" w:cs="Times New Roman" w:eastAsia="Times New Roman" w:hAnsi="Times New Roman"/>
+                <w:sz w:val="16"/>
+                <w:szCs w:val="16"/>
+                <w:rtl w:val="0"/>
+              </w:rPr>
+              <w:t xml:space="preserve">1.4s</w:t>
+            </w:r>
+          </w:p>
+        </w:tc>
+        <w:tc>
+          <w:tcPr>
+            <w:shd w:fill="auto" w:val="clear"/>
+            <w:tcMar>
+              <w:top w:w="100.0" w:type="dxa"/>
+              <w:left w:w="100.0" w:type="dxa"/>
+              <w:bottom w:w="100.0" w:type="dxa"/>
+              <w:right w:w="100.0" w:type="dxa"/>
+            </w:tcMar>
+            <w:vAlign w:val="top"/>
+          </w:tcPr>
+          <w:p>
+            <w:pPr>
+              <w:jc w:val="left"/>
+              <w:rPr>
+                <w:rFonts w:ascii="Times New Roman" w:cs="Times New Roman" w:eastAsia="Times New Roman" w:hAnsi="Times New Roman"/>
+                <w:sz w:val="16"/>
+                <w:szCs w:val="16"/>
+              </w:rPr>
+            </w:pPr>
+            <w:r>
+              <w:rPr>
+                <w:rFonts w:ascii="Times New Roman" w:cs="Times New Roman" w:eastAsia="Times New Roman" w:hAnsi="Times New Roman"/>
+                <w:sz w:val="16"/>
+                <w:szCs w:val="16"/>
+                <w:rtl w:val="0"/>
+              </w:rPr>
+              <w:t xml:space="preserve">2.5s</w:t>
+            </w:r>
+          </w:p>
+        </w:tc>
+      </w:tr>
+      <w:tr>
+        <w:tc>
+          <w:tcPr>
+            <w:shd w:fill="auto" w:val="clear"/>
+            <w:tcMar>
+              <w:top w:w="100.0" w:type="dxa"/>
+              <w:left w:w="100.0" w:type="dxa"/>
+              <w:bottom w:w="100.0" w:type="dxa"/>
+              <w:right w:w="100.0" w:type="dxa"/>
+            </w:tcMar>
+            <w:vAlign w:val="top"/>
+          </w:tcPr>
+          <w:p>
+            <w:pPr>
+              <w:jc w:val="left"/>
+              <w:rPr>
+                <w:rFonts w:ascii="Times New Roman" w:cs="Times New Roman" w:eastAsia="Times New Roman" w:hAnsi="Times New Roman"/>
+                <w:sz w:val="16"/>
+                <w:szCs w:val="16"/>
+              </w:rPr>
+            </w:pPr>
+            <w:r>
+              <w:rPr>
+                <w:rFonts w:ascii="Times New Roman" w:cs="Times New Roman" w:eastAsia="Times New Roman" w:hAnsi="Times New Roman"/>
+                <w:sz w:val="16"/>
+                <w:szCs w:val="16"/>
+                <w:rtl w:val="0"/>
+              </w:rPr>
+              <w:t xml:space="preserve">GPT-4.1 Mini</w:t>
+            </w:r>
+          </w:p>
+        </w:tc>
+        <w:tc>
+          <w:tcPr>
+            <w:shd w:fill="auto" w:val="clear"/>
+            <w:tcMar>
+              <w:top w:w="100.0" w:type="dxa"/>
+              <w:left w:w="100.0" w:type="dxa"/>
+              <w:bottom w:w="100.0" w:type="dxa"/>
+              <w:right w:w="100.0" w:type="dxa"/>
+            </w:tcMar>
+            <w:vAlign w:val="top"/>
+          </w:tcPr>
+          <w:p>
+            <w:pPr>
+              <w:jc w:val="left"/>
+              <w:rPr>
+                <w:rFonts w:ascii="Times New Roman" w:cs="Times New Roman" w:eastAsia="Times New Roman" w:hAnsi="Times New Roman"/>
+                <w:sz w:val="16"/>
+                <w:szCs w:val="16"/>
+              </w:rPr>
+            </w:pPr>
+            <w:r>
+              <w:rPr>
+                <w:rFonts w:ascii="Times New Roman" w:cs="Times New Roman" w:eastAsia="Times New Roman" w:hAnsi="Times New Roman"/>
+                <w:sz w:val="16"/>
+                <w:szCs w:val="16"/>
+                <w:rtl w:val="0"/>
+              </w:rPr>
+              <w:t xml:space="preserve">A</w:t>
+            </w:r>
+          </w:p>
+        </w:tc>
+        <w:tc>
+          <w:tcPr>
+            <w:shd w:fill="auto" w:val="clear"/>
+            <w:tcMar>
+              <w:top w:w="100.0" w:type="dxa"/>
+              <w:left w:w="100.0" w:type="dxa"/>
+              <w:bottom w:w="100.0" w:type="dxa"/>
+              <w:right w:w="100.0" w:type="dxa"/>
+            </w:tcMar>
+            <w:vAlign w:val="top"/>
+          </w:tcPr>
+          <w:p>
+            <w:pPr>
+              <w:jc w:val="left"/>
+              <w:rPr>
+                <w:rFonts w:ascii="Times New Roman" w:cs="Times New Roman" w:eastAsia="Times New Roman" w:hAnsi="Times New Roman"/>
+                <w:sz w:val="16"/>
+                <w:szCs w:val="16"/>
+              </w:rPr>
+            </w:pPr>
+            <w:r>
+              <w:rPr>
+                <w:rFonts w:ascii="Times New Roman" w:cs="Times New Roman" w:eastAsia="Times New Roman" w:hAnsi="Times New Roman"/>
+                <w:sz w:val="16"/>
+                <w:szCs w:val="16"/>
+                <w:rtl w:val="0"/>
+              </w:rPr>
+              <w:t xml:space="preserve">909</w:t>
+            </w:r>
+          </w:p>
+        </w:tc>
+        <w:tc>
+          <w:tcPr>
+            <w:shd w:fill="auto" w:val="clear"/>
+            <w:tcMar>
+              <w:top w:w="100.0" w:type="dxa"/>
+              <w:left w:w="100.0" w:type="dxa"/>
+              <w:bottom w:w="100.0" w:type="dxa"/>
+              <w:right w:w="100.0" w:type="dxa"/>
+            </w:tcMar>
+            <w:vAlign w:val="top"/>
+          </w:tcPr>
+          <w:p>
+            <w:pPr>
+              <w:jc w:val="left"/>
+              <w:rPr>
+                <w:rFonts w:ascii="Times New Roman" w:cs="Times New Roman" w:eastAsia="Times New Roman" w:hAnsi="Times New Roman"/>
+                <w:sz w:val="16"/>
+                <w:szCs w:val="16"/>
+              </w:rPr>
+            </w:pPr>
+            <w:r>
+              <w:rPr>
+                <w:rFonts w:ascii="Times New Roman" w:cs="Times New Roman" w:eastAsia="Times New Roman" w:hAnsi="Times New Roman"/>
+                <w:sz w:val="16"/>
+                <w:szCs w:val="16"/>
+                <w:rtl w:val="0"/>
+              </w:rPr>
+              <w:t xml:space="preserve">$0.74</w:t>
+            </w:r>
+          </w:p>
+        </w:tc>
+        <w:tc>
+          <w:tcPr>
+            <w:shd w:fill="auto" w:val="clear"/>
+            <w:tcMar>
+              <w:top w:w="100.0" w:type="dxa"/>
+              <w:left w:w="100.0" w:type="dxa"/>
+              <w:bottom w:w="100.0" w:type="dxa"/>
+              <w:right w:w="100.0" w:type="dxa"/>
+            </w:tcMar>
+            <w:vAlign w:val="top"/>
+          </w:tcPr>
+          <w:p>
+            <w:pPr>
+              <w:jc w:val="left"/>
+              <w:rPr>
+                <w:rFonts w:ascii="Times New Roman" w:cs="Times New Roman" w:eastAsia="Times New Roman" w:hAnsi="Times New Roman"/>
+                <w:sz w:val="16"/>
+                <w:szCs w:val="16"/>
+              </w:rPr>
+            </w:pPr>
+            <w:r>
+              <w:rPr>
+                <w:rFonts w:ascii="Times New Roman" w:cs="Times New Roman" w:eastAsia="Times New Roman" w:hAnsi="Times New Roman"/>
+                <w:sz w:val="16"/>
+                <w:szCs w:val="16"/>
+                <w:rtl w:val="0"/>
+              </w:rPr>
+              <w:t xml:space="preserve">$0.00082</w:t>
+            </w:r>
+          </w:p>
+        </w:tc>
+        <w:tc>
+          <w:tcPr>
+            <w:shd w:fill="auto" w:val="clear"/>
+            <w:tcMar>
+              <w:top w:w="100.0" w:type="dxa"/>
+              <w:left w:w="100.0" w:type="dxa"/>
+              <w:bottom w:w="100.0" w:type="dxa"/>
+              <w:right w:w="100.0" w:type="dxa"/>
+            </w:tcMar>
+            <w:vAlign w:val="top"/>
+          </w:tcPr>
+          <w:p>
+            <w:pPr>
+              <w:jc w:val="left"/>
+              <w:rPr>
+                <w:rFonts w:ascii="Times New Roman" w:cs="Times New Roman" w:eastAsia="Times New Roman" w:hAnsi="Times New Roman"/>
+                <w:sz w:val="16"/>
+                <w:szCs w:val="16"/>
+              </w:rPr>
+            </w:pPr>
+            <w:r>
+              <w:rPr>
+                <w:rFonts w:ascii="Times New Roman" w:cs="Times New Roman" w:eastAsia="Times New Roman" w:hAnsi="Times New Roman"/>
+                <w:sz w:val="16"/>
+                <w:szCs w:val="16"/>
+                <w:rtl w:val="0"/>
+              </w:rPr>
+              <w:t xml:space="preserve">3.0s</w:t>
+            </w:r>
+          </w:p>
+        </w:tc>
+        <w:tc>
+          <w:tcPr>
+            <w:shd w:fill="auto" w:val="clear"/>
+            <w:tcMar>
+              <w:top w:w="100.0" w:type="dxa"/>
+              <w:left w:w="100.0" w:type="dxa"/>
+              <w:bottom w:w="100.0" w:type="dxa"/>
+              <w:right w:w="100.0" w:type="dxa"/>
+            </w:tcMar>
+            <w:vAlign w:val="top"/>
+          </w:tcPr>
+          <w:p>
+            <w:pPr>
+              <w:jc w:val="left"/>
+              <w:rPr>
+                <w:rFonts w:ascii="Times New Roman" w:cs="Times New Roman" w:eastAsia="Times New Roman" w:hAnsi="Times New Roman"/>
+                <w:sz w:val="16"/>
+                <w:szCs w:val="16"/>
+              </w:rPr>
+            </w:pPr>
+            <w:r>
+              <w:rPr>
+                <w:rFonts w:ascii="Times New Roman" w:cs="Times New Roman" w:eastAsia="Times New Roman" w:hAnsi="Times New Roman"/>
+                <w:sz w:val="16"/>
+                <w:szCs w:val="16"/>
+                <w:rtl w:val="0"/>
+              </w:rPr>
+              <w:t xml:space="preserve">4.0s</w:t>
+            </w:r>
+          </w:p>
+        </w:tc>
+      </w:tr>
+      <w:tr>
+        <w:tc>
+          <w:tcPr>
+            <w:shd w:fill="auto" w:val="clear"/>
+            <w:tcMar>
+              <w:top w:w="100.0" w:type="dxa"/>
+              <w:left w:w="100.0" w:type="dxa"/>
+              <w:bottom w:w="100.0" w:type="dxa"/>
+              <w:right w:w="100.0" w:type="dxa"/>
+            </w:tcMar>
+            <w:vAlign w:val="top"/>
+          </w:tcPr>
+          <w:p>
+            <w:pPr>
+              <w:jc w:val="left"/>
+              <w:rPr>
+                <w:rFonts w:ascii="Times New Roman" w:cs="Times New Roman" w:eastAsia="Times New Roman" w:hAnsi="Times New Roman"/>
+                <w:sz w:val="16"/>
+                <w:szCs w:val="16"/>
+              </w:rPr>
+            </w:pPr>
+            <w:r>
+              <w:rPr>
+                <w:rFonts w:ascii="Times New Roman" w:cs="Times New Roman" w:eastAsia="Times New Roman" w:hAnsi="Times New Roman"/>
+                <w:sz w:val="16"/>
+                <w:szCs w:val="16"/>
+                <w:rtl w:val="0"/>
+              </w:rPr>
+              <w:t xml:space="preserve"/>
+            </w:r>
+          </w:p>
+        </w:tc>
+        <w:tc>
+          <w:tcPr>
+            <w:shd w:fill="auto" w:val="clear"/>
+            <w:tcMar>
+              <w:top w:w="100.0" w:type="dxa"/>
+              <w:left w:w="100.0" w:type="dxa"/>
+              <w:bottom w:w="100.0" w:type="dxa"/>
+              <w:right w:w="100.0" w:type="dxa"/>
+            </w:tcMar>
+            <w:vAlign w:val="top"/>
+          </w:tcPr>
+          <w:p>
+            <w:pPr>
+              <w:jc w:val="left"/>
+              <w:rPr>
+                <w:rFonts w:ascii="Times New Roman" w:cs="Times New Roman" w:eastAsia="Times New Roman" w:hAnsi="Times New Roman"/>
+                <w:sz w:val="16"/>
+                <w:szCs w:val="16"/>
+              </w:rPr>
+            </w:pPr>
+            <w:r>
+              <w:rPr>
+                <w:rFonts w:ascii="Times New Roman" w:cs="Times New Roman" w:eastAsia="Times New Roman" w:hAnsi="Times New Roman"/>
+                <w:sz w:val="16"/>
+                <w:szCs w:val="16"/>
+                <w:rtl w:val="0"/>
+              </w:rPr>
+              <w:t xml:space="preserve">B</w:t>
+            </w:r>
+          </w:p>
+        </w:tc>
+        <w:tc>
+          <w:tcPr>
+            <w:shd w:fill="auto" w:val="clear"/>
+            <w:tcMar>
+              <w:top w:w="100.0" w:type="dxa"/>
+              <w:left w:w="100.0" w:type="dxa"/>
+              <w:bottom w:w="100.0" w:type="dxa"/>
+              <w:right w:w="100.0" w:type="dxa"/>
+            </w:tcMar>
+            <w:vAlign w:val="top"/>
+          </w:tcPr>
+          <w:p>
+            <w:pPr>
+              <w:jc w:val="left"/>
+              <w:rPr>
+                <w:rFonts w:ascii="Times New Roman" w:cs="Times New Roman" w:eastAsia="Times New Roman" w:hAnsi="Times New Roman"/>
+                <w:sz w:val="16"/>
+                <w:szCs w:val="16"/>
+              </w:rPr>
+            </w:pPr>
+            <w:r>
+              <w:rPr>
+                <w:rFonts w:ascii="Times New Roman" w:cs="Times New Roman" w:eastAsia="Times New Roman" w:hAnsi="Times New Roman"/>
+                <w:sz w:val="16"/>
+                <w:szCs w:val="16"/>
+                <w:rtl w:val="0"/>
+              </w:rPr>
+              <w:t xml:space="preserve">909</w:t>
+            </w:r>
+          </w:p>
+        </w:tc>
+        <w:tc>
+          <w:tcPr>
+            <w:shd w:fill="auto" w:val="clear"/>
+            <w:tcMar>
+              <w:top w:w="100.0" w:type="dxa"/>
+              <w:left w:w="100.0" w:type="dxa"/>
+              <w:bottom w:w="100.0" w:type="dxa"/>
+              <w:right w:w="100.0" w:type="dxa"/>
+            </w:tcMar>
+            <w:vAlign w:val="top"/>
+          </w:tcPr>
+          <w:p>
+            <w:pPr>
+              <w:jc w:val="left"/>
+              <w:rPr>
+                <w:rFonts w:ascii="Times New Roman" w:cs="Times New Roman" w:eastAsia="Times New Roman" w:hAnsi="Times New Roman"/>
+                <w:sz w:val="16"/>
+                <w:szCs w:val="16"/>
+              </w:rPr>
+            </w:pPr>
+            <w:r>
+              <w:rPr>
+                <w:rFonts w:ascii="Times New Roman" w:cs="Times New Roman" w:eastAsia="Times New Roman" w:hAnsi="Times New Roman"/>
+                <w:sz w:val="16"/>
+                <w:szCs w:val="16"/>
+                <w:rtl w:val="0"/>
+              </w:rPr>
+              <w:t xml:space="preserve">$0.78</w:t>
+            </w:r>
+          </w:p>
+        </w:tc>
+        <w:tc>
+          <w:tcPr>
+            <w:shd w:fill="auto" w:val="clear"/>
+            <w:tcMar>
+              <w:top w:w="100.0" w:type="dxa"/>
+              <w:left w:w="100.0" w:type="dxa"/>
+              <w:bottom w:w="100.0" w:type="dxa"/>
+              <w:right w:w="100.0" w:type="dxa"/>
+            </w:tcMar>
+            <w:vAlign w:val="top"/>
+          </w:tcPr>
+          <w:p>
+            <w:pPr>
+              <w:jc w:val="left"/>
+              <w:rPr>
+                <w:rFonts w:ascii="Times New Roman" w:cs="Times New Roman" w:eastAsia="Times New Roman" w:hAnsi="Times New Roman"/>
+                <w:sz w:val="16"/>
+                <w:szCs w:val="16"/>
+              </w:rPr>
+            </w:pPr>
+            <w:r>
+              <w:rPr>
+                <w:rFonts w:ascii="Times New Roman" w:cs="Times New Roman" w:eastAsia="Times New Roman" w:hAnsi="Times New Roman"/>
+                <w:sz w:val="16"/>
+                <w:szCs w:val="16"/>
+                <w:rtl w:val="0"/>
+              </w:rPr>
+              <w:t xml:space="preserve">$0.00086</w:t>
+            </w:r>
+          </w:p>
+        </w:tc>
+        <w:tc>
+          <w:tcPr>
+            <w:shd w:fill="auto" w:val="clear"/>
+            <w:tcMar>
+              <w:top w:w="100.0" w:type="dxa"/>
+              <w:left w:w="100.0" w:type="dxa"/>
+              <w:bottom w:w="100.0" w:type="dxa"/>
+              <w:right w:w="100.0" w:type="dxa"/>
+            </w:tcMar>
+            <w:vAlign w:val="top"/>
+          </w:tcPr>
+          <w:p>
+            <w:pPr>
+              <w:jc w:val="left"/>
+              <w:rPr>
+                <w:rFonts w:ascii="Times New Roman" w:cs="Times New Roman" w:eastAsia="Times New Roman" w:hAnsi="Times New Roman"/>
+                <w:sz w:val="16"/>
+                <w:szCs w:val="16"/>
+              </w:rPr>
+            </w:pPr>
+            <w:r>
+              <w:rPr>
+                <w:rFonts w:ascii="Times New Roman" w:cs="Times New Roman" w:eastAsia="Times New Roman" w:hAnsi="Times New Roman"/>
+                <w:sz w:val="16"/>
+                <w:szCs w:val="16"/>
+                <w:rtl w:val="0"/>
+              </w:rPr>
+              <w:t xml:space="preserve">3.2s</w:t>
+            </w:r>
+          </w:p>
+        </w:tc>
+        <w:tc>
+          <w:tcPr>
+            <w:shd w:fill="auto" w:val="clear"/>
+            <w:tcMar>
+              <w:top w:w="100.0" w:type="dxa"/>
+              <w:left w:w="100.0" w:type="dxa"/>
+              <w:bottom w:w="100.0" w:type="dxa"/>
+              <w:right w:w="100.0" w:type="dxa"/>
+            </w:tcMar>
+            <w:vAlign w:val="top"/>
+          </w:tcPr>
+          <w:p>
+            <w:pPr>
+              <w:jc w:val="left"/>
+              <w:rPr>
+                <w:rFonts w:ascii="Times New Roman" w:cs="Times New Roman" w:eastAsia="Times New Roman" w:hAnsi="Times New Roman"/>
+                <w:sz w:val="16"/>
+                <w:szCs w:val="16"/>
+              </w:rPr>
+            </w:pPr>
+            <w:r>
+              <w:rPr>
+                <w:rFonts w:ascii="Times New Roman" w:cs="Times New Roman" w:eastAsia="Times New Roman" w:hAnsi="Times New Roman"/>
+                <w:sz w:val="16"/>
+                <w:szCs w:val="16"/>
+                <w:rtl w:val="0"/>
+              </w:rPr>
+              <w:t xml:space="preserve">4.2s</w:t>
+            </w:r>
+          </w:p>
+        </w:tc>
+      </w:tr>
+      <w:tr>
+        <w:tc>
+          <w:tcPr>
+            <w:shd w:fill="auto" w:val="clear"/>
+            <w:tcMar>
+              <w:top w:w="100.0" w:type="dxa"/>
+              <w:left w:w="100.0" w:type="dxa"/>
+              <w:bottom w:w="100.0" w:type="dxa"/>
+              <w:right w:w="100.0" w:type="dxa"/>
+            </w:tcMar>
+            <w:vAlign w:val="top"/>
+          </w:tcPr>
+          <w:p>
+            <w:pPr>
+              <w:jc w:val="left"/>
+              <w:rPr>
+                <w:rFonts w:ascii="Times New Roman" w:cs="Times New Roman" w:eastAsia="Times New Roman" w:hAnsi="Times New Roman"/>
+                <w:sz w:val="16"/>
+                <w:szCs w:val="16"/>
+              </w:rPr>
+            </w:pPr>
+            <w:r>
+              <w:rPr>
+                <w:rFonts w:ascii="Times New Roman" w:cs="Times New Roman" w:eastAsia="Times New Roman" w:hAnsi="Times New Roman"/>
+                <w:sz w:val="16"/>
+                <w:szCs w:val="16"/>
+                <w:rtl w:val="0"/>
+              </w:rPr>
+              <w:t xml:space="preserve"/>
+            </w:r>
+          </w:p>
+        </w:tc>
+        <w:tc>
+          <w:tcPr>
+            <w:shd w:fill="auto" w:val="clear"/>
+            <w:tcMar>
+              <w:top w:w="100.0" w:type="dxa"/>
+              <w:left w:w="100.0" w:type="dxa"/>
+              <w:bottom w:w="100.0" w:type="dxa"/>
+              <w:right w:w="100.0" w:type="dxa"/>
+            </w:tcMar>
+            <w:vAlign w:val="top"/>
+          </w:tcPr>
+          <w:p>
+            <w:pPr>
+              <w:jc w:val="left"/>
+              <w:rPr>
+                <w:rFonts w:ascii="Times New Roman" w:cs="Times New Roman" w:eastAsia="Times New Roman" w:hAnsi="Times New Roman"/>
+                <w:sz w:val="16"/>
+                <w:szCs w:val="16"/>
+              </w:rPr>
+            </w:pPr>
+            <w:r>
+              <w:rPr>
+                <w:rFonts w:ascii="Times New Roman" w:cs="Times New Roman" w:eastAsia="Times New Roman" w:hAnsi="Times New Roman"/>
+                <w:sz w:val="16"/>
+                <w:szCs w:val="16"/>
+                <w:rtl w:val="0"/>
+              </w:rPr>
+              <w:t xml:space="preserve">C</w:t>
+            </w:r>
+          </w:p>
+        </w:tc>
+        <w:tc>
+          <w:tcPr>
+            <w:shd w:fill="auto" w:val="clear"/>
+            <w:tcMar>
+              <w:top w:w="100.0" w:type="dxa"/>
+              <w:left w:w="100.0" w:type="dxa"/>
+              <w:bottom w:w="100.0" w:type="dxa"/>
+              <w:right w:w="100.0" w:type="dxa"/>
+            </w:tcMar>
+            <w:vAlign w:val="top"/>
+          </w:tcPr>
+          <w:p>
+            <w:pPr>
+              <w:jc w:val="left"/>
+              <w:rPr>
+                <w:rFonts w:ascii="Times New Roman" w:cs="Times New Roman" w:eastAsia="Times New Roman" w:hAnsi="Times New Roman"/>
+                <w:sz w:val="16"/>
+                <w:szCs w:val="16"/>
+              </w:rPr>
+            </w:pPr>
+            <w:r>
+              <w:rPr>
+                <w:rFonts w:ascii="Times New Roman" w:cs="Times New Roman" w:eastAsia="Times New Roman" w:hAnsi="Times New Roman"/>
+                <w:sz w:val="16"/>
+                <w:szCs w:val="16"/>
+                <w:rtl w:val="0"/>
+              </w:rPr>
+              <w:t xml:space="preserve">147</w:t>
+            </w:r>
+          </w:p>
+        </w:tc>
+        <w:tc>
+          <w:tcPr>
+            <w:shd w:fill="auto" w:val="clear"/>
+            <w:tcMar>
+              <w:top w:w="100.0" w:type="dxa"/>
+              <w:left w:w="100.0" w:type="dxa"/>
+              <w:bottom w:w="100.0" w:type="dxa"/>
+              <w:right w:w="100.0" w:type="dxa"/>
+            </w:tcMar>
+            <w:vAlign w:val="top"/>
+          </w:tcPr>
+          <w:p>
+            <w:pPr>
+              <w:jc w:val="left"/>
+              <w:rPr>
+                <w:rFonts w:ascii="Times New Roman" w:cs="Times New Roman" w:eastAsia="Times New Roman" w:hAnsi="Times New Roman"/>
+                <w:sz w:val="16"/>
+                <w:szCs w:val="16"/>
+              </w:rPr>
+            </w:pPr>
+            <w:r>
+              <w:rPr>
+                <w:rFonts w:ascii="Times New Roman" w:cs="Times New Roman" w:eastAsia="Times New Roman" w:hAnsi="Times New Roman"/>
+                <w:sz w:val="16"/>
+                <w:szCs w:val="16"/>
+                <w:rtl w:val="0"/>
+              </w:rPr>
+              <w:t xml:space="preserve">$0.31</w:t>
+            </w:r>
+          </w:p>
+        </w:tc>
+        <w:tc>
+          <w:tcPr>
+            <w:shd w:fill="auto" w:val="clear"/>
+            <w:tcMar>
+              <w:top w:w="100.0" w:type="dxa"/>
+              <w:left w:w="100.0" w:type="dxa"/>
+              <w:bottom w:w="100.0" w:type="dxa"/>
+              <w:right w:w="100.0" w:type="dxa"/>
+            </w:tcMar>
+            <w:vAlign w:val="top"/>
+          </w:tcPr>
+          <w:p>
+            <w:pPr>
+              <w:jc w:val="left"/>
+              <w:rPr>
+                <w:rFonts w:ascii="Times New Roman" w:cs="Times New Roman" w:eastAsia="Times New Roman" w:hAnsi="Times New Roman"/>
+                <w:sz w:val="16"/>
+                <w:szCs w:val="16"/>
+              </w:rPr>
+            </w:pPr>
+            <w:r>
+              <w:rPr>
+                <w:rFonts w:ascii="Times New Roman" w:cs="Times New Roman" w:eastAsia="Times New Roman" w:hAnsi="Times New Roman"/>
+                <w:sz w:val="16"/>
+                <w:szCs w:val="16"/>
+                <w:rtl w:val="0"/>
+              </w:rPr>
+              <w:t xml:space="preserve">$0.00212</w:t>
+            </w:r>
+          </w:p>
+        </w:tc>
+        <w:tc>
+          <w:tcPr>
+            <w:shd w:fill="auto" w:val="clear"/>
+            <w:tcMar>
+              <w:top w:w="100.0" w:type="dxa"/>
+              <w:left w:w="100.0" w:type="dxa"/>
+              <w:bottom w:w="100.0" w:type="dxa"/>
+              <w:right w:w="100.0" w:type="dxa"/>
+            </w:tcMar>
+            <w:vAlign w:val="top"/>
+          </w:tcPr>
+          <w:p>
+            <w:pPr>
+              <w:jc w:val="left"/>
+              <w:rPr>
+                <w:rFonts w:ascii="Times New Roman" w:cs="Times New Roman" w:eastAsia="Times New Roman" w:hAnsi="Times New Roman"/>
+                <w:sz w:val="16"/>
+                <w:szCs w:val="16"/>
+              </w:rPr>
+            </w:pPr>
+            <w:r>
+              <w:rPr>
+                <w:rFonts w:ascii="Times New Roman" w:cs="Times New Roman" w:eastAsia="Times New Roman" w:hAnsi="Times New Roman"/>
+                <w:sz w:val="16"/>
+                <w:szCs w:val="16"/>
+                <w:rtl w:val="0"/>
+              </w:rPr>
+              <w:t xml:space="preserve">2.0s</w:t>
+            </w:r>
+          </w:p>
+        </w:tc>
+        <w:tc>
+          <w:tcPr>
+            <w:shd w:fill="auto" w:val="clear"/>
+            <w:tcMar>
+              <w:top w:w="100.0" w:type="dxa"/>
+              <w:left w:w="100.0" w:type="dxa"/>
+              <w:bottom w:w="100.0" w:type="dxa"/>
+              <w:right w:w="100.0" w:type="dxa"/>
+            </w:tcMar>
+            <w:vAlign w:val="top"/>
+          </w:tcPr>
+          <w:p>
+            <w:pPr>
+              <w:jc w:val="left"/>
+              <w:rPr>
+                <w:rFonts w:ascii="Times New Roman" w:cs="Times New Roman" w:eastAsia="Times New Roman" w:hAnsi="Times New Roman"/>
+                <w:sz w:val="16"/>
+                <w:szCs w:val="16"/>
+              </w:rPr>
+            </w:pPr>
+            <w:r>
+              <w:rPr>
+                <w:rFonts w:ascii="Times New Roman" w:cs="Times New Roman" w:eastAsia="Times New Roman" w:hAnsi="Times New Roman"/>
+                <w:sz w:val="16"/>
+                <w:szCs w:val="16"/>
+                <w:rtl w:val="0"/>
+              </w:rPr>
+              <w:t xml:space="preserve">2.6s</w:t>
+            </w:r>
+          </w:p>
+        </w:tc>
+      </w:tr>
+      <w:tr>
+        <w:tc>
+          <w:tcPr>
+            <w:shd w:fill="auto" w:val="clear"/>
+            <w:tcMar>
+              <w:top w:w="100.0" w:type="dxa"/>
+              <w:left w:w="100.0" w:type="dxa"/>
+              <w:bottom w:w="100.0" w:type="dxa"/>
+              <w:right w:w="100.0" w:type="dxa"/>
+            </w:tcMar>
+            <w:vAlign w:val="top"/>
+          </w:tcPr>
+          <w:p>
+            <w:pPr>
+              <w:jc w:val="left"/>
+              <w:rPr>
+                <w:rFonts w:ascii="Times New Roman" w:cs="Times New Roman" w:eastAsia="Times New Roman" w:hAnsi="Times New Roman"/>
+                <w:sz w:val="16"/>
+                <w:szCs w:val="16"/>
+              </w:rPr>
+            </w:pPr>
+            <w:r>
+              <w:rPr>
+                <w:rFonts w:ascii="Times New Roman" w:cs="Times New Roman" w:eastAsia="Times New Roman" w:hAnsi="Times New Roman"/>
+                <w:sz w:val="16"/>
+                <w:szCs w:val="16"/>
+                <w:rtl w:val="0"/>
+              </w:rPr>
+              <w:t xml:space="preserve"/>
+            </w:r>
+          </w:p>
+        </w:tc>
+        <w:tc>
+          <w:tcPr>
+            <w:shd w:fill="auto" w:val="clear"/>
+            <w:tcMar>
+              <w:top w:w="100.0" w:type="dxa"/>
+              <w:left w:w="100.0" w:type="dxa"/>
+              <w:bottom w:w="100.0" w:type="dxa"/>
+              <w:right w:w="100.0" w:type="dxa"/>
+            </w:tcMar>
+            <w:vAlign w:val="top"/>
+          </w:tcPr>
+          <w:p>
+            <w:pPr>
+              <w:jc w:val="left"/>
+              <w:rPr>
+                <w:rFonts w:ascii="Times New Roman" w:cs="Times New Roman" w:eastAsia="Times New Roman" w:hAnsi="Times New Roman"/>
+                <w:sz w:val="16"/>
+                <w:szCs w:val="16"/>
+              </w:rPr>
+            </w:pPr>
+            <w:r>
+              <w:rPr>
+                <w:rFonts w:ascii="Times New Roman" w:cs="Times New Roman" w:eastAsia="Times New Roman" w:hAnsi="Times New Roman"/>
+                <w:sz w:val="16"/>
+                <w:szCs w:val="16"/>
+                <w:rtl w:val="0"/>
+              </w:rPr>
+              <w:t xml:space="preserve">D</w:t>
+            </w:r>
+          </w:p>
+        </w:tc>
+        <w:tc>
+          <w:tcPr>
+            <w:shd w:fill="auto" w:val="clear"/>
+            <w:tcMar>
+              <w:top w:w="100.0" w:type="dxa"/>
+              <w:left w:w="100.0" w:type="dxa"/>
+              <w:bottom w:w="100.0" w:type="dxa"/>
+              <w:right w:w="100.0" w:type="dxa"/>
+            </w:tcMar>
+            <w:vAlign w:val="top"/>
+          </w:tcPr>
+          <w:p>
+            <w:pPr>
+              <w:jc w:val="left"/>
+              <w:rPr>
+                <w:rFonts w:ascii="Times New Roman" w:cs="Times New Roman" w:eastAsia="Times New Roman" w:hAnsi="Times New Roman"/>
+                <w:sz w:val="16"/>
+                <w:szCs w:val="16"/>
+              </w:rPr>
+            </w:pPr>
+            <w:r>
+              <w:rPr>
+                <w:rFonts w:ascii="Times New Roman" w:cs="Times New Roman" w:eastAsia="Times New Roman" w:hAnsi="Times New Roman"/>
+                <w:sz w:val="16"/>
+                <w:szCs w:val="16"/>
+                <w:rtl w:val="0"/>
+              </w:rPr>
+              <w:t xml:space="preserve">147</w:t>
+            </w:r>
+          </w:p>
+        </w:tc>
+        <w:tc>
+          <w:tcPr>
+            <w:shd w:fill="auto" w:val="clear"/>
+            <w:tcMar>
+              <w:top w:w="100.0" w:type="dxa"/>
+              <w:left w:w="100.0" w:type="dxa"/>
+              <w:bottom w:w="100.0" w:type="dxa"/>
+              <w:right w:w="100.0" w:type="dxa"/>
+            </w:tcMar>
+            <w:vAlign w:val="top"/>
+          </w:tcPr>
+          <w:p>
+            <w:pPr>
+              <w:jc w:val="left"/>
+              <w:rPr>
+                <w:rFonts w:ascii="Times New Roman" w:cs="Times New Roman" w:eastAsia="Times New Roman" w:hAnsi="Times New Roman"/>
+                <w:sz w:val="16"/>
+                <w:szCs w:val="16"/>
+              </w:rPr>
+            </w:pPr>
+            <w:r>
+              <w:rPr>
+                <w:rFonts w:ascii="Times New Roman" w:cs="Times New Roman" w:eastAsia="Times New Roman" w:hAnsi="Times New Roman"/>
+                <w:sz w:val="16"/>
+                <w:szCs w:val="16"/>
+                <w:rtl w:val="0"/>
+              </w:rPr>
+              <w:t xml:space="preserve">$0.31</w:t>
+            </w:r>
+          </w:p>
+        </w:tc>
+        <w:tc>
+          <w:tcPr>
+            <w:shd w:fill="auto" w:val="clear"/>
+            <w:tcMar>
+              <w:top w:w="100.0" w:type="dxa"/>
+              <w:left w:w="100.0" w:type="dxa"/>
+              <w:bottom w:w="100.0" w:type="dxa"/>
+              <w:right w:w="100.0" w:type="dxa"/>
+            </w:tcMar>
+            <w:vAlign w:val="top"/>
+          </w:tcPr>
+          <w:p>
+            <w:pPr>
+              <w:jc w:val="left"/>
+              <w:rPr>
+                <w:rFonts w:ascii="Times New Roman" w:cs="Times New Roman" w:eastAsia="Times New Roman" w:hAnsi="Times New Roman"/>
+                <w:sz w:val="16"/>
+                <w:szCs w:val="16"/>
+              </w:rPr>
+            </w:pPr>
+            <w:r>
+              <w:rPr>
+                <w:rFonts w:ascii="Times New Roman" w:cs="Times New Roman" w:eastAsia="Times New Roman" w:hAnsi="Times New Roman"/>
+                <w:sz w:val="16"/>
+                <w:szCs w:val="16"/>
+                <w:rtl w:val="0"/>
+              </w:rPr>
+              <w:t xml:space="preserve">$0.00214</w:t>
+            </w:r>
+          </w:p>
+        </w:tc>
+        <w:tc>
+          <w:tcPr>
+            <w:shd w:fill="auto" w:val="clear"/>
+            <w:tcMar>
+              <w:top w:w="100.0" w:type="dxa"/>
+              <w:left w:w="100.0" w:type="dxa"/>
+              <w:bottom w:w="100.0" w:type="dxa"/>
+              <w:right w:w="100.0" w:type="dxa"/>
+            </w:tcMar>
+            <w:vAlign w:val="top"/>
+          </w:tcPr>
+          <w:p>
+            <w:pPr>
+              <w:jc w:val="left"/>
+              <w:rPr>
+                <w:rFonts w:ascii="Times New Roman" w:cs="Times New Roman" w:eastAsia="Times New Roman" w:hAnsi="Times New Roman"/>
+                <w:sz w:val="16"/>
+                <w:szCs w:val="16"/>
+              </w:rPr>
+            </w:pPr>
+            <w:r>
+              <w:rPr>
+                <w:rFonts w:ascii="Times New Roman" w:cs="Times New Roman" w:eastAsia="Times New Roman" w:hAnsi="Times New Roman"/>
+                <w:sz w:val="16"/>
+                <w:szCs w:val="16"/>
+                <w:rtl w:val="0"/>
+              </w:rPr>
+              <w:t xml:space="preserve">1.9s</w:t>
+            </w:r>
+          </w:p>
+        </w:tc>
+        <w:tc>
+          <w:tcPr>
+            <w:shd w:fill="auto" w:val="clear"/>
+            <w:tcMar>
+              <w:top w:w="100.0" w:type="dxa"/>
+              <w:left w:w="100.0" w:type="dxa"/>
+              <w:bottom w:w="100.0" w:type="dxa"/>
+              <w:right w:w="100.0" w:type="dxa"/>
+            </w:tcMar>
+            <w:vAlign w:val="top"/>
+          </w:tcPr>
+          <w:p>
+            <w:pPr>
+              <w:jc w:val="left"/>
+              <w:rPr>
+                <w:rFonts w:ascii="Times New Roman" w:cs="Times New Roman" w:eastAsia="Times New Roman" w:hAnsi="Times New Roman"/>
+                <w:sz w:val="16"/>
+                <w:szCs w:val="16"/>
+              </w:rPr>
+            </w:pPr>
+            <w:r>
+              <w:rPr>
+                <w:rFonts w:ascii="Times New Roman" w:cs="Times New Roman" w:eastAsia="Times New Roman" w:hAnsi="Times New Roman"/>
+                <w:sz w:val="16"/>
+                <w:szCs w:val="16"/>
+                <w:rtl w:val="0"/>
+              </w:rPr>
+              <w:t xml:space="preserve">2.6s</w:t>
+            </w:r>
+          </w:p>
+        </w:tc>
+      </w:tr>
+      <w:tr>
+        <w:tc>
+          <w:tcPr>
+            <w:shd w:fill="auto" w:val="clear"/>
+            <w:tcMar>
+              <w:top w:w="100.0" w:type="dxa"/>
+              <w:left w:w="100.0" w:type="dxa"/>
+              <w:bottom w:w="100.0" w:type="dxa"/>
+              <w:right w:w="100.0" w:type="dxa"/>
+            </w:tcMar>
+            <w:vAlign w:val="top"/>
+          </w:tcPr>
+          <w:p>
+            <w:pPr>
+              <w:jc w:val="left"/>
+              <w:rPr>
+                <w:rFonts w:ascii="Times New Roman" w:cs="Times New Roman" w:eastAsia="Times New Roman" w:hAnsi="Times New Roman"/>
+                <w:sz w:val="16"/>
+                <w:szCs w:val="16"/>
+              </w:rPr>
+            </w:pPr>
+            <w:r>
+              <w:rPr>
+                <w:rFonts w:ascii="Times New Roman" w:cs="Times New Roman" w:eastAsia="Times New Roman" w:hAnsi="Times New Roman"/>
+                <w:sz w:val="16"/>
+                <w:szCs w:val="16"/>
+                <w:rtl w:val="0"/>
+              </w:rPr>
+              <w:t xml:space="preserve">GPT-4.1</w:t>
+            </w:r>
+          </w:p>
+        </w:tc>
+        <w:tc>
+          <w:tcPr>
+            <w:shd w:fill="auto" w:val="clear"/>
+            <w:tcMar>
+              <w:top w:w="100.0" w:type="dxa"/>
+              <w:left w:w="100.0" w:type="dxa"/>
+              <w:bottom w:w="100.0" w:type="dxa"/>
+              <w:right w:w="100.0" w:type="dxa"/>
+            </w:tcMar>
+            <w:vAlign w:val="top"/>
+          </w:tcPr>
+          <w:p>
+            <w:pPr>
+              <w:jc w:val="left"/>
+              <w:rPr>
+                <w:rFonts w:ascii="Times New Roman" w:cs="Times New Roman" w:eastAsia="Times New Roman" w:hAnsi="Times New Roman"/>
+                <w:sz w:val="16"/>
+                <w:szCs w:val="16"/>
+              </w:rPr>
+            </w:pPr>
+            <w:r>
+              <w:rPr>
+                <w:rFonts w:ascii="Times New Roman" w:cs="Times New Roman" w:eastAsia="Times New Roman" w:hAnsi="Times New Roman"/>
+                <w:sz w:val="16"/>
+                <w:szCs w:val="16"/>
+                <w:rtl w:val="0"/>
+              </w:rPr>
+              <w:t xml:space="preserve">A</w:t>
+            </w:r>
+          </w:p>
+        </w:tc>
+        <w:tc>
+          <w:tcPr>
+            <w:shd w:fill="auto" w:val="clear"/>
+            <w:tcMar>
+              <w:top w:w="100.0" w:type="dxa"/>
+              <w:left w:w="100.0" w:type="dxa"/>
+              <w:bottom w:w="100.0" w:type="dxa"/>
+              <w:right w:w="100.0" w:type="dxa"/>
+            </w:tcMar>
+            <w:vAlign w:val="top"/>
+          </w:tcPr>
+          <w:p>
+            <w:pPr>
+              <w:jc w:val="left"/>
+              <w:rPr>
+                <w:rFonts w:ascii="Times New Roman" w:cs="Times New Roman" w:eastAsia="Times New Roman" w:hAnsi="Times New Roman"/>
+                <w:sz w:val="16"/>
+                <w:szCs w:val="16"/>
+              </w:rPr>
+            </w:pPr>
+            <w:r>
+              <w:rPr>
+                <w:rFonts w:ascii="Times New Roman" w:cs="Times New Roman" w:eastAsia="Times New Roman" w:hAnsi="Times New Roman"/>
+                <w:sz w:val="16"/>
+                <w:szCs w:val="16"/>
+                <w:rtl w:val="0"/>
+              </w:rPr>
+              <w:t xml:space="preserve">909</w:t>
+            </w:r>
+          </w:p>
+        </w:tc>
+        <w:tc>
+          <w:tcPr>
+            <w:shd w:fill="auto" w:val="clear"/>
+            <w:tcMar>
+              <w:top w:w="100.0" w:type="dxa"/>
+              <w:left w:w="100.0" w:type="dxa"/>
+              <w:bottom w:w="100.0" w:type="dxa"/>
+              <w:right w:w="100.0" w:type="dxa"/>
+            </w:tcMar>
+            <w:vAlign w:val="top"/>
+          </w:tcPr>
+          <w:p>
+            <w:pPr>
+              <w:jc w:val="left"/>
+              <w:rPr>
+                <w:rFonts w:ascii="Times New Roman" w:cs="Times New Roman" w:eastAsia="Times New Roman" w:hAnsi="Times New Roman"/>
+                <w:sz w:val="16"/>
+                <w:szCs w:val="16"/>
+              </w:rPr>
+            </w:pPr>
+            <w:r>
+              <w:rPr>
+                <w:rFonts w:ascii="Times New Roman" w:cs="Times New Roman" w:eastAsia="Times New Roman" w:hAnsi="Times New Roman"/>
+                <w:sz w:val="16"/>
+                <w:szCs w:val="16"/>
+                <w:rtl w:val="0"/>
+              </w:rPr>
+              <w:t xml:space="preserve">$3.02</w:t>
+            </w:r>
+          </w:p>
+        </w:tc>
+        <w:tc>
+          <w:tcPr>
+            <w:shd w:fill="auto" w:val="clear"/>
+            <w:tcMar>
+              <w:top w:w="100.0" w:type="dxa"/>
+              <w:left w:w="100.0" w:type="dxa"/>
+              <w:bottom w:w="100.0" w:type="dxa"/>
+              <w:right w:w="100.0" w:type="dxa"/>
+            </w:tcMar>
+            <w:vAlign w:val="top"/>
+          </w:tcPr>
+          <w:p>
+            <w:pPr>
+              <w:jc w:val="left"/>
+              <w:rPr>
+                <w:rFonts w:ascii="Times New Roman" w:cs="Times New Roman" w:eastAsia="Times New Roman" w:hAnsi="Times New Roman"/>
+                <w:sz w:val="16"/>
+                <w:szCs w:val="16"/>
+              </w:rPr>
+            </w:pPr>
+            <w:r>
+              <w:rPr>
+                <w:rFonts w:ascii="Times New Roman" w:cs="Times New Roman" w:eastAsia="Times New Roman" w:hAnsi="Times New Roman"/>
+                <w:sz w:val="16"/>
+                <w:szCs w:val="16"/>
+                <w:rtl w:val="0"/>
+              </w:rPr>
+              <w:t xml:space="preserve">$0.00333</w:t>
+            </w:r>
+          </w:p>
+        </w:tc>
+        <w:tc>
+          <w:tcPr>
+            <w:shd w:fill="auto" w:val="clear"/>
+            <w:tcMar>
+              <w:top w:w="100.0" w:type="dxa"/>
+              <w:left w:w="100.0" w:type="dxa"/>
+              <w:bottom w:w="100.0" w:type="dxa"/>
+              <w:right w:w="100.0" w:type="dxa"/>
+            </w:tcMar>
+            <w:vAlign w:val="top"/>
+          </w:tcPr>
+          <w:p>
+            <w:pPr>
+              <w:jc w:val="left"/>
+              <w:rPr>
+                <w:rFonts w:ascii="Times New Roman" w:cs="Times New Roman" w:eastAsia="Times New Roman" w:hAnsi="Times New Roman"/>
+                <w:sz w:val="16"/>
+                <w:szCs w:val="16"/>
+              </w:rPr>
+            </w:pPr>
+            <w:r>
+              <w:rPr>
+                <w:rFonts w:ascii="Times New Roman" w:cs="Times New Roman" w:eastAsia="Times New Roman" w:hAnsi="Times New Roman"/>
+                <w:sz w:val="16"/>
+                <w:szCs w:val="16"/>
+                <w:rtl w:val="0"/>
+              </w:rPr>
+              <w:t xml:space="preserve">4.6s</w:t>
+            </w:r>
+          </w:p>
+        </w:tc>
+        <w:tc>
+          <w:tcPr>
+            <w:shd w:fill="auto" w:val="clear"/>
+            <w:tcMar>
+              <w:top w:w="100.0" w:type="dxa"/>
+              <w:left w:w="100.0" w:type="dxa"/>
+              <w:bottom w:w="100.0" w:type="dxa"/>
+              <w:right w:w="100.0" w:type="dxa"/>
+            </w:tcMar>
+            <w:vAlign w:val="top"/>
+          </w:tcPr>
+          <w:p>
+            <w:pPr>
+              <w:jc w:val="left"/>
+              <w:rPr>
+                <w:rFonts w:ascii="Times New Roman" w:cs="Times New Roman" w:eastAsia="Times New Roman" w:hAnsi="Times New Roman"/>
+                <w:sz w:val="16"/>
+                <w:szCs w:val="16"/>
+              </w:rPr>
+            </w:pPr>
+            <w:r>
+              <w:rPr>
+                <w:rFonts w:ascii="Times New Roman" w:cs="Times New Roman" w:eastAsia="Times New Roman" w:hAnsi="Times New Roman"/>
+                <w:sz w:val="16"/>
+                <w:szCs w:val="16"/>
+                <w:rtl w:val="0"/>
+              </w:rPr>
+              <w:t xml:space="preserve">7.2s</w:t>
+            </w:r>
+          </w:p>
+        </w:tc>
+      </w:tr>
+      <w:tr>
+        <w:tc>
+          <w:tcPr>
+            <w:shd w:fill="auto" w:val="clear"/>
+            <w:tcMar>
+              <w:top w:w="100.0" w:type="dxa"/>
+              <w:left w:w="100.0" w:type="dxa"/>
+              <w:bottom w:w="100.0" w:type="dxa"/>
+              <w:right w:w="100.0" w:type="dxa"/>
+            </w:tcMar>
+            <w:vAlign w:val="top"/>
+          </w:tcPr>
+          <w:p>
+            <w:pPr>
+              <w:jc w:val="left"/>
+              <w:rPr>
+                <w:rFonts w:ascii="Times New Roman" w:cs="Times New Roman" w:eastAsia="Times New Roman" w:hAnsi="Times New Roman"/>
+                <w:sz w:val="16"/>
+                <w:szCs w:val="16"/>
+              </w:rPr>
+            </w:pPr>
+            <w:r>
+              <w:rPr>
+                <w:rFonts w:ascii="Times New Roman" w:cs="Times New Roman" w:eastAsia="Times New Roman" w:hAnsi="Times New Roman"/>
+                <w:sz w:val="16"/>
+                <w:szCs w:val="16"/>
+                <w:rtl w:val="0"/>
+              </w:rPr>
+              <w:t xml:space="preserve"/>
+            </w:r>
+          </w:p>
+        </w:tc>
+        <w:tc>
+          <w:tcPr>
+            <w:shd w:fill="auto" w:val="clear"/>
+            <w:tcMar>
+              <w:top w:w="100.0" w:type="dxa"/>
+              <w:left w:w="100.0" w:type="dxa"/>
+              <w:bottom w:w="100.0" w:type="dxa"/>
+              <w:right w:w="100.0" w:type="dxa"/>
+            </w:tcMar>
+            <w:vAlign w:val="top"/>
+          </w:tcPr>
+          <w:p>
+            <w:pPr>
+              <w:jc w:val="left"/>
+              <w:rPr>
+                <w:rFonts w:ascii="Times New Roman" w:cs="Times New Roman" w:eastAsia="Times New Roman" w:hAnsi="Times New Roman"/>
+                <w:sz w:val="16"/>
+                <w:szCs w:val="16"/>
+              </w:rPr>
+            </w:pPr>
+            <w:r>
+              <w:rPr>
+                <w:rFonts w:ascii="Times New Roman" w:cs="Times New Roman" w:eastAsia="Times New Roman" w:hAnsi="Times New Roman"/>
+                <w:sz w:val="16"/>
+                <w:szCs w:val="16"/>
+                <w:rtl w:val="0"/>
+              </w:rPr>
+              <w:t xml:space="preserve">B</w:t>
+            </w:r>
+          </w:p>
+        </w:tc>
+        <w:tc>
+          <w:tcPr>
+            <w:shd w:fill="auto" w:val="clear"/>
+            <w:tcMar>
+              <w:top w:w="100.0" w:type="dxa"/>
+              <w:left w:w="100.0" w:type="dxa"/>
+              <w:bottom w:w="100.0" w:type="dxa"/>
+              <w:right w:w="100.0" w:type="dxa"/>
+            </w:tcMar>
+            <w:vAlign w:val="top"/>
+          </w:tcPr>
+          <w:p>
+            <w:pPr>
+              <w:jc w:val="left"/>
+              <w:rPr>
+                <w:rFonts w:ascii="Times New Roman" w:cs="Times New Roman" w:eastAsia="Times New Roman" w:hAnsi="Times New Roman"/>
+                <w:sz w:val="16"/>
+                <w:szCs w:val="16"/>
+              </w:rPr>
+            </w:pPr>
+            <w:r>
+              <w:rPr>
+                <w:rFonts w:ascii="Times New Roman" w:cs="Times New Roman" w:eastAsia="Times New Roman" w:hAnsi="Times New Roman"/>
+                <w:sz w:val="16"/>
+                <w:szCs w:val="16"/>
+                <w:rtl w:val="0"/>
+              </w:rPr>
+              <w:t xml:space="preserve">909</w:t>
+            </w:r>
+          </w:p>
+        </w:tc>
+        <w:tc>
+          <w:tcPr>
+            <w:shd w:fill="auto" w:val="clear"/>
+            <w:tcMar>
+              <w:top w:w="100.0" w:type="dxa"/>
+              <w:left w:w="100.0" w:type="dxa"/>
+              <w:bottom w:w="100.0" w:type="dxa"/>
+              <w:right w:w="100.0" w:type="dxa"/>
+            </w:tcMar>
+            <w:vAlign w:val="top"/>
+          </w:tcPr>
+          <w:p>
+            <w:pPr>
+              <w:jc w:val="left"/>
+              <w:rPr>
+                <w:rFonts w:ascii="Times New Roman" w:cs="Times New Roman" w:eastAsia="Times New Roman" w:hAnsi="Times New Roman"/>
+                <w:sz w:val="16"/>
+                <w:szCs w:val="16"/>
+              </w:rPr>
+            </w:pPr>
+            <w:r>
+              <w:rPr>
+                <w:rFonts w:ascii="Times New Roman" w:cs="Times New Roman" w:eastAsia="Times New Roman" w:hAnsi="Times New Roman"/>
+                <w:sz w:val="16"/>
+                <w:szCs w:val="16"/>
+                <w:rtl w:val="0"/>
+              </w:rPr>
+              <w:t xml:space="preserve">$3.21</w:t>
+            </w:r>
+          </w:p>
+        </w:tc>
+        <w:tc>
+          <w:tcPr>
+            <w:shd w:fill="auto" w:val="clear"/>
+            <w:tcMar>
+              <w:top w:w="100.0" w:type="dxa"/>
+              <w:left w:w="100.0" w:type="dxa"/>
+              <w:bottom w:w="100.0" w:type="dxa"/>
+              <w:right w:w="100.0" w:type="dxa"/>
+            </w:tcMar>
+            <w:vAlign w:val="top"/>
+          </w:tcPr>
+          <w:p>
+            <w:pPr>
+              <w:jc w:val="left"/>
+              <w:rPr>
+                <w:rFonts w:ascii="Times New Roman" w:cs="Times New Roman" w:eastAsia="Times New Roman" w:hAnsi="Times New Roman"/>
+                <w:sz w:val="16"/>
+                <w:szCs w:val="16"/>
+              </w:rPr>
+            </w:pPr>
+            <w:r>
+              <w:rPr>
+                <w:rFonts w:ascii="Times New Roman" w:cs="Times New Roman" w:eastAsia="Times New Roman" w:hAnsi="Times New Roman"/>
+                <w:sz w:val="16"/>
+                <w:szCs w:val="16"/>
+                <w:rtl w:val="0"/>
+              </w:rPr>
+              <w:t xml:space="preserve">$0.00353</w:t>
+            </w:r>
+          </w:p>
+        </w:tc>
+        <w:tc>
+          <w:tcPr>
+            <w:shd w:fill="auto" w:val="clear"/>
+            <w:tcMar>
+              <w:top w:w="100.0" w:type="dxa"/>
+              <w:left w:w="100.0" w:type="dxa"/>
+              <w:bottom w:w="100.0" w:type="dxa"/>
+              <w:right w:w="100.0" w:type="dxa"/>
+            </w:tcMar>
+            <w:vAlign w:val="top"/>
+          </w:tcPr>
+          <w:p>
+            <w:pPr>
+              <w:jc w:val="left"/>
+              <w:rPr>
+                <w:rFonts w:ascii="Times New Roman" w:cs="Times New Roman" w:eastAsia="Times New Roman" w:hAnsi="Times New Roman"/>
+                <w:sz w:val="16"/>
+                <w:szCs w:val="16"/>
+              </w:rPr>
+            </w:pPr>
+            <w:r>
+              <w:rPr>
+                <w:rFonts w:ascii="Times New Roman" w:cs="Times New Roman" w:eastAsia="Times New Roman" w:hAnsi="Times New Roman"/>
+                <w:sz w:val="16"/>
+                <w:szCs w:val="16"/>
+                <w:rtl w:val="0"/>
+              </w:rPr>
+              <w:t xml:space="preserve">6.8s</w:t>
+            </w:r>
+          </w:p>
+        </w:tc>
+        <w:tc>
+          <w:tcPr>
+            <w:shd w:fill="auto" w:val="clear"/>
+            <w:tcMar>
+              <w:top w:w="100.0" w:type="dxa"/>
+              <w:left w:w="100.0" w:type="dxa"/>
+              <w:bottom w:w="100.0" w:type="dxa"/>
+              <w:right w:w="100.0" w:type="dxa"/>
+            </w:tcMar>
+            <w:vAlign w:val="top"/>
+          </w:tcPr>
+          <w:p>
+            <w:pPr>
+              <w:jc w:val="left"/>
+              <w:rPr>
+                <w:rFonts w:ascii="Times New Roman" w:cs="Times New Roman" w:eastAsia="Times New Roman" w:hAnsi="Times New Roman"/>
+                <w:sz w:val="16"/>
+                <w:szCs w:val="16"/>
+              </w:rPr>
+            </w:pPr>
+            <w:r>
+              <w:rPr>
+                <w:rFonts w:ascii="Times New Roman" w:cs="Times New Roman" w:eastAsia="Times New Roman" w:hAnsi="Times New Roman"/>
+                <w:sz w:val="16"/>
+                <w:szCs w:val="16"/>
+                <w:rtl w:val="0"/>
+              </w:rPr>
+              <w:t xml:space="preserve">14.7s</w:t>
+            </w:r>
+          </w:p>
+        </w:tc>
+      </w:tr>
+      <w:tr>
+        <w:tc>
+          <w:tcPr>
+            <w:shd w:fill="auto" w:val="clear"/>
+            <w:tcMar>
+              <w:top w:w="100.0" w:type="dxa"/>
+              <w:left w:w="100.0" w:type="dxa"/>
+              <w:bottom w:w="100.0" w:type="dxa"/>
+              <w:right w:w="100.0" w:type="dxa"/>
+            </w:tcMar>
+            <w:vAlign w:val="top"/>
+          </w:tcPr>
+          <w:p>
+            <w:pPr>
+              <w:jc w:val="left"/>
+              <w:rPr>
+                <w:rFonts w:ascii="Times New Roman" w:cs="Times New Roman" w:eastAsia="Times New Roman" w:hAnsi="Times New Roman"/>
+                <w:sz w:val="16"/>
+                <w:szCs w:val="16"/>
+              </w:rPr>
+            </w:pPr>
+            <w:r>
+              <w:rPr>
+                <w:rFonts w:ascii="Times New Roman" w:cs="Times New Roman" w:eastAsia="Times New Roman" w:hAnsi="Times New Roman"/>
+                <w:sz w:val="16"/>
+                <w:szCs w:val="16"/>
+                <w:rtl w:val="0"/>
+              </w:rPr>
+              <w:t xml:space="preserve"/>
+            </w:r>
+          </w:p>
+        </w:tc>
+        <w:tc>
+          <w:tcPr>
+            <w:shd w:fill="auto" w:val="clear"/>
+            <w:tcMar>
+              <w:top w:w="100.0" w:type="dxa"/>
+              <w:left w:w="100.0" w:type="dxa"/>
+              <w:bottom w:w="100.0" w:type="dxa"/>
+              <w:right w:w="100.0" w:type="dxa"/>
+            </w:tcMar>
+            <w:vAlign w:val="top"/>
+          </w:tcPr>
+          <w:p>
+            <w:pPr>
+              <w:jc w:val="left"/>
+              <w:rPr>
+                <w:rFonts w:ascii="Times New Roman" w:cs="Times New Roman" w:eastAsia="Times New Roman" w:hAnsi="Times New Roman"/>
+                <w:sz w:val="16"/>
+                <w:szCs w:val="16"/>
+              </w:rPr>
+            </w:pPr>
+            <w:r>
+              <w:rPr>
+                <w:rFonts w:ascii="Times New Roman" w:cs="Times New Roman" w:eastAsia="Times New Roman" w:hAnsi="Times New Roman"/>
+                <w:sz w:val="16"/>
+                <w:szCs w:val="16"/>
+                <w:rtl w:val="0"/>
+              </w:rPr>
+              <w:t xml:space="preserve">C</w:t>
+            </w:r>
+          </w:p>
+        </w:tc>
+        <w:tc>
+          <w:tcPr>
+            <w:shd w:fill="auto" w:val="clear"/>
+            <w:tcMar>
+              <w:top w:w="100.0" w:type="dxa"/>
+              <w:left w:w="100.0" w:type="dxa"/>
+              <w:bottom w:w="100.0" w:type="dxa"/>
+              <w:right w:w="100.0" w:type="dxa"/>
+            </w:tcMar>
+            <w:vAlign w:val="top"/>
+          </w:tcPr>
+          <w:p>
+            <w:pPr>
+              <w:jc w:val="left"/>
+              <w:rPr>
+                <w:rFonts w:ascii="Times New Roman" w:cs="Times New Roman" w:eastAsia="Times New Roman" w:hAnsi="Times New Roman"/>
+                <w:sz w:val="16"/>
+                <w:szCs w:val="16"/>
+              </w:rPr>
+            </w:pPr>
+            <w:r>
+              <w:rPr>
+                <w:rFonts w:ascii="Times New Roman" w:cs="Times New Roman" w:eastAsia="Times New Roman" w:hAnsi="Times New Roman"/>
+                <w:sz w:val="16"/>
+                <w:szCs w:val="16"/>
+                <w:rtl w:val="0"/>
+              </w:rPr>
+              <w:t xml:space="preserve">147</w:t>
+            </w:r>
+          </w:p>
+        </w:tc>
+        <w:tc>
+          <w:tcPr>
+            <w:shd w:fill="auto" w:val="clear"/>
+            <w:tcMar>
+              <w:top w:w="100.0" w:type="dxa"/>
+              <w:left w:w="100.0" w:type="dxa"/>
+              <w:bottom w:w="100.0" w:type="dxa"/>
+              <w:right w:w="100.0" w:type="dxa"/>
+            </w:tcMar>
+            <w:vAlign w:val="top"/>
+          </w:tcPr>
+          <w:p>
+            <w:pPr>
+              <w:jc w:val="left"/>
+              <w:rPr>
+                <w:rFonts w:ascii="Times New Roman" w:cs="Times New Roman" w:eastAsia="Times New Roman" w:hAnsi="Times New Roman"/>
+                <w:sz w:val="16"/>
+                <w:szCs w:val="16"/>
+              </w:rPr>
+            </w:pPr>
+            <w:r>
+              <w:rPr>
+                <w:rFonts w:ascii="Times New Roman" w:cs="Times New Roman" w:eastAsia="Times New Roman" w:hAnsi="Times New Roman"/>
+                <w:sz w:val="16"/>
+                <w:szCs w:val="16"/>
+                <w:rtl w:val="0"/>
+              </w:rPr>
+              <w:t xml:space="preserve">$0.64</w:t>
+            </w:r>
+          </w:p>
+        </w:tc>
+        <w:tc>
+          <w:tcPr>
+            <w:shd w:fill="auto" w:val="clear"/>
+            <w:tcMar>
+              <w:top w:w="100.0" w:type="dxa"/>
+              <w:left w:w="100.0" w:type="dxa"/>
+              <w:bottom w:w="100.0" w:type="dxa"/>
+              <w:right w:w="100.0" w:type="dxa"/>
+            </w:tcMar>
+            <w:vAlign w:val="top"/>
+          </w:tcPr>
+          <w:p>
+            <w:pPr>
+              <w:jc w:val="left"/>
+              <w:rPr>
+                <w:rFonts w:ascii="Times New Roman" w:cs="Times New Roman" w:eastAsia="Times New Roman" w:hAnsi="Times New Roman"/>
+                <w:sz w:val="16"/>
+                <w:szCs w:val="16"/>
+              </w:rPr>
+            </w:pPr>
+            <w:r>
+              <w:rPr>
+                <w:rFonts w:ascii="Times New Roman" w:cs="Times New Roman" w:eastAsia="Times New Roman" w:hAnsi="Times New Roman"/>
+                <w:sz w:val="16"/>
+                <w:szCs w:val="16"/>
+                <w:rtl w:val="0"/>
+              </w:rPr>
+              <w:t xml:space="preserve">$0.00432</w:t>
+            </w:r>
+          </w:p>
+        </w:tc>
+        <w:tc>
+          <w:tcPr>
+            <w:shd w:fill="auto" w:val="clear"/>
+            <w:tcMar>
+              <w:top w:w="100.0" w:type="dxa"/>
+              <w:left w:w="100.0" w:type="dxa"/>
+              <w:bottom w:w="100.0" w:type="dxa"/>
+              <w:right w:w="100.0" w:type="dxa"/>
+            </w:tcMar>
+            <w:vAlign w:val="top"/>
+          </w:tcPr>
+          <w:p>
+            <w:pPr>
+              <w:jc w:val="left"/>
+              <w:rPr>
+                <w:rFonts w:ascii="Times New Roman" w:cs="Times New Roman" w:eastAsia="Times New Roman" w:hAnsi="Times New Roman"/>
+                <w:sz w:val="16"/>
+                <w:szCs w:val="16"/>
+              </w:rPr>
+            </w:pPr>
+            <w:r>
+              <w:rPr>
+                <w:rFonts w:ascii="Times New Roman" w:cs="Times New Roman" w:eastAsia="Times New Roman" w:hAnsi="Times New Roman"/>
+                <w:sz w:val="16"/>
+                <w:szCs w:val="16"/>
+                <w:rtl w:val="0"/>
+              </w:rPr>
+              <w:t xml:space="preserve">3.2s</w:t>
+            </w:r>
+          </w:p>
+        </w:tc>
+        <w:tc>
+          <w:tcPr>
+            <w:shd w:fill="auto" w:val="clear"/>
+            <w:tcMar>
+              <w:top w:w="100.0" w:type="dxa"/>
+              <w:left w:w="100.0" w:type="dxa"/>
+              <w:bottom w:w="100.0" w:type="dxa"/>
+              <w:right w:w="100.0" w:type="dxa"/>
+            </w:tcMar>
+            <w:vAlign w:val="top"/>
+          </w:tcPr>
+          <w:p>
+            <w:pPr>
+              <w:jc w:val="left"/>
+              <w:rPr>
+                <w:rFonts w:ascii="Times New Roman" w:cs="Times New Roman" w:eastAsia="Times New Roman" w:hAnsi="Times New Roman"/>
+                <w:sz w:val="16"/>
+                <w:szCs w:val="16"/>
+              </w:rPr>
+            </w:pPr>
+            <w:r>
+              <w:rPr>
+                <w:rFonts w:ascii="Times New Roman" w:cs="Times New Roman" w:eastAsia="Times New Roman" w:hAnsi="Times New Roman"/>
+                <w:sz w:val="16"/>
+                <w:szCs w:val="16"/>
+                <w:rtl w:val="0"/>
+              </w:rPr>
+              <w:t xml:space="preserve">4.5s</w:t>
+            </w:r>
+          </w:p>
+        </w:tc>
+      </w:tr>
+      <w:tr>
+        <w:tc>
+          <w:tcPr>
+            <w:shd w:fill="auto" w:val="clear"/>
+            <w:tcMar>
+              <w:top w:w="100.0" w:type="dxa"/>
+              <w:left w:w="100.0" w:type="dxa"/>
+              <w:bottom w:w="100.0" w:type="dxa"/>
+              <w:right w:w="100.0" w:type="dxa"/>
+            </w:tcMar>
+            <w:vAlign w:val="top"/>
+          </w:tcPr>
+          <w:p>
+            <w:pPr>
+              <w:jc w:val="left"/>
+              <w:rPr>
+                <w:rFonts w:ascii="Times New Roman" w:cs="Times New Roman" w:eastAsia="Times New Roman" w:hAnsi="Times New Roman"/>
+                <w:sz w:val="16"/>
+                <w:szCs w:val="16"/>
+              </w:rPr>
+            </w:pPr>
+            <w:r>
+              <w:rPr>
+                <w:rFonts w:ascii="Times New Roman" w:cs="Times New Roman" w:eastAsia="Times New Roman" w:hAnsi="Times New Roman"/>
+                <w:sz w:val="16"/>
+                <w:szCs w:val="16"/>
+                <w:rtl w:val="0"/>
+              </w:rPr>
+              <w:t xml:space="preserve"/>
+            </w:r>
+          </w:p>
+        </w:tc>
+        <w:tc>
+          <w:tcPr>
+            <w:shd w:fill="auto" w:val="clear"/>
+            <w:tcMar>
+              <w:top w:w="100.0" w:type="dxa"/>
+              <w:left w:w="100.0" w:type="dxa"/>
+              <w:bottom w:w="100.0" w:type="dxa"/>
+              <w:right w:w="100.0" w:type="dxa"/>
+            </w:tcMar>
+            <w:vAlign w:val="top"/>
+          </w:tcPr>
+          <w:p>
+            <w:pPr>
+              <w:jc w:val="left"/>
+              <w:rPr>
+                <w:rFonts w:ascii="Times New Roman" w:cs="Times New Roman" w:eastAsia="Times New Roman" w:hAnsi="Times New Roman"/>
+                <w:sz w:val="16"/>
+                <w:szCs w:val="16"/>
+              </w:rPr>
+            </w:pPr>
+            <w:r>
+              <w:rPr>
+                <w:rFonts w:ascii="Times New Roman" w:cs="Times New Roman" w:eastAsia="Times New Roman" w:hAnsi="Times New Roman"/>
+                <w:sz w:val="16"/>
+                <w:szCs w:val="16"/>
+                <w:rtl w:val="0"/>
+              </w:rPr>
+              <w:t xml:space="preserve">D</w:t>
+            </w:r>
+          </w:p>
+        </w:tc>
+        <w:tc>
+          <w:tcPr>
+            <w:shd w:fill="auto" w:val="clear"/>
+            <w:tcMar>
+              <w:top w:w="100.0" w:type="dxa"/>
+              <w:left w:w="100.0" w:type="dxa"/>
+              <w:bottom w:w="100.0" w:type="dxa"/>
+              <w:right w:w="100.0" w:type="dxa"/>
+            </w:tcMar>
+            <w:vAlign w:val="top"/>
+          </w:tcPr>
+          <w:p>
+            <w:pPr>
+              <w:jc w:val="left"/>
+              <w:rPr>
+                <w:rFonts w:ascii="Times New Roman" w:cs="Times New Roman" w:eastAsia="Times New Roman" w:hAnsi="Times New Roman"/>
+                <w:sz w:val="16"/>
+                <w:szCs w:val="16"/>
+              </w:rPr>
+            </w:pPr>
+            <w:r>
+              <w:rPr>
+                <w:rFonts w:ascii="Times New Roman" w:cs="Times New Roman" w:eastAsia="Times New Roman" w:hAnsi="Times New Roman"/>
+                <w:sz w:val="16"/>
+                <w:szCs w:val="16"/>
+                <w:rtl w:val="0"/>
+              </w:rPr>
+              <w:t xml:space="preserve">147</w:t>
+            </w:r>
+          </w:p>
+        </w:tc>
+        <w:tc>
+          <w:tcPr>
+            <w:shd w:fill="auto" w:val="clear"/>
+            <w:tcMar>
+              <w:top w:w="100.0" w:type="dxa"/>
+              <w:left w:w="100.0" w:type="dxa"/>
+              <w:bottom w:w="100.0" w:type="dxa"/>
+              <w:right w:w="100.0" w:type="dxa"/>
+            </w:tcMar>
+            <w:vAlign w:val="top"/>
+          </w:tcPr>
+          <w:p>
+            <w:pPr>
+              <w:jc w:val="left"/>
+              <w:rPr>
+                <w:rFonts w:ascii="Times New Roman" w:cs="Times New Roman" w:eastAsia="Times New Roman" w:hAnsi="Times New Roman"/>
+                <w:sz w:val="16"/>
+                <w:szCs w:val="16"/>
+              </w:rPr>
+            </w:pPr>
+            <w:r>
+              <w:rPr>
+                <w:rFonts w:ascii="Times New Roman" w:cs="Times New Roman" w:eastAsia="Times New Roman" w:hAnsi="Times New Roman"/>
+                <w:sz w:val="16"/>
+                <w:szCs w:val="16"/>
+                <w:rtl w:val="0"/>
+              </w:rPr>
+              <w:t xml:space="preserve">$0.65</w:t>
+            </w:r>
+          </w:p>
+        </w:tc>
+        <w:tc>
+          <w:tcPr>
+            <w:shd w:fill="auto" w:val="clear"/>
+            <w:tcMar>
+              <w:top w:w="100.0" w:type="dxa"/>
+              <w:left w:w="100.0" w:type="dxa"/>
+              <w:bottom w:w="100.0" w:type="dxa"/>
+              <w:right w:w="100.0" w:type="dxa"/>
+            </w:tcMar>
+            <w:vAlign w:val="top"/>
+          </w:tcPr>
+          <w:p>
+            <w:pPr>
+              <w:jc w:val="left"/>
+              <w:rPr>
+                <w:rFonts w:ascii="Times New Roman" w:cs="Times New Roman" w:eastAsia="Times New Roman" w:hAnsi="Times New Roman"/>
+                <w:sz w:val="16"/>
+                <w:szCs w:val="16"/>
+              </w:rPr>
+            </w:pPr>
+            <w:r>
+              <w:rPr>
+                <w:rFonts w:ascii="Times New Roman" w:cs="Times New Roman" w:eastAsia="Times New Roman" w:hAnsi="Times New Roman"/>
+                <w:sz w:val="16"/>
+                <w:szCs w:val="16"/>
+                <w:rtl w:val="0"/>
+              </w:rPr>
+              <w:t xml:space="preserve">$0.00440</w:t>
+            </w:r>
+          </w:p>
+        </w:tc>
+        <w:tc>
+          <w:tcPr>
+            <w:shd w:fill="auto" w:val="clear"/>
+            <w:tcMar>
+              <w:top w:w="100.0" w:type="dxa"/>
+              <w:left w:w="100.0" w:type="dxa"/>
+              <w:bottom w:w="100.0" w:type="dxa"/>
+              <w:right w:w="100.0" w:type="dxa"/>
+            </w:tcMar>
+            <w:vAlign w:val="top"/>
+          </w:tcPr>
+          <w:p>
+            <w:pPr>
+              <w:jc w:val="left"/>
+              <w:rPr>
+                <w:rFonts w:ascii="Times New Roman" w:cs="Times New Roman" w:eastAsia="Times New Roman" w:hAnsi="Times New Roman"/>
+                <w:sz w:val="16"/>
+                <w:szCs w:val="16"/>
+              </w:rPr>
+            </w:pPr>
+            <w:r>
+              <w:rPr>
+                <w:rFonts w:ascii="Times New Roman" w:cs="Times New Roman" w:eastAsia="Times New Roman" w:hAnsi="Times New Roman"/>
+                <w:sz w:val="16"/>
+                <w:szCs w:val="16"/>
+                <w:rtl w:val="0"/>
+              </w:rPr>
+              <w:t xml:space="preserve">3.7s</w:t>
+            </w:r>
+          </w:p>
+        </w:tc>
+        <w:tc>
+          <w:tcPr>
+            <w:shd w:fill="auto" w:val="clear"/>
+            <w:tcMar>
+              <w:top w:w="100.0" w:type="dxa"/>
+              <w:left w:w="100.0" w:type="dxa"/>
+              <w:bottom w:w="100.0" w:type="dxa"/>
+              <w:right w:w="100.0" w:type="dxa"/>
+            </w:tcMar>
+            <w:vAlign w:val="top"/>
+          </w:tcPr>
+          <w:p>
+            <w:pPr>
+              <w:jc w:val="left"/>
+              <w:rPr>
+                <w:rFonts w:ascii="Times New Roman" w:cs="Times New Roman" w:eastAsia="Times New Roman" w:hAnsi="Times New Roman"/>
+                <w:sz w:val="16"/>
+                <w:szCs w:val="16"/>
+              </w:rPr>
+            </w:pPr>
+            <w:r>
+              <w:rPr>
+                <w:rFonts w:ascii="Times New Roman" w:cs="Times New Roman" w:eastAsia="Times New Roman" w:hAnsi="Times New Roman"/>
+                <w:sz w:val="16"/>
+                <w:szCs w:val="16"/>
+                <w:rtl w:val="0"/>
+              </w:rPr>
+              <w:t xml:space="preserve">4.5s</w:t>
+            </w:r>
+          </w:p>
+        </w:tc>
+      </w:tr>
+      <w:tr>
+        <w:tc>
+          <w:tcPr>
+            <w:shd w:fill="auto" w:val="clear"/>
+            <w:tcMar>
+              <w:top w:w="100.0" w:type="dxa"/>
+              <w:left w:w="100.0" w:type="dxa"/>
+              <w:bottom w:w="100.0" w:type="dxa"/>
+              <w:right w:w="100.0" w:type="dxa"/>
+            </w:tcMar>
+            <w:vAlign w:val="top"/>
+          </w:tcPr>
+          <w:p>
+            <w:pPr>
+              <w:jc w:val="left"/>
+              <w:rPr>
+                <w:rFonts w:ascii="Times New Roman" w:cs="Times New Roman" w:eastAsia="Times New Roman" w:hAnsi="Times New Roman"/>
+                <w:sz w:val="16"/>
+                <w:szCs w:val="16"/>
+              </w:rPr>
+            </w:pPr>
+            <w:r>
+              <w:rPr>
+                <w:rFonts w:ascii="Times New Roman" w:cs="Times New Roman" w:eastAsia="Times New Roman" w:hAnsi="Times New Roman"/>
+                <w:sz w:val="16"/>
+                <w:szCs w:val="16"/>
+                <w:rtl w:val="0"/>
+              </w:rPr>
+              <w:t xml:space="preserve">Claude Sonnet 4</w:t>
+            </w:r>
+          </w:p>
+        </w:tc>
+        <w:tc>
+          <w:tcPr>
+            <w:shd w:fill="auto" w:val="clear"/>
+            <w:tcMar>
+              <w:top w:w="100.0" w:type="dxa"/>
+              <w:left w:w="100.0" w:type="dxa"/>
+              <w:bottom w:w="100.0" w:type="dxa"/>
+              <w:right w:w="100.0" w:type="dxa"/>
+            </w:tcMar>
+            <w:vAlign w:val="top"/>
+          </w:tcPr>
+          <w:p>
+            <w:pPr>
+              <w:jc w:val="left"/>
+              <w:rPr>
+                <w:rFonts w:ascii="Times New Roman" w:cs="Times New Roman" w:eastAsia="Times New Roman" w:hAnsi="Times New Roman"/>
+                <w:sz w:val="16"/>
+                <w:szCs w:val="16"/>
+              </w:rPr>
+            </w:pPr>
+            <w:r>
+              <w:rPr>
+                <w:rFonts w:ascii="Times New Roman" w:cs="Times New Roman" w:eastAsia="Times New Roman" w:hAnsi="Times New Roman"/>
+                <w:sz w:val="16"/>
+                <w:szCs w:val="16"/>
+                <w:rtl w:val="0"/>
+              </w:rPr>
+              <w:t xml:space="preserve">A</w:t>
+            </w:r>
+          </w:p>
+        </w:tc>
+        <w:tc>
+          <w:tcPr>
+            <w:shd w:fill="auto" w:val="clear"/>
+            <w:tcMar>
+              <w:top w:w="100.0" w:type="dxa"/>
+              <w:left w:w="100.0" w:type="dxa"/>
+              <w:bottom w:w="100.0" w:type="dxa"/>
+              <w:right w:w="100.0" w:type="dxa"/>
+            </w:tcMar>
+            <w:vAlign w:val="top"/>
+          </w:tcPr>
+          <w:p>
+            <w:pPr>
+              <w:jc w:val="left"/>
+              <w:rPr>
+                <w:rFonts w:ascii="Times New Roman" w:cs="Times New Roman" w:eastAsia="Times New Roman" w:hAnsi="Times New Roman"/>
+                <w:sz w:val="16"/>
+                <w:szCs w:val="16"/>
+              </w:rPr>
+            </w:pPr>
+            <w:r>
+              <w:rPr>
+                <w:rFonts w:ascii="Times New Roman" w:cs="Times New Roman" w:eastAsia="Times New Roman" w:hAnsi="Times New Roman"/>
+                <w:sz w:val="16"/>
+                <w:szCs w:val="16"/>
+                <w:rtl w:val="0"/>
+              </w:rPr>
+              <w:t xml:space="preserve">909</w:t>
+            </w:r>
+          </w:p>
+        </w:tc>
+        <w:tc>
+          <w:tcPr>
+            <w:shd w:fill="auto" w:val="clear"/>
+            <w:tcMar>
+              <w:top w:w="100.0" w:type="dxa"/>
+              <w:left w:w="100.0" w:type="dxa"/>
+              <w:bottom w:w="100.0" w:type="dxa"/>
+              <w:right w:w="100.0" w:type="dxa"/>
+            </w:tcMar>
+            <w:vAlign w:val="top"/>
+          </w:tcPr>
+          <w:p>
+            <w:pPr>
+              <w:jc w:val="left"/>
+              <w:rPr>
+                <w:rFonts w:ascii="Times New Roman" w:cs="Times New Roman" w:eastAsia="Times New Roman" w:hAnsi="Times New Roman"/>
+                <w:sz w:val="16"/>
+                <w:szCs w:val="16"/>
+              </w:rPr>
+            </w:pPr>
+            <w:r>
+              <w:rPr>
+                <w:rFonts w:ascii="Times New Roman" w:cs="Times New Roman" w:eastAsia="Times New Roman" w:hAnsi="Times New Roman"/>
+                <w:sz w:val="16"/>
+                <w:szCs w:val="16"/>
+                <w:rtl w:val="0"/>
+              </w:rPr>
+              <w:t xml:space="preserve">$9.00</w:t>
+            </w:r>
+          </w:p>
+        </w:tc>
+        <w:tc>
+          <w:tcPr>
+            <w:shd w:fill="auto" w:val="clear"/>
+            <w:tcMar>
+              <w:top w:w="100.0" w:type="dxa"/>
+              <w:left w:w="100.0" w:type="dxa"/>
+              <w:bottom w:w="100.0" w:type="dxa"/>
+              <w:right w:w="100.0" w:type="dxa"/>
+            </w:tcMar>
+            <w:vAlign w:val="top"/>
+          </w:tcPr>
+          <w:p>
+            <w:pPr>
+              <w:jc w:val="left"/>
+              <w:rPr>
+                <w:rFonts w:ascii="Times New Roman" w:cs="Times New Roman" w:eastAsia="Times New Roman" w:hAnsi="Times New Roman"/>
+                <w:sz w:val="16"/>
+                <w:szCs w:val="16"/>
+              </w:rPr>
+            </w:pPr>
+            <w:r>
+              <w:rPr>
+                <w:rFonts w:ascii="Times New Roman" w:cs="Times New Roman" w:eastAsia="Times New Roman" w:hAnsi="Times New Roman"/>
+                <w:sz w:val="16"/>
+                <w:szCs w:val="16"/>
+                <w:rtl w:val="0"/>
+              </w:rPr>
+              <w:t xml:space="preserve">$0.00990</w:t>
+            </w:r>
+          </w:p>
+        </w:tc>
+        <w:tc>
+          <w:tcPr>
+            <w:shd w:fill="auto" w:val="clear"/>
+            <w:tcMar>
+              <w:top w:w="100.0" w:type="dxa"/>
+              <w:left w:w="100.0" w:type="dxa"/>
+              <w:bottom w:w="100.0" w:type="dxa"/>
+              <w:right w:w="100.0" w:type="dxa"/>
+            </w:tcMar>
+            <w:vAlign w:val="top"/>
+          </w:tcPr>
+          <w:p>
+            <w:pPr>
+              <w:jc w:val="left"/>
+              <w:rPr>
+                <w:rFonts w:ascii="Times New Roman" w:cs="Times New Roman" w:eastAsia="Times New Roman" w:hAnsi="Times New Roman"/>
+                <w:sz w:val="16"/>
+                <w:szCs w:val="16"/>
+              </w:rPr>
+            </w:pPr>
+            <w:r>
+              <w:rPr>
+                <w:rFonts w:ascii="Times New Roman" w:cs="Times New Roman" w:eastAsia="Times New Roman" w:hAnsi="Times New Roman"/>
+                <w:sz w:val="16"/>
+                <w:szCs w:val="16"/>
+                <w:rtl w:val="0"/>
+              </w:rPr>
+              <w:t xml:space="preserve">8.0s</w:t>
+            </w:r>
+          </w:p>
+        </w:tc>
+        <w:tc>
+          <w:tcPr>
+            <w:shd w:fill="auto" w:val="clear"/>
+            <w:tcMar>
+              <w:top w:w="100.0" w:type="dxa"/>
+              <w:left w:w="100.0" w:type="dxa"/>
+              <w:bottom w:w="100.0" w:type="dxa"/>
+              <w:right w:w="100.0" w:type="dxa"/>
+            </w:tcMar>
+            <w:vAlign w:val="top"/>
+          </w:tcPr>
+          <w:p>
+            <w:pPr>
+              <w:jc w:val="left"/>
+              <w:rPr>
+                <w:rFonts w:ascii="Times New Roman" w:cs="Times New Roman" w:eastAsia="Times New Roman" w:hAnsi="Times New Roman"/>
+                <w:sz w:val="16"/>
+                <w:szCs w:val="16"/>
+              </w:rPr>
+            </w:pPr>
+            <w:r>
+              <w:rPr>
+                <w:rFonts w:ascii="Times New Roman" w:cs="Times New Roman" w:eastAsia="Times New Roman" w:hAnsi="Times New Roman"/>
+                <w:sz w:val="16"/>
+                <w:szCs w:val="16"/>
+                <w:rtl w:val="0"/>
+              </w:rPr>
+              <w:t xml:space="preserve">11.8s</w:t>
+            </w:r>
+          </w:p>
+        </w:tc>
+      </w:tr>
+      <w:tr>
+        <w:tc>
+          <w:tcPr>
+            <w:shd w:fill="auto" w:val="clear"/>
+            <w:tcMar>
+              <w:top w:w="100.0" w:type="dxa"/>
+              <w:left w:w="100.0" w:type="dxa"/>
+              <w:bottom w:w="100.0" w:type="dxa"/>
+              <w:right w:w="100.0" w:type="dxa"/>
+            </w:tcMar>
+            <w:vAlign w:val="top"/>
+          </w:tcPr>
+          <w:p>
+            <w:pPr>
+              <w:jc w:val="left"/>
+              <w:rPr>
+                <w:rFonts w:ascii="Times New Roman" w:cs="Times New Roman" w:eastAsia="Times New Roman" w:hAnsi="Times New Roman"/>
+                <w:sz w:val="16"/>
+                <w:szCs w:val="16"/>
+              </w:rPr>
+            </w:pPr>
+            <w:r>
+              <w:rPr>
+                <w:rFonts w:ascii="Times New Roman" w:cs="Times New Roman" w:eastAsia="Times New Roman" w:hAnsi="Times New Roman"/>
+                <w:sz w:val="16"/>
+                <w:szCs w:val="16"/>
+                <w:rtl w:val="0"/>
+              </w:rPr>
+              <w:t xml:space="preserve"/>
+            </w:r>
+          </w:p>
+        </w:tc>
+        <w:tc>
+          <w:tcPr>
+            <w:shd w:fill="auto" w:val="clear"/>
+            <w:tcMar>
+              <w:top w:w="100.0" w:type="dxa"/>
+              <w:left w:w="100.0" w:type="dxa"/>
+              <w:bottom w:w="100.0" w:type="dxa"/>
+              <w:right w:w="100.0" w:type="dxa"/>
+            </w:tcMar>
+            <w:vAlign w:val="top"/>
+          </w:tcPr>
+          <w:p>
+            <w:pPr>
+              <w:jc w:val="left"/>
+              <w:rPr>
+                <w:rFonts w:ascii="Times New Roman" w:cs="Times New Roman" w:eastAsia="Times New Roman" w:hAnsi="Times New Roman"/>
+                <w:sz w:val="16"/>
+                <w:szCs w:val="16"/>
+              </w:rPr>
+            </w:pPr>
+            <w:r>
+              <w:rPr>
+                <w:rFonts w:ascii="Times New Roman" w:cs="Times New Roman" w:eastAsia="Times New Roman" w:hAnsi="Times New Roman"/>
+                <w:sz w:val="16"/>
+                <w:szCs w:val="16"/>
+                <w:rtl w:val="0"/>
+              </w:rPr>
+              <w:t xml:space="preserve">B</w:t>
+            </w:r>
+          </w:p>
+        </w:tc>
+        <w:tc>
+          <w:tcPr>
+            <w:shd w:fill="auto" w:val="clear"/>
+            <w:tcMar>
+              <w:top w:w="100.0" w:type="dxa"/>
+              <w:left w:w="100.0" w:type="dxa"/>
+              <w:bottom w:w="100.0" w:type="dxa"/>
+              <w:right w:w="100.0" w:type="dxa"/>
+            </w:tcMar>
+            <w:vAlign w:val="top"/>
+          </w:tcPr>
+          <w:p>
+            <w:pPr>
+              <w:jc w:val="left"/>
+              <w:rPr>
+                <w:rFonts w:ascii="Times New Roman" w:cs="Times New Roman" w:eastAsia="Times New Roman" w:hAnsi="Times New Roman"/>
+                <w:sz w:val="16"/>
+                <w:szCs w:val="16"/>
+              </w:rPr>
+            </w:pPr>
+            <w:r>
+              <w:rPr>
+                <w:rFonts w:ascii="Times New Roman" w:cs="Times New Roman" w:eastAsia="Times New Roman" w:hAnsi="Times New Roman"/>
+                <w:sz w:val="16"/>
+                <w:szCs w:val="16"/>
+                <w:rtl w:val="0"/>
+              </w:rPr>
+              <w:t xml:space="preserve">909</w:t>
+            </w:r>
+          </w:p>
+        </w:tc>
+        <w:tc>
+          <w:tcPr>
+            <w:shd w:fill="auto" w:val="clear"/>
+            <w:tcMar>
+              <w:top w:w="100.0" w:type="dxa"/>
+              <w:left w:w="100.0" w:type="dxa"/>
+              <w:bottom w:w="100.0" w:type="dxa"/>
+              <w:right w:w="100.0" w:type="dxa"/>
+            </w:tcMar>
+            <w:vAlign w:val="top"/>
+          </w:tcPr>
+          <w:p>
+            <w:pPr>
+              <w:jc w:val="left"/>
+              <w:rPr>
+                <w:rFonts w:ascii="Times New Roman" w:cs="Times New Roman" w:eastAsia="Times New Roman" w:hAnsi="Times New Roman"/>
+                <w:sz w:val="16"/>
+                <w:szCs w:val="16"/>
+              </w:rPr>
+            </w:pPr>
+            <w:r>
+              <w:rPr>
+                <w:rFonts w:ascii="Times New Roman" w:cs="Times New Roman" w:eastAsia="Times New Roman" w:hAnsi="Times New Roman"/>
+                <w:sz w:val="16"/>
+                <w:szCs w:val="16"/>
+                <w:rtl w:val="0"/>
+              </w:rPr>
+              <w:t xml:space="preserve">$9.11</w:t>
+            </w:r>
+          </w:p>
+        </w:tc>
+        <w:tc>
+          <w:tcPr>
+            <w:shd w:fill="auto" w:val="clear"/>
+            <w:tcMar>
+              <w:top w:w="100.0" w:type="dxa"/>
+              <w:left w:w="100.0" w:type="dxa"/>
+              <w:bottom w:w="100.0" w:type="dxa"/>
+              <w:right w:w="100.0" w:type="dxa"/>
+            </w:tcMar>
+            <w:vAlign w:val="top"/>
+          </w:tcPr>
+          <w:p>
+            <w:pPr>
+              <w:jc w:val="left"/>
+              <w:rPr>
+                <w:rFonts w:ascii="Times New Roman" w:cs="Times New Roman" w:eastAsia="Times New Roman" w:hAnsi="Times New Roman"/>
+                <w:sz w:val="16"/>
+                <w:szCs w:val="16"/>
+              </w:rPr>
+            </w:pPr>
+            <w:r>
+              <w:rPr>
+                <w:rFonts w:ascii="Times New Roman" w:cs="Times New Roman" w:eastAsia="Times New Roman" w:hAnsi="Times New Roman"/>
+                <w:sz w:val="16"/>
+                <w:szCs w:val="16"/>
+                <w:rtl w:val="0"/>
+              </w:rPr>
+              <w:t xml:space="preserve">$0.01002</w:t>
+            </w:r>
+          </w:p>
+        </w:tc>
+        <w:tc>
+          <w:tcPr>
+            <w:shd w:fill="auto" w:val="clear"/>
+            <w:tcMar>
+              <w:top w:w="100.0" w:type="dxa"/>
+              <w:left w:w="100.0" w:type="dxa"/>
+              <w:bottom w:w="100.0" w:type="dxa"/>
+              <w:right w:w="100.0" w:type="dxa"/>
+            </w:tcMar>
+            <w:vAlign w:val="top"/>
+          </w:tcPr>
+          <w:p>
+            <w:pPr>
+              <w:jc w:val="left"/>
+              <w:rPr>
+                <w:rFonts w:ascii="Times New Roman" w:cs="Times New Roman" w:eastAsia="Times New Roman" w:hAnsi="Times New Roman"/>
+                <w:sz w:val="16"/>
+                <w:szCs w:val="16"/>
+              </w:rPr>
+            </w:pPr>
+            <w:r>
+              <w:rPr>
+                <w:rFonts w:ascii="Times New Roman" w:cs="Times New Roman" w:eastAsia="Times New Roman" w:hAnsi="Times New Roman"/>
+                <w:sz w:val="16"/>
+                <w:szCs w:val="16"/>
+                <w:rtl w:val="0"/>
+              </w:rPr>
+              <w:t xml:space="preserve">7.3s</w:t>
+            </w:r>
+          </w:p>
+        </w:tc>
+        <w:tc>
+          <w:tcPr>
+            <w:shd w:fill="auto" w:val="clear"/>
+            <w:tcMar>
+              <w:top w:w="100.0" w:type="dxa"/>
+              <w:left w:w="100.0" w:type="dxa"/>
+              <w:bottom w:w="100.0" w:type="dxa"/>
+              <w:right w:w="100.0" w:type="dxa"/>
+            </w:tcMar>
+            <w:vAlign w:val="top"/>
+          </w:tcPr>
+          <w:p>
+            <w:pPr>
+              <w:jc w:val="left"/>
+              <w:rPr>
+                <w:rFonts w:ascii="Times New Roman" w:cs="Times New Roman" w:eastAsia="Times New Roman" w:hAnsi="Times New Roman"/>
+                <w:sz w:val="16"/>
+                <w:szCs w:val="16"/>
+              </w:rPr>
+            </w:pPr>
+            <w:r>
+              <w:rPr>
+                <w:rFonts w:ascii="Times New Roman" w:cs="Times New Roman" w:eastAsia="Times New Roman" w:hAnsi="Times New Roman"/>
+                <w:sz w:val="16"/>
+                <w:szCs w:val="16"/>
+                <w:rtl w:val="0"/>
+              </w:rPr>
+              <w:t xml:space="preserve">11.1s</w:t>
+            </w:r>
+          </w:p>
+        </w:tc>
+      </w:tr>
+      <w:tr>
+        <w:tc>
+          <w:tcPr>
+            <w:shd w:fill="auto" w:val="clear"/>
+            <w:tcMar>
+              <w:top w:w="100.0" w:type="dxa"/>
+              <w:left w:w="100.0" w:type="dxa"/>
+              <w:bottom w:w="100.0" w:type="dxa"/>
+              <w:right w:w="100.0" w:type="dxa"/>
+            </w:tcMar>
+            <w:vAlign w:val="top"/>
+          </w:tcPr>
+          <w:p>
+            <w:pPr>
+              <w:jc w:val="left"/>
+              <w:rPr>
+                <w:rFonts w:ascii="Times New Roman" w:cs="Times New Roman" w:eastAsia="Times New Roman" w:hAnsi="Times New Roman"/>
+                <w:sz w:val="16"/>
+                <w:szCs w:val="16"/>
+              </w:rPr>
+            </w:pPr>
+            <w:r>
+              <w:rPr>
+                <w:rFonts w:ascii="Times New Roman" w:cs="Times New Roman" w:eastAsia="Times New Roman" w:hAnsi="Times New Roman"/>
+                <w:sz w:val="16"/>
+                <w:szCs w:val="16"/>
+                <w:rtl w:val="0"/>
+              </w:rPr>
+              <w:t xml:space="preserve"/>
+            </w:r>
+          </w:p>
+        </w:tc>
+        <w:tc>
+          <w:tcPr>
+            <w:shd w:fill="auto" w:val="clear"/>
+            <w:tcMar>
+              <w:top w:w="100.0" w:type="dxa"/>
+              <w:left w:w="100.0" w:type="dxa"/>
+              <w:bottom w:w="100.0" w:type="dxa"/>
+              <w:right w:w="100.0" w:type="dxa"/>
+            </w:tcMar>
+            <w:vAlign w:val="top"/>
+          </w:tcPr>
+          <w:p>
+            <w:pPr>
+              <w:jc w:val="left"/>
+              <w:rPr>
+                <w:rFonts w:ascii="Times New Roman" w:cs="Times New Roman" w:eastAsia="Times New Roman" w:hAnsi="Times New Roman"/>
+                <w:sz w:val="16"/>
+                <w:szCs w:val="16"/>
+              </w:rPr>
+            </w:pPr>
+            <w:r>
+              <w:rPr>
+                <w:rFonts w:ascii="Times New Roman" w:cs="Times New Roman" w:eastAsia="Times New Roman" w:hAnsi="Times New Roman"/>
+                <w:sz w:val="16"/>
+                <w:szCs w:val="16"/>
+                <w:rtl w:val="0"/>
+              </w:rPr>
+              <w:t xml:space="preserve">C</w:t>
+            </w:r>
+          </w:p>
+        </w:tc>
+        <w:tc>
+          <w:tcPr>
+            <w:shd w:fill="auto" w:val="clear"/>
+            <w:tcMar>
+              <w:top w:w="100.0" w:type="dxa"/>
+              <w:left w:w="100.0" w:type="dxa"/>
+              <w:bottom w:w="100.0" w:type="dxa"/>
+              <w:right w:w="100.0" w:type="dxa"/>
+            </w:tcMar>
+            <w:vAlign w:val="top"/>
+          </w:tcPr>
+          <w:p>
+            <w:pPr>
+              <w:jc w:val="left"/>
+              <w:rPr>
+                <w:rFonts w:ascii="Times New Roman" w:cs="Times New Roman" w:eastAsia="Times New Roman" w:hAnsi="Times New Roman"/>
+                <w:sz w:val="16"/>
+                <w:szCs w:val="16"/>
+              </w:rPr>
+            </w:pPr>
+            <w:r>
+              <w:rPr>
+                <w:rFonts w:ascii="Times New Roman" w:cs="Times New Roman" w:eastAsia="Times New Roman" w:hAnsi="Times New Roman"/>
+                <w:sz w:val="16"/>
+                <w:szCs w:val="16"/>
+                <w:rtl w:val="0"/>
+              </w:rPr>
+              <w:t xml:space="preserve">147</w:t>
+            </w:r>
+          </w:p>
+        </w:tc>
+        <w:tc>
+          <w:tcPr>
+            <w:shd w:fill="auto" w:val="clear"/>
+            <w:tcMar>
+              <w:top w:w="100.0" w:type="dxa"/>
+              <w:left w:w="100.0" w:type="dxa"/>
+              <w:bottom w:w="100.0" w:type="dxa"/>
+              <w:right w:w="100.0" w:type="dxa"/>
+            </w:tcMar>
+            <w:vAlign w:val="top"/>
+          </w:tcPr>
+          <w:p>
+            <w:pPr>
+              <w:jc w:val="left"/>
+              <w:rPr>
+                <w:rFonts w:ascii="Times New Roman" w:cs="Times New Roman" w:eastAsia="Times New Roman" w:hAnsi="Times New Roman"/>
+                <w:sz w:val="16"/>
+                <w:szCs w:val="16"/>
+              </w:rPr>
+            </w:pPr>
+            <w:r>
+              <w:rPr>
+                <w:rFonts w:ascii="Times New Roman" w:cs="Times New Roman" w:eastAsia="Times New Roman" w:hAnsi="Times New Roman"/>
+                <w:sz w:val="16"/>
+                <w:szCs w:val="16"/>
+                <w:rtl w:val="0"/>
+              </w:rPr>
+              <w:t xml:space="preserve">$1.81</w:t>
+            </w:r>
+          </w:p>
+        </w:tc>
+        <w:tc>
+          <w:tcPr>
+            <w:shd w:fill="auto" w:val="clear"/>
+            <w:tcMar>
+              <w:top w:w="100.0" w:type="dxa"/>
+              <w:left w:w="100.0" w:type="dxa"/>
+              <w:bottom w:w="100.0" w:type="dxa"/>
+              <w:right w:w="100.0" w:type="dxa"/>
+            </w:tcMar>
+            <w:vAlign w:val="top"/>
+          </w:tcPr>
+          <w:p>
+            <w:pPr>
+              <w:jc w:val="left"/>
+              <w:rPr>
+                <w:rFonts w:ascii="Times New Roman" w:cs="Times New Roman" w:eastAsia="Times New Roman" w:hAnsi="Times New Roman"/>
+                <w:sz w:val="16"/>
+                <w:szCs w:val="16"/>
+              </w:rPr>
+            </w:pPr>
+            <w:r>
+              <w:rPr>
+                <w:rFonts w:ascii="Times New Roman" w:cs="Times New Roman" w:eastAsia="Times New Roman" w:hAnsi="Times New Roman"/>
+                <w:sz w:val="16"/>
+                <w:szCs w:val="16"/>
+                <w:rtl w:val="0"/>
+              </w:rPr>
+              <w:t xml:space="preserve">$0.01233</w:t>
+            </w:r>
+          </w:p>
+        </w:tc>
+        <w:tc>
+          <w:tcPr>
+            <w:shd w:fill="auto" w:val="clear"/>
+            <w:tcMar>
+              <w:top w:w="100.0" w:type="dxa"/>
+              <w:left w:w="100.0" w:type="dxa"/>
+              <w:bottom w:w="100.0" w:type="dxa"/>
+              <w:right w:w="100.0" w:type="dxa"/>
+            </w:tcMar>
+            <w:vAlign w:val="top"/>
+          </w:tcPr>
+          <w:p>
+            <w:pPr>
+              <w:jc w:val="left"/>
+              <w:rPr>
+                <w:rFonts w:ascii="Times New Roman" w:cs="Times New Roman" w:eastAsia="Times New Roman" w:hAnsi="Times New Roman"/>
+                <w:sz w:val="16"/>
+                <w:szCs w:val="16"/>
+              </w:rPr>
+            </w:pPr>
+            <w:r>
+              <w:rPr>
+                <w:rFonts w:ascii="Times New Roman" w:cs="Times New Roman" w:eastAsia="Times New Roman" w:hAnsi="Times New Roman"/>
+                <w:sz w:val="16"/>
+                <w:szCs w:val="16"/>
+                <w:rtl w:val="0"/>
+              </w:rPr>
+              <w:t xml:space="preserve">9.6s</w:t>
+            </w:r>
+          </w:p>
+        </w:tc>
+        <w:tc>
+          <w:tcPr>
+            <w:shd w:fill="auto" w:val="clear"/>
+            <w:tcMar>
+              <w:top w:w="100.0" w:type="dxa"/>
+              <w:left w:w="100.0" w:type="dxa"/>
+              <w:bottom w:w="100.0" w:type="dxa"/>
+              <w:right w:w="100.0" w:type="dxa"/>
+            </w:tcMar>
+            <w:vAlign w:val="top"/>
+          </w:tcPr>
+          <w:p>
+            <w:pPr>
+              <w:jc w:val="left"/>
+              <w:rPr>
+                <w:rFonts w:ascii="Times New Roman" w:cs="Times New Roman" w:eastAsia="Times New Roman" w:hAnsi="Times New Roman"/>
+                <w:sz w:val="16"/>
+                <w:szCs w:val="16"/>
+              </w:rPr>
+            </w:pPr>
+            <w:r>
+              <w:rPr>
+                <w:rFonts w:ascii="Times New Roman" w:cs="Times New Roman" w:eastAsia="Times New Roman" w:hAnsi="Times New Roman"/>
+                <w:sz w:val="16"/>
+                <w:szCs w:val="16"/>
+                <w:rtl w:val="0"/>
+              </w:rPr>
+              <w:t xml:space="preserve">13.1s</w:t>
+            </w:r>
+          </w:p>
+        </w:tc>
+      </w:tr>
+      <w:tr>
+        <w:tc>
+          <w:tcPr>
+            <w:shd w:fill="auto" w:val="clear"/>
+            <w:tcMar>
+              <w:top w:w="100.0" w:type="dxa"/>
+              <w:left w:w="100.0" w:type="dxa"/>
+              <w:bottom w:w="100.0" w:type="dxa"/>
+              <w:right w:w="100.0" w:type="dxa"/>
+            </w:tcMar>
+            <w:vAlign w:val="top"/>
+          </w:tcPr>
+          <w:p>
+            <w:pPr>
+              <w:jc w:val="left"/>
+              <w:rPr>
+                <w:rFonts w:ascii="Times New Roman" w:cs="Times New Roman" w:eastAsia="Times New Roman" w:hAnsi="Times New Roman"/>
+                <w:sz w:val="16"/>
+                <w:szCs w:val="16"/>
+              </w:rPr>
+            </w:pPr>
+            <w:r>
+              <w:rPr>
+                <w:rFonts w:ascii="Times New Roman" w:cs="Times New Roman" w:eastAsia="Times New Roman" w:hAnsi="Times New Roman"/>
+                <w:sz w:val="16"/>
+                <w:szCs w:val="16"/>
+                <w:rtl w:val="0"/>
+              </w:rPr>
+              <w:t xml:space="preserve"/>
+            </w:r>
+          </w:p>
+        </w:tc>
+        <w:tc>
+          <w:tcPr>
+            <w:shd w:fill="auto" w:val="clear"/>
+            <w:tcMar>
+              <w:top w:w="100.0" w:type="dxa"/>
+              <w:left w:w="100.0" w:type="dxa"/>
+              <w:bottom w:w="100.0" w:type="dxa"/>
+              <w:right w:w="100.0" w:type="dxa"/>
+            </w:tcMar>
+            <w:vAlign w:val="top"/>
+          </w:tcPr>
+          <w:p>
+            <w:pPr>
+              <w:jc w:val="left"/>
+              <w:rPr>
+                <w:rFonts w:ascii="Times New Roman" w:cs="Times New Roman" w:eastAsia="Times New Roman" w:hAnsi="Times New Roman"/>
+                <w:sz w:val="16"/>
+                <w:szCs w:val="16"/>
+              </w:rPr>
+            </w:pPr>
+            <w:r>
+              <w:rPr>
+                <w:rFonts w:ascii="Times New Roman" w:cs="Times New Roman" w:eastAsia="Times New Roman" w:hAnsi="Times New Roman"/>
+                <w:sz w:val="16"/>
+                <w:szCs w:val="16"/>
+                <w:rtl w:val="0"/>
+              </w:rPr>
+              <w:t xml:space="preserve">D</w:t>
+            </w:r>
+          </w:p>
+        </w:tc>
+        <w:tc>
+          <w:tcPr>
+            <w:shd w:fill="auto" w:val="clear"/>
+            <w:tcMar>
+              <w:top w:w="100.0" w:type="dxa"/>
+              <w:left w:w="100.0" w:type="dxa"/>
+              <w:bottom w:w="100.0" w:type="dxa"/>
+              <w:right w:w="100.0" w:type="dxa"/>
+            </w:tcMar>
+            <w:vAlign w:val="top"/>
+          </w:tcPr>
+          <w:p>
+            <w:pPr>
+              <w:jc w:val="left"/>
+              <w:rPr>
+                <w:rFonts w:ascii="Times New Roman" w:cs="Times New Roman" w:eastAsia="Times New Roman" w:hAnsi="Times New Roman"/>
+                <w:sz w:val="16"/>
+                <w:szCs w:val="16"/>
+              </w:rPr>
+            </w:pPr>
+            <w:r>
+              <w:rPr>
+                <w:rFonts w:ascii="Times New Roman" w:cs="Times New Roman" w:eastAsia="Times New Roman" w:hAnsi="Times New Roman"/>
+                <w:sz w:val="16"/>
+                <w:szCs w:val="16"/>
+                <w:rtl w:val="0"/>
+              </w:rPr>
+              <w:t xml:space="preserve">147</w:t>
+            </w:r>
+          </w:p>
+        </w:tc>
+        <w:tc>
+          <w:tcPr>
+            <w:shd w:fill="auto" w:val="clear"/>
+            <w:tcMar>
+              <w:top w:w="100.0" w:type="dxa"/>
+              <w:left w:w="100.0" w:type="dxa"/>
+              <w:bottom w:w="100.0" w:type="dxa"/>
+              <w:right w:w="100.0" w:type="dxa"/>
+            </w:tcMar>
+            <w:vAlign w:val="top"/>
+          </w:tcPr>
+          <w:p>
+            <w:pPr>
+              <w:jc w:val="left"/>
+              <w:rPr>
+                <w:rFonts w:ascii="Times New Roman" w:cs="Times New Roman" w:eastAsia="Times New Roman" w:hAnsi="Times New Roman"/>
+                <w:sz w:val="16"/>
+                <w:szCs w:val="16"/>
+              </w:rPr>
+            </w:pPr>
+            <w:r>
+              <w:rPr>
+                <w:rFonts w:ascii="Times New Roman" w:cs="Times New Roman" w:eastAsia="Times New Roman" w:hAnsi="Times New Roman"/>
+                <w:sz w:val="16"/>
+                <w:szCs w:val="16"/>
+                <w:rtl w:val="0"/>
+              </w:rPr>
+              <w:t xml:space="preserve">$1.83</w:t>
+            </w:r>
+          </w:p>
+        </w:tc>
+        <w:tc>
+          <w:tcPr>
+            <w:shd w:fill="auto" w:val="clear"/>
+            <w:tcMar>
+              <w:top w:w="100.0" w:type="dxa"/>
+              <w:left w:w="100.0" w:type="dxa"/>
+              <w:bottom w:w="100.0" w:type="dxa"/>
+              <w:right w:w="100.0" w:type="dxa"/>
+            </w:tcMar>
+            <w:vAlign w:val="top"/>
+          </w:tcPr>
+          <w:p>
+            <w:pPr>
+              <w:jc w:val="left"/>
+              <w:rPr>
+                <w:rFonts w:ascii="Times New Roman" w:cs="Times New Roman" w:eastAsia="Times New Roman" w:hAnsi="Times New Roman"/>
+                <w:sz w:val="16"/>
+                <w:szCs w:val="16"/>
+              </w:rPr>
+            </w:pPr>
+            <w:r>
+              <w:rPr>
+                <w:rFonts w:ascii="Times New Roman" w:cs="Times New Roman" w:eastAsia="Times New Roman" w:hAnsi="Times New Roman"/>
+                <w:sz w:val="16"/>
+                <w:szCs w:val="16"/>
+                <w:rtl w:val="0"/>
+              </w:rPr>
+              <w:t xml:space="preserve">$0.01243</w:t>
+            </w:r>
+          </w:p>
+        </w:tc>
+        <w:tc>
+          <w:tcPr>
+            <w:shd w:fill="auto" w:val="clear"/>
+            <w:tcMar>
+              <w:top w:w="100.0" w:type="dxa"/>
+              <w:left w:w="100.0" w:type="dxa"/>
+              <w:bottom w:w="100.0" w:type="dxa"/>
+              <w:right w:w="100.0" w:type="dxa"/>
+            </w:tcMar>
+            <w:vAlign w:val="top"/>
+          </w:tcPr>
+          <w:p>
+            <w:pPr>
+              <w:jc w:val="left"/>
+              <w:rPr>
+                <w:rFonts w:ascii="Times New Roman" w:cs="Times New Roman" w:eastAsia="Times New Roman" w:hAnsi="Times New Roman"/>
+                <w:sz w:val="16"/>
+                <w:szCs w:val="16"/>
+              </w:rPr>
+            </w:pPr>
+            <w:r>
+              <w:rPr>
+                <w:rFonts w:ascii="Times New Roman" w:cs="Times New Roman" w:eastAsia="Times New Roman" w:hAnsi="Times New Roman"/>
+                <w:sz w:val="16"/>
+                <w:szCs w:val="16"/>
+                <w:rtl w:val="0"/>
+              </w:rPr>
+              <w:t xml:space="preserve">9.6s</w:t>
+            </w:r>
+          </w:p>
+        </w:tc>
+        <w:tc>
+          <w:tcPr>
+            <w:shd w:fill="auto" w:val="clear"/>
+            <w:tcMar>
+              <w:top w:w="100.0" w:type="dxa"/>
+              <w:left w:w="100.0" w:type="dxa"/>
+              <w:bottom w:w="100.0" w:type="dxa"/>
+              <w:right w:w="100.0" w:type="dxa"/>
+            </w:tcMar>
+            <w:vAlign w:val="top"/>
+          </w:tcPr>
+          <w:p>
+            <w:pPr>
+              <w:jc w:val="left"/>
+              <w:rPr>
+                <w:rFonts w:ascii="Times New Roman" w:cs="Times New Roman" w:eastAsia="Times New Roman" w:hAnsi="Times New Roman"/>
+                <w:sz w:val="16"/>
+                <w:szCs w:val="16"/>
+              </w:rPr>
+            </w:pPr>
+            <w:r>
+              <w:rPr>
+                <w:rFonts w:ascii="Times New Roman" w:cs="Times New Roman" w:eastAsia="Times New Roman" w:hAnsi="Times New Roman"/>
+                <w:sz w:val="16"/>
+                <w:szCs w:val="16"/>
+                <w:rtl w:val="0"/>
+              </w:rPr>
+              <w:t xml:space="preserve">13.6s</w:t>
+            </w:r>
+          </w:p>
+        </w:tc>
+      </w:tr>
+      <w:tr>
+        <w:tc>
+          <w:tcPr>
+            <w:shd w:fill="auto" w:val="clear"/>
+            <w:tcMar>
+              <w:top w:w="100.0" w:type="dxa"/>
+              <w:left w:w="100.0" w:type="dxa"/>
+              <w:bottom w:w="100.0" w:type="dxa"/>
+              <w:right w:w="100.0" w:type="dxa"/>
+            </w:tcMar>
+            <w:vAlign w:val="top"/>
+          </w:tcPr>
+          <w:p>
+            <w:pPr>
+              <w:jc w:val="left"/>
+              <w:rPr>
+                <w:rFonts w:ascii="Times New Roman" w:cs="Times New Roman" w:eastAsia="Times New Roman" w:hAnsi="Times New Roman"/>
+                <w:sz w:val="16"/>
+                <w:szCs w:val="16"/>
+              </w:rPr>
+            </w:pPr>
+            <w:r>
+              <w:rPr>
+                <w:rFonts w:ascii="Times New Roman" w:cs="Times New Roman" w:eastAsia="Times New Roman" w:hAnsi="Times New Roman"/>
+                <w:sz w:val="16"/>
+                <w:szCs w:val="16"/>
+                <w:rtl w:val="0"/>
+              </w:rPr>
+              <w:t xml:space="preserve">Gemini 3.6 Flash</w:t>
+            </w:r>
+          </w:p>
+        </w:tc>
+        <w:tc>
+          <w:tcPr>
+            <w:shd w:fill="auto" w:val="clear"/>
+            <w:tcMar>
+              <w:top w:w="100.0" w:type="dxa"/>
+              <w:left w:w="100.0" w:type="dxa"/>
+              <w:bottom w:w="100.0" w:type="dxa"/>
+              <w:right w:w="100.0" w:type="dxa"/>
+            </w:tcMar>
+            <w:vAlign w:val="top"/>
+          </w:tcPr>
+          <w:p>
+            <w:pPr>
+              <w:jc w:val="left"/>
+              <w:rPr>
+                <w:rFonts w:ascii="Times New Roman" w:cs="Times New Roman" w:eastAsia="Times New Roman" w:hAnsi="Times New Roman"/>
+                <w:sz w:val="16"/>
+                <w:szCs w:val="16"/>
+              </w:rPr>
+            </w:pPr>
+            <w:r>
+              <w:rPr>
+                <w:rFonts w:ascii="Times New Roman" w:cs="Times New Roman" w:eastAsia="Times New Roman" w:hAnsi="Times New Roman"/>
+                <w:sz w:val="16"/>
+                <w:szCs w:val="16"/>
+                <w:rtl w:val="0"/>
+              </w:rPr>
+              <w:t xml:space="preserve">A</w:t>
+            </w:r>
+          </w:p>
+        </w:tc>
+        <w:tc>
+          <w:tcPr>
+            <w:shd w:fill="auto" w:val="clear"/>
+            <w:tcMar>
+              <w:top w:w="100.0" w:type="dxa"/>
+              <w:left w:w="100.0" w:type="dxa"/>
+              <w:bottom w:w="100.0" w:type="dxa"/>
+              <w:right w:w="100.0" w:type="dxa"/>
+            </w:tcMar>
+            <w:vAlign w:val="top"/>
+          </w:tcPr>
+          <w:p>
+            <w:pPr>
+              <w:jc w:val="left"/>
+              <w:rPr>
+                <w:rFonts w:ascii="Times New Roman" w:cs="Times New Roman" w:eastAsia="Times New Roman" w:hAnsi="Times New Roman"/>
+                <w:sz w:val="16"/>
+                <w:szCs w:val="16"/>
+              </w:rPr>
+            </w:pPr>
+            <w:r>
+              <w:rPr>
+                <w:rFonts w:ascii="Times New Roman" w:cs="Times New Roman" w:eastAsia="Times New Roman" w:hAnsi="Times New Roman"/>
+                <w:sz w:val="16"/>
+                <w:szCs w:val="16"/>
+                <w:rtl w:val="0"/>
+              </w:rPr>
+              <w:t xml:space="preserve">909</w:t>
+            </w:r>
+          </w:p>
+        </w:tc>
+        <w:tc>
+          <w:tcPr>
+            <w:shd w:fill="auto" w:val="clear"/>
+            <w:tcMar>
+              <w:top w:w="100.0" w:type="dxa"/>
+              <w:left w:w="100.0" w:type="dxa"/>
+              <w:bottom w:w="100.0" w:type="dxa"/>
+              <w:right w:w="100.0" w:type="dxa"/>
+            </w:tcMar>
+            <w:vAlign w:val="top"/>
+          </w:tcPr>
+          <w:p>
+            <w:pPr>
+              <w:jc w:val="left"/>
+              <w:rPr>
+                <w:rFonts w:ascii="Times New Roman" w:cs="Times New Roman" w:eastAsia="Times New Roman" w:hAnsi="Times New Roman"/>
+                <w:sz w:val="16"/>
+                <w:szCs w:val="16"/>
+              </w:rPr>
+            </w:pPr>
+            <w:r>
+              <w:rPr>
+                <w:rFonts w:ascii="Times New Roman" w:cs="Times New Roman" w:eastAsia="Times New Roman" w:hAnsi="Times New Roman"/>
+                <w:sz w:val="16"/>
+                <w:szCs w:val="16"/>
+                <w:rtl w:val="0"/>
+              </w:rPr>
+              <w:t xml:space="preserve">$1.11</w:t>
+            </w:r>
+          </w:p>
+        </w:tc>
+        <w:tc>
+          <w:tcPr>
+            <w:shd w:fill="auto" w:val="clear"/>
+            <w:tcMar>
+              <w:top w:w="100.0" w:type="dxa"/>
+              <w:left w:w="100.0" w:type="dxa"/>
+              <w:bottom w:w="100.0" w:type="dxa"/>
+              <w:right w:w="100.0" w:type="dxa"/>
+            </w:tcMar>
+            <w:vAlign w:val="top"/>
+          </w:tcPr>
+          <w:p>
+            <w:pPr>
+              <w:jc w:val="left"/>
+              <w:rPr>
+                <w:rFonts w:ascii="Times New Roman" w:cs="Times New Roman" w:eastAsia="Times New Roman" w:hAnsi="Times New Roman"/>
+                <w:sz w:val="16"/>
+                <w:szCs w:val="16"/>
+              </w:rPr>
+            </w:pPr>
+            <w:r>
+              <w:rPr>
+                <w:rFonts w:ascii="Times New Roman" w:cs="Times New Roman" w:eastAsia="Times New Roman" w:hAnsi="Times New Roman"/>
+                <w:sz w:val="16"/>
+                <w:szCs w:val="16"/>
+                <w:rtl w:val="0"/>
+              </w:rPr>
+              <w:t xml:space="preserve">$0.00122</w:t>
+            </w:r>
+          </w:p>
+        </w:tc>
+        <w:tc>
+          <w:tcPr>
+            <w:shd w:fill="auto" w:val="clear"/>
+            <w:tcMar>
+              <w:top w:w="100.0" w:type="dxa"/>
+              <w:left w:w="100.0" w:type="dxa"/>
+              <w:bottom w:w="100.0" w:type="dxa"/>
+              <w:right w:w="100.0" w:type="dxa"/>
+            </w:tcMar>
+            <w:vAlign w:val="top"/>
+          </w:tcPr>
+          <w:p>
+            <w:pPr>
+              <w:jc w:val="left"/>
+              <w:rPr>
+                <w:rFonts w:ascii="Times New Roman" w:cs="Times New Roman" w:eastAsia="Times New Roman" w:hAnsi="Times New Roman"/>
+                <w:sz w:val="16"/>
+                <w:szCs w:val="16"/>
+              </w:rPr>
+            </w:pPr>
+            <w:r>
+              <w:rPr>
+                <w:rFonts w:ascii="Times New Roman" w:cs="Times New Roman" w:eastAsia="Times New Roman" w:hAnsi="Times New Roman"/>
+                <w:sz w:val="16"/>
+                <w:szCs w:val="16"/>
+                <w:rtl w:val="0"/>
+              </w:rPr>
+              <w:t xml:space="preserve">8.7s</w:t>
+            </w:r>
+          </w:p>
+        </w:tc>
+        <w:tc>
+          <w:tcPr>
+            <w:shd w:fill="auto" w:val="clear"/>
+            <w:tcMar>
+              <w:top w:w="100.0" w:type="dxa"/>
+              <w:left w:w="100.0" w:type="dxa"/>
+              <w:bottom w:w="100.0" w:type="dxa"/>
+              <w:right w:w="100.0" w:type="dxa"/>
+            </w:tcMar>
+            <w:vAlign w:val="top"/>
+          </w:tcPr>
+          <w:p>
+            <w:pPr>
+              <w:jc w:val="left"/>
+              <w:rPr>
+                <w:rFonts w:ascii="Times New Roman" w:cs="Times New Roman" w:eastAsia="Times New Roman" w:hAnsi="Times New Roman"/>
+                <w:sz w:val="16"/>
+                <w:szCs w:val="16"/>
+              </w:rPr>
+            </w:pPr>
+            <w:r>
+              <w:rPr>
+                <w:rFonts w:ascii="Times New Roman" w:cs="Times New Roman" w:eastAsia="Times New Roman" w:hAnsi="Times New Roman"/>
+                <w:sz w:val="16"/>
+                <w:szCs w:val="16"/>
+                <w:rtl w:val="0"/>
+              </w:rPr>
+              <w:t xml:space="preserve">25.5s</w:t>
+            </w:r>
+          </w:p>
+        </w:tc>
+      </w:tr>
+      <w:tr>
+        <w:tc>
+          <w:tcPr>
+            <w:shd w:fill="auto" w:val="clear"/>
+            <w:tcMar>
+              <w:top w:w="100.0" w:type="dxa"/>
+              <w:left w:w="100.0" w:type="dxa"/>
+              <w:bottom w:w="100.0" w:type="dxa"/>
+              <w:right w:w="100.0" w:type="dxa"/>
+            </w:tcMar>
+            <w:vAlign w:val="top"/>
+          </w:tcPr>
+          <w:p>
+            <w:pPr>
+              <w:jc w:val="left"/>
+              <w:rPr>
+                <w:rFonts w:ascii="Times New Roman" w:cs="Times New Roman" w:eastAsia="Times New Roman" w:hAnsi="Times New Roman"/>
+                <w:sz w:val="16"/>
+                <w:szCs w:val="16"/>
+              </w:rPr>
+            </w:pPr>
+            <w:r>
+              <w:rPr>
+                <w:rFonts w:ascii="Times New Roman" w:cs="Times New Roman" w:eastAsia="Times New Roman" w:hAnsi="Times New Roman"/>
+                <w:sz w:val="16"/>
+                <w:szCs w:val="16"/>
+                <w:rtl w:val="0"/>
+              </w:rPr>
+              <w:t xml:space="preserve"/>
+            </w:r>
+          </w:p>
+        </w:tc>
+        <w:tc>
+          <w:tcPr>
+            <w:shd w:fill="auto" w:val="clear"/>
+            <w:tcMar>
+              <w:top w:w="100.0" w:type="dxa"/>
+              <w:left w:w="100.0" w:type="dxa"/>
+              <w:bottom w:w="100.0" w:type="dxa"/>
+              <w:right w:w="100.0" w:type="dxa"/>
+            </w:tcMar>
+            <w:vAlign w:val="top"/>
+          </w:tcPr>
+          <w:p>
+            <w:pPr>
+              <w:jc w:val="left"/>
+              <w:rPr>
+                <w:rFonts w:ascii="Times New Roman" w:cs="Times New Roman" w:eastAsia="Times New Roman" w:hAnsi="Times New Roman"/>
+                <w:sz w:val="16"/>
+                <w:szCs w:val="16"/>
+              </w:rPr>
+            </w:pPr>
+            <w:r>
+              <w:rPr>
+                <w:rFonts w:ascii="Times New Roman" w:cs="Times New Roman" w:eastAsia="Times New Roman" w:hAnsi="Times New Roman"/>
+                <w:sz w:val="16"/>
+                <w:szCs w:val="16"/>
+                <w:rtl w:val="0"/>
+              </w:rPr>
+              <w:t xml:space="preserve">B</w:t>
+            </w:r>
+          </w:p>
+        </w:tc>
+        <w:tc>
+          <w:tcPr>
+            <w:shd w:fill="auto" w:val="clear"/>
+            <w:tcMar>
+              <w:top w:w="100.0" w:type="dxa"/>
+              <w:left w:w="100.0" w:type="dxa"/>
+              <w:bottom w:w="100.0" w:type="dxa"/>
+              <w:right w:w="100.0" w:type="dxa"/>
+            </w:tcMar>
+            <w:vAlign w:val="top"/>
+          </w:tcPr>
+          <w:p>
+            <w:pPr>
+              <w:jc w:val="left"/>
+              <w:rPr>
+                <w:rFonts w:ascii="Times New Roman" w:cs="Times New Roman" w:eastAsia="Times New Roman" w:hAnsi="Times New Roman"/>
+                <w:sz w:val="16"/>
+                <w:szCs w:val="16"/>
+              </w:rPr>
+            </w:pPr>
+            <w:r>
+              <w:rPr>
+                <w:rFonts w:ascii="Times New Roman" w:cs="Times New Roman" w:eastAsia="Times New Roman" w:hAnsi="Times New Roman"/>
+                <w:sz w:val="16"/>
+                <w:szCs w:val="16"/>
+                <w:rtl w:val="0"/>
+              </w:rPr>
+              <w:t xml:space="preserve">909</w:t>
+            </w:r>
+          </w:p>
+        </w:tc>
+        <w:tc>
+          <w:tcPr>
+            <w:shd w:fill="auto" w:val="clear"/>
+            <w:tcMar>
+              <w:top w:w="100.0" w:type="dxa"/>
+              <w:left w:w="100.0" w:type="dxa"/>
+              <w:bottom w:w="100.0" w:type="dxa"/>
+              <w:right w:w="100.0" w:type="dxa"/>
+            </w:tcMar>
+            <w:vAlign w:val="top"/>
+          </w:tcPr>
+          <w:p>
+            <w:pPr>
+              <w:jc w:val="left"/>
+              <w:rPr>
+                <w:rFonts w:ascii="Times New Roman" w:cs="Times New Roman" w:eastAsia="Times New Roman" w:hAnsi="Times New Roman"/>
+                <w:sz w:val="16"/>
+                <w:szCs w:val="16"/>
+              </w:rPr>
+            </w:pPr>
+            <w:r>
+              <w:rPr>
+                <w:rFonts w:ascii="Times New Roman" w:cs="Times New Roman" w:eastAsia="Times New Roman" w:hAnsi="Times New Roman"/>
+                <w:sz w:val="16"/>
+                <w:szCs w:val="16"/>
+                <w:rtl w:val="0"/>
+              </w:rPr>
+              <w:t xml:space="preserve">$1.16</w:t>
+            </w:r>
+          </w:p>
+        </w:tc>
+        <w:tc>
+          <w:tcPr>
+            <w:shd w:fill="auto" w:val="clear"/>
+            <w:tcMar>
+              <w:top w:w="100.0" w:type="dxa"/>
+              <w:left w:w="100.0" w:type="dxa"/>
+              <w:bottom w:w="100.0" w:type="dxa"/>
+              <w:right w:w="100.0" w:type="dxa"/>
+            </w:tcMar>
+            <w:vAlign w:val="top"/>
+          </w:tcPr>
+          <w:p>
+            <w:pPr>
+              <w:jc w:val="left"/>
+              <w:rPr>
+                <w:rFonts w:ascii="Times New Roman" w:cs="Times New Roman" w:eastAsia="Times New Roman" w:hAnsi="Times New Roman"/>
+                <w:sz w:val="16"/>
+                <w:szCs w:val="16"/>
+              </w:rPr>
+            </w:pPr>
+            <w:r>
+              <w:rPr>
+                <w:rFonts w:ascii="Times New Roman" w:cs="Times New Roman" w:eastAsia="Times New Roman" w:hAnsi="Times New Roman"/>
+                <w:sz w:val="16"/>
+                <w:szCs w:val="16"/>
+                <w:rtl w:val="0"/>
+              </w:rPr>
+              <w:t xml:space="preserve">$0.00127</w:t>
+            </w:r>
+          </w:p>
+        </w:tc>
+        <w:tc>
+          <w:tcPr>
+            <w:shd w:fill="auto" w:val="clear"/>
+            <w:tcMar>
+              <w:top w:w="100.0" w:type="dxa"/>
+              <w:left w:w="100.0" w:type="dxa"/>
+              <w:bottom w:w="100.0" w:type="dxa"/>
+              <w:right w:w="100.0" w:type="dxa"/>
+            </w:tcMar>
+            <w:vAlign w:val="top"/>
+          </w:tcPr>
+          <w:p>
+            <w:pPr>
+              <w:jc w:val="left"/>
+              <w:rPr>
+                <w:rFonts w:ascii="Times New Roman" w:cs="Times New Roman" w:eastAsia="Times New Roman" w:hAnsi="Times New Roman"/>
+                <w:sz w:val="16"/>
+                <w:szCs w:val="16"/>
+              </w:rPr>
+            </w:pPr>
+            <w:r>
+              <w:rPr>
+                <w:rFonts w:ascii="Times New Roman" w:cs="Times New Roman" w:eastAsia="Times New Roman" w:hAnsi="Times New Roman"/>
+                <w:sz w:val="16"/>
+                <w:szCs w:val="16"/>
+                <w:rtl w:val="0"/>
+              </w:rPr>
+              <w:t xml:space="preserve">8.3s</w:t>
+            </w:r>
+          </w:p>
+        </w:tc>
+        <w:tc>
+          <w:tcPr>
+            <w:shd w:fill="auto" w:val="clear"/>
+            <w:tcMar>
+              <w:top w:w="100.0" w:type="dxa"/>
+              <w:left w:w="100.0" w:type="dxa"/>
+              <w:bottom w:w="100.0" w:type="dxa"/>
+              <w:right w:w="100.0" w:type="dxa"/>
+            </w:tcMar>
+            <w:vAlign w:val="top"/>
+          </w:tcPr>
+          <w:p>
+            <w:pPr>
+              <w:jc w:val="left"/>
+              <w:rPr>
+                <w:rFonts w:ascii="Times New Roman" w:cs="Times New Roman" w:eastAsia="Times New Roman" w:hAnsi="Times New Roman"/>
+                <w:sz w:val="16"/>
+                <w:szCs w:val="16"/>
+              </w:rPr>
+            </w:pPr>
+            <w:r>
+              <w:rPr>
+                <w:rFonts w:ascii="Times New Roman" w:cs="Times New Roman" w:eastAsia="Times New Roman" w:hAnsi="Times New Roman"/>
+                <w:sz w:val="16"/>
+                <w:szCs w:val="16"/>
+                <w:rtl w:val="0"/>
+              </w:rPr>
+              <w:t xml:space="preserve">24.4s</w:t>
+            </w:r>
+          </w:p>
+        </w:tc>
+      </w:tr>
+      <w:tr>
+        <w:tc>
+          <w:tcPr>
+            <w:shd w:fill="auto" w:val="clear"/>
+            <w:tcMar>
+              <w:top w:w="100.0" w:type="dxa"/>
+              <w:left w:w="100.0" w:type="dxa"/>
+              <w:bottom w:w="100.0" w:type="dxa"/>
+              <w:right w:w="100.0" w:type="dxa"/>
+            </w:tcMar>
+            <w:vAlign w:val="top"/>
+          </w:tcPr>
+          <w:p>
+            <w:pPr>
+              <w:jc w:val="left"/>
+              <w:rPr>
+                <w:rFonts w:ascii="Times New Roman" w:cs="Times New Roman" w:eastAsia="Times New Roman" w:hAnsi="Times New Roman"/>
+                <w:sz w:val="16"/>
+                <w:szCs w:val="16"/>
+              </w:rPr>
+            </w:pPr>
+            <w:r>
+              <w:rPr>
+                <w:rFonts w:ascii="Times New Roman" w:cs="Times New Roman" w:eastAsia="Times New Roman" w:hAnsi="Times New Roman"/>
+                <w:sz w:val="16"/>
+                <w:szCs w:val="16"/>
+                <w:rtl w:val="0"/>
+              </w:rPr>
+              <w:t xml:space="preserve"/>
+            </w:r>
+          </w:p>
+        </w:tc>
+        <w:tc>
+          <w:tcPr>
+            <w:shd w:fill="auto" w:val="clear"/>
+            <w:tcMar>
+              <w:top w:w="100.0" w:type="dxa"/>
+              <w:left w:w="100.0" w:type="dxa"/>
+              <w:bottom w:w="100.0" w:type="dxa"/>
+              <w:right w:w="100.0" w:type="dxa"/>
+            </w:tcMar>
+            <w:vAlign w:val="top"/>
+          </w:tcPr>
+          <w:p>
+            <w:pPr>
+              <w:jc w:val="left"/>
+              <w:rPr>
+                <w:rFonts w:ascii="Times New Roman" w:cs="Times New Roman" w:eastAsia="Times New Roman" w:hAnsi="Times New Roman"/>
+                <w:sz w:val="16"/>
+                <w:szCs w:val="16"/>
+              </w:rPr>
+            </w:pPr>
+            <w:r>
+              <w:rPr>
+                <w:rFonts w:ascii="Times New Roman" w:cs="Times New Roman" w:eastAsia="Times New Roman" w:hAnsi="Times New Roman"/>
+                <w:sz w:val="16"/>
+                <w:szCs w:val="16"/>
+                <w:rtl w:val="0"/>
+              </w:rPr>
+              <w:t xml:space="preserve">C</w:t>
+            </w:r>
+          </w:p>
+        </w:tc>
+        <w:tc>
+          <w:tcPr>
+            <w:shd w:fill="auto" w:val="clear"/>
+            <w:tcMar>
+              <w:top w:w="100.0" w:type="dxa"/>
+              <w:left w:w="100.0" w:type="dxa"/>
+              <w:bottom w:w="100.0" w:type="dxa"/>
+              <w:right w:w="100.0" w:type="dxa"/>
+            </w:tcMar>
+            <w:vAlign w:val="top"/>
+          </w:tcPr>
+          <w:p>
+            <w:pPr>
+              <w:jc w:val="left"/>
+              <w:rPr>
+                <w:rFonts w:ascii="Times New Roman" w:cs="Times New Roman" w:eastAsia="Times New Roman" w:hAnsi="Times New Roman"/>
+                <w:sz w:val="16"/>
+                <w:szCs w:val="16"/>
+              </w:rPr>
+            </w:pPr>
+            <w:r>
+              <w:rPr>
+                <w:rFonts w:ascii="Times New Roman" w:cs="Times New Roman" w:eastAsia="Times New Roman" w:hAnsi="Times New Roman"/>
+                <w:sz w:val="16"/>
+                <w:szCs w:val="16"/>
+                <w:rtl w:val="0"/>
+              </w:rPr>
+              <w:t xml:space="preserve">147</w:t>
+            </w:r>
+          </w:p>
+        </w:tc>
+        <w:tc>
+          <w:tcPr>
+            <w:shd w:fill="auto" w:val="clear"/>
+            <w:tcMar>
+              <w:top w:w="100.0" w:type="dxa"/>
+              <w:left w:w="100.0" w:type="dxa"/>
+              <w:bottom w:w="100.0" w:type="dxa"/>
+              <w:right w:w="100.0" w:type="dxa"/>
+            </w:tcMar>
+            <w:vAlign w:val="top"/>
+          </w:tcPr>
+          <w:p>
+            <w:pPr>
+              <w:jc w:val="left"/>
+              <w:rPr>
+                <w:rFonts w:ascii="Times New Roman" w:cs="Times New Roman" w:eastAsia="Times New Roman" w:hAnsi="Times New Roman"/>
+                <w:sz w:val="16"/>
+                <w:szCs w:val="16"/>
+              </w:rPr>
+            </w:pPr>
+            <w:r>
+              <w:rPr>
+                <w:rFonts w:ascii="Times New Roman" w:cs="Times New Roman" w:eastAsia="Times New Roman" w:hAnsi="Times New Roman"/>
+                <w:sz w:val="16"/>
+                <w:szCs w:val="16"/>
+                <w:rtl w:val="0"/>
+              </w:rPr>
+              <w:t xml:space="preserve">$0.30</w:t>
+            </w:r>
+          </w:p>
+        </w:tc>
+        <w:tc>
+          <w:tcPr>
+            <w:shd w:fill="auto" w:val="clear"/>
+            <w:tcMar>
+              <w:top w:w="100.0" w:type="dxa"/>
+              <w:left w:w="100.0" w:type="dxa"/>
+              <w:bottom w:w="100.0" w:type="dxa"/>
+              <w:right w:w="100.0" w:type="dxa"/>
+            </w:tcMar>
+            <w:vAlign w:val="top"/>
+          </w:tcPr>
+          <w:p>
+            <w:pPr>
+              <w:jc w:val="left"/>
+              <w:rPr>
+                <w:rFonts w:ascii="Times New Roman" w:cs="Times New Roman" w:eastAsia="Times New Roman" w:hAnsi="Times New Roman"/>
+                <w:sz w:val="16"/>
+                <w:szCs w:val="16"/>
+              </w:rPr>
+            </w:pPr>
+            <w:r>
+              <w:rPr>
+                <w:rFonts w:ascii="Times New Roman" w:cs="Times New Roman" w:eastAsia="Times New Roman" w:hAnsi="Times New Roman"/>
+                <w:sz w:val="16"/>
+                <w:szCs w:val="16"/>
+                <w:rtl w:val="0"/>
+              </w:rPr>
+              <w:t xml:space="preserve">$0.00205</w:t>
+            </w:r>
+          </w:p>
+        </w:tc>
+        <w:tc>
+          <w:tcPr>
+            <w:shd w:fill="auto" w:val="clear"/>
+            <w:tcMar>
+              <w:top w:w="100.0" w:type="dxa"/>
+              <w:left w:w="100.0" w:type="dxa"/>
+              <w:bottom w:w="100.0" w:type="dxa"/>
+              <w:right w:w="100.0" w:type="dxa"/>
+            </w:tcMar>
+            <w:vAlign w:val="top"/>
+          </w:tcPr>
+          <w:p>
+            <w:pPr>
+              <w:jc w:val="left"/>
+              <w:rPr>
+                <w:rFonts w:ascii="Times New Roman" w:cs="Times New Roman" w:eastAsia="Times New Roman" w:hAnsi="Times New Roman"/>
+                <w:sz w:val="16"/>
+                <w:szCs w:val="16"/>
+              </w:rPr>
+            </w:pPr>
+            <w:r>
+              <w:rPr>
+                <w:rFonts w:ascii="Times New Roman" w:cs="Times New Roman" w:eastAsia="Times New Roman" w:hAnsi="Times New Roman"/>
+                <w:sz w:val="16"/>
+                <w:szCs w:val="16"/>
+                <w:rtl w:val="0"/>
+              </w:rPr>
+              <w:t xml:space="preserve">8.2s</w:t>
+            </w:r>
+          </w:p>
+        </w:tc>
+        <w:tc>
+          <w:tcPr>
+            <w:shd w:fill="auto" w:val="clear"/>
+            <w:tcMar>
+              <w:top w:w="100.0" w:type="dxa"/>
+              <w:left w:w="100.0" w:type="dxa"/>
+              <w:bottom w:w="100.0" w:type="dxa"/>
+              <w:right w:w="100.0" w:type="dxa"/>
+            </w:tcMar>
+            <w:vAlign w:val="top"/>
+          </w:tcPr>
+          <w:p>
+            <w:pPr>
+              <w:jc w:val="left"/>
+              <w:rPr>
+                <w:rFonts w:ascii="Times New Roman" w:cs="Times New Roman" w:eastAsia="Times New Roman" w:hAnsi="Times New Roman"/>
+                <w:sz w:val="16"/>
+                <w:szCs w:val="16"/>
+              </w:rPr>
+            </w:pPr>
+            <w:r>
+              <w:rPr>
+                <w:rFonts w:ascii="Times New Roman" w:cs="Times New Roman" w:eastAsia="Times New Roman" w:hAnsi="Times New Roman"/>
+                <w:sz w:val="16"/>
+                <w:szCs w:val="16"/>
+                <w:rtl w:val="0"/>
+              </w:rPr>
+              <w:t xml:space="preserve">21.9s</w:t>
+            </w:r>
+          </w:p>
+        </w:tc>
+      </w:tr>
+      <w:tr>
+        <w:tc>
+          <w:tcPr>
+            <w:shd w:fill="auto" w:val="clear"/>
+            <w:tcMar>
+              <w:top w:w="100.0" w:type="dxa"/>
+              <w:left w:w="100.0" w:type="dxa"/>
+              <w:bottom w:w="100.0" w:type="dxa"/>
+              <w:right w:w="100.0" w:type="dxa"/>
+            </w:tcMar>
+            <w:vAlign w:val="top"/>
+          </w:tcPr>
+          <w:p>
+            <w:pPr>
+              <w:jc w:val="left"/>
+              <w:rPr>
+                <w:rFonts w:ascii="Times New Roman" w:cs="Times New Roman" w:eastAsia="Times New Roman" w:hAnsi="Times New Roman"/>
+                <w:sz w:val="16"/>
+                <w:szCs w:val="16"/>
+              </w:rPr>
+            </w:pPr>
+            <w:r>
+              <w:rPr>
+                <w:rFonts w:ascii="Times New Roman" w:cs="Times New Roman" w:eastAsia="Times New Roman" w:hAnsi="Times New Roman"/>
+                <w:sz w:val="16"/>
+                <w:szCs w:val="16"/>
+                <w:rtl w:val="0"/>
+              </w:rPr>
+              <w:t xml:space="preserve"/>
+            </w:r>
+          </w:p>
+        </w:tc>
+        <w:tc>
+          <w:tcPr>
+            <w:shd w:fill="auto" w:val="clear"/>
+            <w:tcMar>
+              <w:top w:w="100.0" w:type="dxa"/>
+              <w:left w:w="100.0" w:type="dxa"/>
+              <w:bottom w:w="100.0" w:type="dxa"/>
+              <w:right w:w="100.0" w:type="dxa"/>
+            </w:tcMar>
+            <w:vAlign w:val="top"/>
+          </w:tcPr>
+          <w:p>
+            <w:pPr>
+              <w:jc w:val="left"/>
+              <w:rPr>
+                <w:rFonts w:ascii="Times New Roman" w:cs="Times New Roman" w:eastAsia="Times New Roman" w:hAnsi="Times New Roman"/>
+                <w:sz w:val="16"/>
+                <w:szCs w:val="16"/>
+              </w:rPr>
+            </w:pPr>
+            <w:r>
+              <w:rPr>
+                <w:rFonts w:ascii="Times New Roman" w:cs="Times New Roman" w:eastAsia="Times New Roman" w:hAnsi="Times New Roman"/>
+                <w:sz w:val="16"/>
+                <w:szCs w:val="16"/>
+                <w:rtl w:val="0"/>
+              </w:rPr>
+              <w:t xml:space="preserve">D</w:t>
+            </w:r>
+          </w:p>
+        </w:tc>
+        <w:tc>
+          <w:tcPr>
+            <w:shd w:fill="auto" w:val="clear"/>
+            <w:tcMar>
+              <w:top w:w="100.0" w:type="dxa"/>
+              <w:left w:w="100.0" w:type="dxa"/>
+              <w:bottom w:w="100.0" w:type="dxa"/>
+              <w:right w:w="100.0" w:type="dxa"/>
+            </w:tcMar>
+            <w:vAlign w:val="top"/>
+          </w:tcPr>
+          <w:p>
+            <w:pPr>
+              <w:jc w:val="left"/>
+              <w:rPr>
+                <w:rFonts w:ascii="Times New Roman" w:cs="Times New Roman" w:eastAsia="Times New Roman" w:hAnsi="Times New Roman"/>
+                <w:sz w:val="16"/>
+                <w:szCs w:val="16"/>
+              </w:rPr>
+            </w:pPr>
+            <w:r>
+              <w:rPr>
+                <w:rFonts w:ascii="Times New Roman" w:cs="Times New Roman" w:eastAsia="Times New Roman" w:hAnsi="Times New Roman"/>
+                <w:sz w:val="16"/>
+                <w:szCs w:val="16"/>
+                <w:rtl w:val="0"/>
+              </w:rPr>
+              <w:t xml:space="preserve">147</w:t>
+            </w:r>
+          </w:p>
+        </w:tc>
+        <w:tc>
+          <w:tcPr>
+            <w:shd w:fill="auto" w:val="clear"/>
+            <w:tcMar>
+              <w:top w:w="100.0" w:type="dxa"/>
+              <w:left w:w="100.0" w:type="dxa"/>
+              <w:bottom w:w="100.0" w:type="dxa"/>
+              <w:right w:w="100.0" w:type="dxa"/>
+            </w:tcMar>
+            <w:vAlign w:val="top"/>
+          </w:tcPr>
+          <w:p>
+            <w:pPr>
+              <w:jc w:val="left"/>
+              <w:rPr>
+                <w:rFonts w:ascii="Times New Roman" w:cs="Times New Roman" w:eastAsia="Times New Roman" w:hAnsi="Times New Roman"/>
+                <w:sz w:val="16"/>
+                <w:szCs w:val="16"/>
+              </w:rPr>
+            </w:pPr>
+            <w:r>
+              <w:rPr>
+                <w:rFonts w:ascii="Times New Roman" w:cs="Times New Roman" w:eastAsia="Times New Roman" w:hAnsi="Times New Roman"/>
+                <w:sz w:val="16"/>
+                <w:szCs w:val="16"/>
+                <w:rtl w:val="0"/>
+              </w:rPr>
+              <w:t xml:space="preserve">$0.31</w:t>
+            </w:r>
+          </w:p>
+        </w:tc>
+        <w:tc>
+          <w:tcPr>
+            <w:shd w:fill="auto" w:val="clear"/>
+            <w:tcMar>
+              <w:top w:w="100.0" w:type="dxa"/>
+              <w:left w:w="100.0" w:type="dxa"/>
+              <w:bottom w:w="100.0" w:type="dxa"/>
+              <w:right w:w="100.0" w:type="dxa"/>
+            </w:tcMar>
+            <w:vAlign w:val="top"/>
+          </w:tcPr>
+          <w:p>
+            <w:pPr>
+              <w:jc w:val="left"/>
+              <w:rPr>
+                <w:rFonts w:ascii="Times New Roman" w:cs="Times New Roman" w:eastAsia="Times New Roman" w:hAnsi="Times New Roman"/>
+                <w:sz w:val="16"/>
+                <w:szCs w:val="16"/>
+              </w:rPr>
+            </w:pPr>
+            <w:r>
+              <w:rPr>
+                <w:rFonts w:ascii="Times New Roman" w:cs="Times New Roman" w:eastAsia="Times New Roman" w:hAnsi="Times New Roman"/>
+                <w:sz w:val="16"/>
+                <w:szCs w:val="16"/>
+                <w:rtl w:val="0"/>
+              </w:rPr>
+              <w:t xml:space="preserve">$0.00209</w:t>
+            </w:r>
+          </w:p>
+        </w:tc>
+        <w:tc>
+          <w:tcPr>
+            <w:shd w:fill="auto" w:val="clear"/>
+            <w:tcMar>
+              <w:top w:w="100.0" w:type="dxa"/>
+              <w:left w:w="100.0" w:type="dxa"/>
+              <w:bottom w:w="100.0" w:type="dxa"/>
+              <w:right w:w="100.0" w:type="dxa"/>
+            </w:tcMar>
+            <w:vAlign w:val="top"/>
+          </w:tcPr>
+          <w:p>
+            <w:pPr>
+              <w:jc w:val="left"/>
+              <w:rPr>
+                <w:rFonts w:ascii="Times New Roman" w:cs="Times New Roman" w:eastAsia="Times New Roman" w:hAnsi="Times New Roman"/>
+                <w:sz w:val="16"/>
+                <w:szCs w:val="16"/>
+              </w:rPr>
+            </w:pPr>
+            <w:r>
+              <w:rPr>
+                <w:rFonts w:ascii="Times New Roman" w:cs="Times New Roman" w:eastAsia="Times New Roman" w:hAnsi="Times New Roman"/>
+                <w:sz w:val="16"/>
+                <w:szCs w:val="16"/>
+                <w:rtl w:val="0"/>
+              </w:rPr>
+              <w:t xml:space="preserve">7.7s</w:t>
+            </w:r>
+          </w:p>
+        </w:tc>
+        <w:tc>
+          <w:tcPr>
+            <w:shd w:fill="auto" w:val="clear"/>
+            <w:tcMar>
+              <w:top w:w="100.0" w:type="dxa"/>
+              <w:left w:w="100.0" w:type="dxa"/>
+              <w:bottom w:w="100.0" w:type="dxa"/>
+              <w:right w:w="100.0" w:type="dxa"/>
+            </w:tcMar>
+            <w:vAlign w:val="top"/>
+          </w:tcPr>
+          <w:p>
+            <w:pPr>
+              <w:jc w:val="left"/>
+              <w:rPr>
+                <w:rFonts w:ascii="Times New Roman" w:cs="Times New Roman" w:eastAsia="Times New Roman" w:hAnsi="Times New Roman"/>
+                <w:sz w:val="16"/>
+                <w:szCs w:val="16"/>
+              </w:rPr>
+            </w:pPr>
+            <w:r>
+              <w:rPr>
+                <w:rFonts w:ascii="Times New Roman" w:cs="Times New Roman" w:eastAsia="Times New Roman" w:hAnsi="Times New Roman"/>
+                <w:sz w:val="16"/>
+                <w:szCs w:val="16"/>
+                <w:rtl w:val="0"/>
+              </w:rPr>
+              <w:t xml:space="preserve">20.9s</w:t>
+            </w:r>
+          </w:p>
+        </w:tc>
+      </w:tr>
+    </w:tbl>
     <w:p>
       <w:pPr>
         <w:jc w:val="both"/>
@@ -22141,7 +26798,7 @@
         <w:pStyle w:val="Normal"/>
       </w:pPr>
       <w:r>
-        <w:t xml:space="preserve">Visual references add modest cost ($0.14–$7.27 per model) but do not improve verification accuracy, confirming that text references with evaluation criteria are sufficient for most use cases.</w:t>
+        <w:t xml:space="preserve">Visual references add modest cost, between $0.23 and $3.64 per model for Conditions C and D combined on the 147-instance subset, but do not consistently improve verification accuracy, so text references with evaluation criteria remain the better default.</w:t>
       </w:r>
     </w:p>
     <w:p>

</xml_diff>

<commit_message>
Make the cross-generator and no-criteria tables render correctly
Rendered, Tables 6 and 7 wrapped inside cells: the header "McNemar p" broke to
"McNem ar p" and lift values broke mid-number ("+1.4p p", "+12. 9"). Moved the
unit into the header ("Lift pp"), shortened the p-value header, and set explicit
column widths so every value fits on one line.

Checked against the original v5 rendering: the remaining short-line fragments
are narrow-cell word wraps that were already present there ("Paramete rs",
"multimoda l" in the model table), not something this revision introduced.
</commit_message>
<xml_diff>
--- a/manuscripts/can_llm_web_agents_verify_their_own_work_R1.docx
+++ b/manuscripts/can_llm_web_agents_verify_their_own_work_R1.docx
@@ -14216,7 +14216,7 @@
     <w:tbl>
       <w:tblPr>
         <w:tblStyle w:val="Table5"/>
-        <w:tblW w:w="4320.0" w:type="dxa"/>
+        <w:tblW w:w="4300.0" w:type="dxa"/>
         <w:jc w:val="left"/>
         <w:tblBorders>
           <w:top w:color="000000" w:space="0" w:sz="8" w:val="single"/>
@@ -14230,12 +14230,12 @@
         <w:tblLook w:val="0600"/>
       </w:tblPr>
       <w:tblGrid>
-        <w:gridCol w:w="1100"/>
-        <w:gridCol w:w="500"/>
-        <w:gridCol w:w="640"/>
-        <w:gridCol w:w="640"/>
-        <w:gridCol w:w="640"/>
-        <w:gridCol w:w="800"/>
+        <w:gridCol w:w="1020"/>
+        <w:gridCol w:w="480"/>
+        <w:gridCol w:w="620"/>
+        <w:gridCol w:w="620"/>
+        <w:gridCol w:w="660"/>
+        <w:gridCol w:w="900"/>
       </w:tblGrid>
       <w:tr>
         <w:trPr>
@@ -14413,7 +14413,7 @@
                 <w:szCs w:val="16"/>
                 <w:rtl w:val="0"/>
               </w:rPr>
-              <w:t xml:space="preserve">Lift</w:t>
+              <w:t xml:space="preserve">Lift pp</w:t>
             </w:r>
           </w:p>
         </w:tc>
@@ -14448,7 +14448,7 @@
                 <w:szCs w:val="16"/>
                 <w:rtl w:val="0"/>
               </w:rPr>
-              <w:t xml:space="preserve">McNemar p</w:t>
+              <w:t xml:space="preserve">p</w:t>
             </w:r>
           </w:p>
         </w:tc>
@@ -14605,7 +14605,7 @@
                 <w:szCs w:val="16"/>
                 <w:rtl w:val="0"/>
               </w:rPr>
-              <w:t xml:space="preserve">+1.4pp</w:t>
+              <w:t xml:space="preserve">+1.4</w:t>
             </w:r>
           </w:p>
         </w:tc>
@@ -14793,7 +14793,7 @@
                 <w:szCs w:val="16"/>
                 <w:rtl w:val="0"/>
               </w:rPr>
-              <w:t xml:space="preserve">+12.9pp</w:t>
+              <w:t xml:space="preserve">+12.9</w:t>
             </w:r>
           </w:p>
         </w:tc>
@@ -14981,7 +14981,7 @@
                 <w:szCs w:val="16"/>
                 <w:rtl w:val="0"/>
               </w:rPr>
-              <w:t xml:space="preserve">+9.6pp</w:t>
+              <w:t xml:space="preserve">+9.6</w:t>
             </w:r>
           </w:p>
         </w:tc>
@@ -15169,7 +15169,7 @@
                 <w:szCs w:val="16"/>
                 <w:rtl w:val="0"/>
               </w:rPr>
-              <w:t xml:space="preserve">+5.0pp</w:t>
+              <w:t xml:space="preserve">+5.0</w:t>
             </w:r>
           </w:p>
         </w:tc>
@@ -15357,7 +15357,7 @@
                 <w:szCs w:val="16"/>
                 <w:rtl w:val="0"/>
               </w:rPr>
-              <w:t xml:space="preserve">+2.0pp</w:t>
+              <w:t xml:space="preserve">+2.0</w:t>
             </w:r>
           </w:p>
         </w:tc>
@@ -15537,7 +15537,7 @@
     <w:tbl>
       <w:tblPr>
         <w:tblStyle w:val="Table5"/>
-        <w:tblW w:w="4320.0" w:type="dxa"/>
+        <w:tblW w:w="4300.0" w:type="dxa"/>
         <w:jc w:val="left"/>
         <w:tblBorders>
           <w:top w:color="000000" w:space="0" w:sz="8" w:val="single"/>
@@ -15551,12 +15551,12 @@
         <w:tblLook w:val="0600"/>
       </w:tblPr>
       <w:tblGrid>
-        <w:gridCol w:w="1100"/>
-        <w:gridCol w:w="500"/>
-        <w:gridCol w:w="640"/>
-        <w:gridCol w:w="640"/>
-        <w:gridCol w:w="640"/>
-        <w:gridCol w:w="800"/>
+        <w:gridCol w:w="1020"/>
+        <w:gridCol w:w="480"/>
+        <w:gridCol w:w="620"/>
+        <w:gridCol w:w="620"/>
+        <w:gridCol w:w="660"/>
+        <w:gridCol w:w="900"/>
       </w:tblGrid>
       <w:tr>
         <w:trPr>
@@ -15734,7 +15734,7 @@
                 <w:szCs w:val="16"/>
                 <w:rtl w:val="0"/>
               </w:rPr>
-              <w:t xml:space="preserve">Lift</w:t>
+              <w:t xml:space="preserve">Lift pp</w:t>
             </w:r>
           </w:p>
         </w:tc>
@@ -15769,7 +15769,7 @@
                 <w:szCs w:val="16"/>
                 <w:rtl w:val="0"/>
               </w:rPr>
-              <w:t xml:space="preserve">McNemar p</w:t>
+              <w:t xml:space="preserve">p</w:t>
             </w:r>
           </w:p>
         </w:tc>
@@ -15926,7 +15926,7 @@
                 <w:szCs w:val="16"/>
                 <w:rtl w:val="0"/>
               </w:rPr>
-              <w:t xml:space="preserve">+0.0pp</w:t>
+              <w:t xml:space="preserve">+0.0</w:t>
             </w:r>
           </w:p>
         </w:tc>
@@ -16114,7 +16114,7 @@
                 <w:szCs w:val="16"/>
                 <w:rtl w:val="0"/>
               </w:rPr>
-              <w:t xml:space="preserve">+6.8pp</w:t>
+              <w:t xml:space="preserve">+6.8</w:t>
             </w:r>
           </w:p>
         </w:tc>
@@ -16302,7 +16302,7 @@
                 <w:szCs w:val="16"/>
                 <w:rtl w:val="0"/>
               </w:rPr>
-              <w:t xml:space="preserve">+1.4pp</w:t>
+              <w:t xml:space="preserve">+1.4</w:t>
             </w:r>
           </w:p>
         </w:tc>
@@ -16490,7 +16490,7 @@
                 <w:szCs w:val="16"/>
                 <w:rtl w:val="0"/>
               </w:rPr>
-              <w:t xml:space="preserve">−1.4pp</w:t>
+              <w:t xml:space="preserve">−1.4</w:t>
             </w:r>
           </w:p>
         </w:tc>
@@ -16678,7 +16678,7 @@
                 <w:szCs w:val="16"/>
                 <w:rtl w:val="0"/>
               </w:rPr>
-              <w:t xml:space="preserve">−2.0pp</w:t>
+              <w:t xml:space="preserve">−2.0</w:t>
             </w:r>
           </w:p>
         </w:tc>

</xml_diff>

<commit_message>
Add author photographs to the biographies
The resubmission checklist requires the Main Manuscript to carry author
biographies and photographs. The biographies were present; the photographs were
not, and no image appeared anywhere after the Biography heading.

Both photographs are cropped to the 1 inch by 1.25 inch portrait proportion IEEE
uses for author biographies, centred on the face, and embedded at 300 dpi.
</commit_message>
<xml_diff>
--- a/manuscripts/can_llm_web_agents_verify_their_own_work_R1.docx
+++ b/manuscripts/can_llm_web_agents_verify_their_own_work_R1.docx
@@ -38940,6 +38940,44 @@
         </w:rPr>
       </w:pPr>
       <w:r>
+        <w:drawing>
+          <wp:inline distB="0" distT="0" distL="0" distR="114300">
+            <wp:extent cx="914400" cy="1143000"/>
+            <wp:effectExtent b="0" l="0" r="0" t="0"/>
+            <wp:docPr id="90001" name="photo_vt"/>
+            <a:graphic xmlns:a="http://schemas.openxmlformats.org/drawingml/2006/main">
+              <a:graphicData uri="http://schemas.openxmlformats.org/drawingml/2006/picture">
+                <pic:pic xmlns:pic="http://schemas.openxmlformats.org/drawingml/2006/picture">
+                  <pic:nvPicPr>
+                    <pic:cNvPr id="0" name="photo_vt"/>
+                    <pic:cNvPicPr preferRelativeResize="0"/>
+                  </pic:nvPicPr>
+                  <pic:blipFill>
+                    <a:blip r:embed="rId44"/>
+                    <a:srcRect b="0" l="0" r="0" t="0"/>
+                    <a:stretch>
+                      <a:fillRect/>
+                    </a:stretch>
+                  </pic:blipFill>
+                  <pic:spPr>
+                    <a:xfrm>
+                      <a:off x="0" y="0"/>
+                      <a:ext cx="914400" cy="1143000"/>
+                    </a:xfrm>
+                    <a:prstGeom prst="rect">
+                      <a:avLst/>
+                    </a:prstGeom>
+                    <a:ln>
+                      <a:noFill/>
+                    </a:ln>
+                  </pic:spPr>
+                </pic:pic>
+              </a:graphicData>
+            </a:graphic>
+          </wp:inline>
+        </w:drawing>
+      </w:r>
+      <w:r>
         <w:rPr>
           <w:rFonts w:ascii="Times New Roman" w:cs="Times New Roman" w:eastAsia="Times New Roman" w:hAnsi="Times New Roman"/>
           <w:sz w:val="16"/>
@@ -38959,6 +38997,44 @@
           <w:szCs w:val="16"/>
         </w:rPr>
       </w:pPr>
+      <w:r>
+        <w:drawing>
+          <wp:inline distB="0" distT="0" distL="0" distR="114300">
+            <wp:extent cx="914400" cy="1143000"/>
+            <wp:effectExtent b="0" l="0" r="0" t="0"/>
+            <wp:docPr id="90002" name="photo_sp"/>
+            <a:graphic xmlns:a="http://schemas.openxmlformats.org/drawingml/2006/main">
+              <a:graphicData uri="http://schemas.openxmlformats.org/drawingml/2006/picture">
+                <pic:pic xmlns:pic="http://schemas.openxmlformats.org/drawingml/2006/picture">
+                  <pic:nvPicPr>
+                    <pic:cNvPr id="0" name="photo_sp"/>
+                    <pic:cNvPicPr preferRelativeResize="0"/>
+                  </pic:nvPicPr>
+                  <pic:blipFill>
+                    <a:blip r:embed="rId45"/>
+                    <a:srcRect b="0" l="0" r="0" t="0"/>
+                    <a:stretch>
+                      <a:fillRect/>
+                    </a:stretch>
+                  </pic:blipFill>
+                  <pic:spPr>
+                    <a:xfrm>
+                      <a:off x="0" y="0"/>
+                      <a:ext cx="914400" cy="1143000"/>
+                    </a:xfrm>
+                    <a:prstGeom prst="rect">
+                      <a:avLst/>
+                    </a:prstGeom>
+                    <a:ln>
+                      <a:noFill/>
+                    </a:ln>
+                  </pic:spPr>
+                </pic:pic>
+              </a:graphicData>
+            </a:graphic>
+          </wp:inline>
+        </w:drawing>
+      </w:r>
       <w:r>
         <w:rPr>
           <w:rFonts w:ascii="Times New Roman" w:cs="Times New Roman" w:eastAsia="Times New Roman" w:hAnsi="Times New Roman"/>

</xml_diff>

<commit_message>
Make the manuscript schema-clean
The document carried two OOXML schema violations. Both predate this session's
work; the first entered during the earlier restructuring and the second came from
the original Google Docs export.

In 42 paragraphs w:pStyle sat after w:jc and w:rPr inside w:pPr. The CT_PPr
sequence requires it first, so those paragraphs were invalid even though Word and
LibreOffice both tolerate the order. Moved to the front in every case.

Both w:pgMar elements were missing the required w:gutter attribute, which is also
absent from the original submission. Added with a zero value, matching the
document's existing margins.

The manuscript now validates with no errors and no warnings, which it has not
done at any point in this revision. Rendering is unchanged at 27 pages.
</commit_message>
<xml_diff>
--- a/manuscripts/can_llm_web_agents_verify_their_own_work_R1.docx
+++ b/manuscripts/can_llm_web_agents_verify_their_own_work_R1.docx
@@ -288,7 +288,7 @@
         </w:rPr>
         <w:sectPr>
           <w:pgSz w:h="15840" w:w="12240" w:orient="portrait"/>
-          <w:pgMar w:bottom="1440" w:top="1440" w:left="1440" w:right="1440" w:header="720" w:footer="720"/>
+          <w:pgMar w:bottom="1440" w:top="1440" w:left="1440" w:right="1440" w:header="720" w:footer="720" w:gutter="0"/>
           <w:pgNumType w:start="1"/>
         </w:sectPr>
       </w:pPr>
@@ -14192,13 +14192,13 @@
     </w:p>
     <w:p>
       <w:pPr>
-        <w:jc w:val="both"/>
-        <w:rPr>
-          <w:rFonts w:ascii="Times New Roman" w:cs="Times New Roman" w:eastAsia="Times New Roman" w:hAnsi="Times New Roman"/>
-          <w:sz w:val="20"/>
-          <w:szCs w:val="20"/>
-        </w:rPr>
         <w:pStyle w:val="Heading3"/>
+        <w:jc w:val="both"/>
+        <w:rPr>
+          <w:rFonts w:ascii="Times New Roman" w:cs="Times New Roman" w:eastAsia="Times New Roman" w:hAnsi="Times New Roman"/>
+          <w:sz w:val="20"/>
+          <w:szCs w:val="20"/>
+        </w:rPr>
       </w:pPr>
       <w:r>
         <w:rPr>
@@ -14214,13 +14214,13 @@
     </w:p>
     <w:p>
       <w:pPr>
-        <w:jc w:val="both"/>
-        <w:rPr>
-          <w:rFonts w:ascii="Times New Roman" w:cs="Times New Roman" w:eastAsia="Times New Roman" w:hAnsi="Times New Roman"/>
-          <w:sz w:val="20"/>
-          <w:szCs w:val="20"/>
-        </w:rPr>
         <w:pStyle w:val="Normal"/>
+        <w:jc w:val="both"/>
+        <w:rPr>
+          <w:rFonts w:ascii="Times New Roman" w:cs="Times New Roman" w:eastAsia="Times New Roman" w:hAnsi="Times New Roman"/>
+          <w:sz w:val="20"/>
+          <w:szCs w:val="20"/>
+        </w:rPr>
       </w:pPr>
       <w:r>
         <w:rPr>
@@ -14234,13 +14234,13 @@
     </w:p>
     <w:p>
       <w:pPr>
-        <w:jc w:val="both"/>
-        <w:rPr>
-          <w:rFonts w:ascii="Times New Roman" w:cs="Times New Roman" w:eastAsia="Times New Roman" w:hAnsi="Times New Roman"/>
-          <w:sz w:val="20"/>
-          <w:szCs w:val="20"/>
-        </w:rPr>
         <w:pStyle w:val="Normal"/>
+        <w:jc w:val="both"/>
+        <w:rPr>
+          <w:rFonts w:ascii="Times New Roman" w:cs="Times New Roman" w:eastAsia="Times New Roman" w:hAnsi="Times New Roman"/>
+          <w:sz w:val="20"/>
+          <w:szCs w:val="20"/>
+        </w:rPr>
       </w:pPr>
       <w:r>
         <w:rPr>
@@ -14254,13 +14254,13 @@
     </w:p>
     <w:p>
       <w:pPr>
-        <w:jc w:val="both"/>
-        <w:rPr>
-          <w:rFonts w:ascii="Times New Roman" w:cs="Times New Roman" w:eastAsia="Times New Roman" w:hAnsi="Times New Roman"/>
-          <w:sz w:val="20"/>
-          <w:szCs w:val="20"/>
-        </w:rPr>
         <w:pStyle w:val="Normal"/>
+        <w:jc w:val="both"/>
+        <w:rPr>
+          <w:rFonts w:ascii="Times New Roman" w:cs="Times New Roman" w:eastAsia="Times New Roman" w:hAnsi="Times New Roman"/>
+          <w:sz w:val="20"/>
+          <w:szCs w:val="20"/>
+        </w:rPr>
       </w:pPr>
       <w:r>
         <w:t/>
@@ -14268,13 +14268,13 @@
     </w:p>
     <w:p>
       <w:pPr>
-        <w:jc w:val="both"/>
-        <w:rPr>
-          <w:rFonts w:ascii="Times New Roman" w:cs="Times New Roman" w:eastAsia="Times New Roman" w:hAnsi="Times New Roman"/>
-          <w:sz w:val="20"/>
-          <w:szCs w:val="20"/>
-        </w:rPr>
         <w:pStyle w:val="Normal"/>
+        <w:jc w:val="both"/>
+        <w:rPr>
+          <w:rFonts w:ascii="Times New Roman" w:cs="Times New Roman" w:eastAsia="Times New Roman" w:hAnsi="Times New Roman"/>
+          <w:sz w:val="20"/>
+          <w:szCs w:val="20"/>
+        </w:rPr>
       </w:pPr>
       <w:r>
         <w:t/>
@@ -14282,13 +14282,13 @@
     </w:p>
     <w:p>
       <w:pPr>
+        <w:pStyle w:val="Normal"/>
         <w:jc w:val="center"/>
         <w:rPr>
           <w:rFonts w:ascii="Times New Roman" w:cs="Times New Roman" w:eastAsia="Times New Roman" w:hAnsi="Times New Roman"/>
           <w:sz w:val="20"/>
           <w:szCs w:val="20"/>
         </w:rPr>
-        <w:pStyle w:val="Normal"/>
       </w:pPr>
       <w:r>
         <w:rPr>
@@ -15498,13 +15498,13 @@
     </w:tbl>
     <w:p>
       <w:pPr>
-        <w:jc w:val="both"/>
-        <w:rPr>
-          <w:rFonts w:ascii="Times New Roman" w:cs="Times New Roman" w:eastAsia="Times New Roman" w:hAnsi="Times New Roman"/>
-          <w:sz w:val="20"/>
-          <w:szCs w:val="20"/>
-        </w:rPr>
         <w:pStyle w:val="Normal"/>
+        <w:jc w:val="both"/>
+        <w:rPr>
+          <w:rFonts w:ascii="Times New Roman" w:cs="Times New Roman" w:eastAsia="Times New Roman" w:hAnsi="Times New Roman"/>
+          <w:sz w:val="20"/>
+          <w:szCs w:val="20"/>
+        </w:rPr>
       </w:pPr>
       <w:r>
         <w:t/>
@@ -15512,13 +15512,13 @@
     </w:p>
     <w:p>
       <w:pPr>
-        <w:jc w:val="both"/>
-        <w:rPr>
-          <w:rFonts w:ascii="Times New Roman" w:cs="Times New Roman" w:eastAsia="Times New Roman" w:hAnsi="Times New Roman"/>
-          <w:sz w:val="20"/>
-          <w:szCs w:val="20"/>
-        </w:rPr>
         <w:pStyle w:val="Normal"/>
+        <w:jc w:val="both"/>
+        <w:rPr>
+          <w:rFonts w:ascii="Times New Roman" w:cs="Times New Roman" w:eastAsia="Times New Roman" w:hAnsi="Times New Roman"/>
+          <w:sz w:val="20"/>
+          <w:szCs w:val="20"/>
+        </w:rPr>
       </w:pPr>
       <w:r>
         <w:rPr>
@@ -15532,13 +15532,13 @@
     </w:p>
     <w:p>
       <w:pPr>
-        <w:jc w:val="both"/>
-        <w:rPr>
-          <w:rFonts w:ascii="Times New Roman" w:cs="Times New Roman" w:eastAsia="Times New Roman" w:hAnsi="Times New Roman"/>
-          <w:sz w:val="20"/>
-          <w:szCs w:val="20"/>
-        </w:rPr>
         <w:pStyle w:val="Normal"/>
+        <w:jc w:val="both"/>
+        <w:rPr>
+          <w:rFonts w:ascii="Times New Roman" w:cs="Times New Roman" w:eastAsia="Times New Roman" w:hAnsi="Times New Roman"/>
+          <w:sz w:val="20"/>
+          <w:szCs w:val="20"/>
+        </w:rPr>
       </w:pPr>
       <w:r>
         <w:t/>
@@ -15546,13 +15546,13 @@
     </w:p>
     <w:p>
       <w:pPr>
-        <w:jc w:val="both"/>
-        <w:rPr>
-          <w:rFonts w:ascii="Times New Roman" w:cs="Times New Roman" w:eastAsia="Times New Roman" w:hAnsi="Times New Roman"/>
-          <w:sz w:val="20"/>
-          <w:szCs w:val="20"/>
-        </w:rPr>
         <w:pStyle w:val="Heading3"/>
+        <w:jc w:val="both"/>
+        <w:rPr>
+          <w:rFonts w:ascii="Times New Roman" w:cs="Times New Roman" w:eastAsia="Times New Roman" w:hAnsi="Times New Roman"/>
+          <w:sz w:val="20"/>
+          <w:szCs w:val="20"/>
+        </w:rPr>
       </w:pPr>
       <w:r>
         <w:rPr>
@@ -15568,13 +15568,13 @@
     </w:p>
     <w:p>
       <w:pPr>
-        <w:jc w:val="both"/>
-        <w:rPr>
-          <w:rFonts w:ascii="Times New Roman" w:cs="Times New Roman" w:eastAsia="Times New Roman" w:hAnsi="Times New Roman"/>
-          <w:sz w:val="20"/>
-          <w:szCs w:val="20"/>
-        </w:rPr>
         <w:pStyle w:val="Normal"/>
+        <w:jc w:val="both"/>
+        <w:rPr>
+          <w:rFonts w:ascii="Times New Roman" w:cs="Times New Roman" w:eastAsia="Times New Roman" w:hAnsi="Times New Roman"/>
+          <w:sz w:val="20"/>
+          <w:szCs w:val="20"/>
+        </w:rPr>
       </w:pPr>
       <w:r>
         <w:t/>
@@ -15582,13 +15582,13 @@
     </w:p>
     <w:p>
       <w:pPr>
-        <w:jc w:val="both"/>
-        <w:rPr>
-          <w:rFonts w:ascii="Times New Roman" w:cs="Times New Roman" w:eastAsia="Times New Roman" w:hAnsi="Times New Roman"/>
-          <w:sz w:val="20"/>
-          <w:szCs w:val="20"/>
-        </w:rPr>
         <w:pStyle w:val="Normal"/>
+        <w:jc w:val="both"/>
+        <w:rPr>
+          <w:rFonts w:ascii="Times New Roman" w:cs="Times New Roman" w:eastAsia="Times New Roman" w:hAnsi="Times New Roman"/>
+          <w:sz w:val="20"/>
+          <w:szCs w:val="20"/>
+        </w:rPr>
       </w:pPr>
       <w:r>
         <w:rPr>
@@ -15602,13 +15602,13 @@
     </w:p>
     <w:p>
       <w:pPr>
-        <w:jc w:val="both"/>
-        <w:rPr>
-          <w:rFonts w:ascii="Times New Roman" w:cs="Times New Roman" w:eastAsia="Times New Roman" w:hAnsi="Times New Roman"/>
-          <w:sz w:val="20"/>
-          <w:szCs w:val="20"/>
-        </w:rPr>
         <w:pStyle w:val="Normal"/>
+        <w:jc w:val="both"/>
+        <w:rPr>
+          <w:rFonts w:ascii="Times New Roman" w:cs="Times New Roman" w:eastAsia="Times New Roman" w:hAnsi="Times New Roman"/>
+          <w:sz w:val="20"/>
+          <w:szCs w:val="20"/>
+        </w:rPr>
       </w:pPr>
       <w:r>
         <w:rPr>
@@ -15622,13 +15622,13 @@
     </w:p>
     <w:p>
       <w:pPr>
-        <w:jc w:val="both"/>
-        <w:rPr>
-          <w:rFonts w:ascii="Times New Roman" w:cs="Times New Roman" w:eastAsia="Times New Roman" w:hAnsi="Times New Roman"/>
-          <w:sz w:val="20"/>
-          <w:szCs w:val="20"/>
-        </w:rPr>
         <w:pStyle w:val="Normal"/>
+        <w:jc w:val="both"/>
+        <w:rPr>
+          <w:rFonts w:ascii="Times New Roman" w:cs="Times New Roman" w:eastAsia="Times New Roman" w:hAnsi="Times New Roman"/>
+          <w:sz w:val="20"/>
+          <w:szCs w:val="20"/>
+        </w:rPr>
       </w:pPr>
       <w:r>
         <w:t/>
@@ -15636,13 +15636,13 @@
     </w:p>
     <w:p>
       <w:pPr>
-        <w:jc w:val="both"/>
-        <w:rPr>
-          <w:rFonts w:ascii="Times New Roman" w:cs="Times New Roman" w:eastAsia="Times New Roman" w:hAnsi="Times New Roman"/>
-          <w:sz w:val="20"/>
-          <w:szCs w:val="20"/>
-        </w:rPr>
         <w:pStyle w:val="Normal"/>
+        <w:jc w:val="both"/>
+        <w:rPr>
+          <w:rFonts w:ascii="Times New Roman" w:cs="Times New Roman" w:eastAsia="Times New Roman" w:hAnsi="Times New Roman"/>
+          <w:sz w:val="20"/>
+          <w:szCs w:val="20"/>
+        </w:rPr>
       </w:pPr>
       <w:r>
         <w:t/>
@@ -15650,13 +15650,13 @@
     </w:p>
     <w:p>
       <w:pPr>
+        <w:pStyle w:val="Normal"/>
         <w:jc w:val="center"/>
         <w:rPr>
           <w:rFonts w:ascii="Times New Roman" w:cs="Times New Roman" w:eastAsia="Times New Roman" w:hAnsi="Times New Roman"/>
           <w:sz w:val="20"/>
           <w:szCs w:val="20"/>
         </w:rPr>
-        <w:pStyle w:val="Normal"/>
       </w:pPr>
       <w:r>
         <w:rPr>
@@ -16866,13 +16866,13 @@
     </w:tbl>
     <w:p>
       <w:pPr>
-        <w:jc w:val="both"/>
-        <w:rPr>
-          <w:rFonts w:ascii="Times New Roman" w:cs="Times New Roman" w:eastAsia="Times New Roman" w:hAnsi="Times New Roman"/>
-          <w:sz w:val="20"/>
-          <w:szCs w:val="20"/>
-        </w:rPr>
         <w:pStyle w:val="Normal"/>
+        <w:jc w:val="both"/>
+        <w:rPr>
+          <w:rFonts w:ascii="Times New Roman" w:cs="Times New Roman" w:eastAsia="Times New Roman" w:hAnsi="Times New Roman"/>
+          <w:sz w:val="20"/>
+          <w:szCs w:val="20"/>
+        </w:rPr>
       </w:pPr>
       <w:r>
         <w:t/>
@@ -16880,13 +16880,13 @@
     </w:p>
     <w:p>
       <w:pPr>
-        <w:jc w:val="both"/>
-        <w:rPr>
-          <w:rFonts w:ascii="Times New Roman" w:cs="Times New Roman" w:eastAsia="Times New Roman" w:hAnsi="Times New Roman"/>
-          <w:sz w:val="20"/>
-          <w:szCs w:val="20"/>
-        </w:rPr>
         <w:pStyle w:val="Normal"/>
+        <w:jc w:val="both"/>
+        <w:rPr>
+          <w:rFonts w:ascii="Times New Roman" w:cs="Times New Roman" w:eastAsia="Times New Roman" w:hAnsi="Times New Roman"/>
+          <w:sz w:val="20"/>
+          <w:szCs w:val="20"/>
+        </w:rPr>
       </w:pPr>
       <w:r>
         <w:rPr>
@@ -16900,13 +16900,13 @@
     </w:p>
     <w:p>
       <w:pPr>
-        <w:jc w:val="both"/>
-        <w:rPr>
-          <w:rFonts w:ascii="Times New Roman" w:cs="Times New Roman" w:eastAsia="Times New Roman" w:hAnsi="Times New Roman"/>
-          <w:sz w:val="20"/>
-          <w:szCs w:val="20"/>
-        </w:rPr>
         <w:pStyle w:val="Normal"/>
+        <w:jc w:val="both"/>
+        <w:rPr>
+          <w:rFonts w:ascii="Times New Roman" w:cs="Times New Roman" w:eastAsia="Times New Roman" w:hAnsi="Times New Roman"/>
+          <w:sz w:val="20"/>
+          <w:szCs w:val="20"/>
+        </w:rPr>
       </w:pPr>
       <w:r>
         <w:t/>
@@ -20896,6 +20896,7 @@
     </w:p>
     <w:p>
       <w:pPr>
+        <w:pStyle w:val="Heading2"/>
         <w:jc w:val="both"/>
         <w:rPr>
           <w:rFonts w:ascii="Helvetica Neue" w:cs="Helvetica Neue" w:eastAsia="Helvetica Neue" w:hAnsi="Helvetica Neue"/>
@@ -20904,7 +20905,6 @@
           <w:sz w:val="44"/>
           <w:szCs w:val="44"/>
         </w:rPr>
-        <w:pStyle w:val="Heading2"/>
       </w:pPr>
       <w:r>
         <w:rPr>
@@ -20922,6 +20922,7 @@
     </w:p>
     <w:p>
       <w:pPr>
+        <w:pStyle w:val="Normal"/>
         <w:jc w:val="both"/>
         <w:rPr>
           <w:rFonts w:ascii="Helvetica Neue" w:cs="Helvetica Neue" w:eastAsia="Helvetica Neue" w:hAnsi="Helvetica Neue"/>
@@ -20930,20 +20931,20 @@
           <w:sz w:val="44"/>
           <w:szCs w:val="44"/>
         </w:rPr>
+      </w:pPr>
+      <w:r>
+        <w:rPr>
+          <w:rFonts w:ascii="Times New Roman" w:cs="Times New Roman" w:eastAsia="Times New Roman" w:hAnsi="Times New Roman"/>
+          <w:sz w:val="20"/>
+          <w:szCs w:val="20"/>
+          <w:rtl w:val="0"/>
+        </w:rPr>
+        <w:t xml:space="preserve">A key finding is that four of the five models exhibit substantial overconfidence: median confidence of 9-10 whether or not the verdict is correct. Claude Sonnet 4 is the exception, with a median of 8 when correct against 7 when wrong in Condition A. Table 8 shows the mean confidence when correct versus when wrong.</w:t>
+      </w:r>
+    </w:p>
+    <w:p>
+      <w:pPr>
         <w:pStyle w:val="Normal"/>
-      </w:pPr>
-      <w:r>
-        <w:rPr>
-          <w:rFonts w:ascii="Times New Roman" w:cs="Times New Roman" w:eastAsia="Times New Roman" w:hAnsi="Times New Roman"/>
-          <w:sz w:val="20"/>
-          <w:szCs w:val="20"/>
-          <w:rtl w:val="0"/>
-        </w:rPr>
-        <w:t xml:space="preserve">A key finding is that four of the five models exhibit substantial overconfidence: median confidence of 9-10 whether or not the verdict is correct. Claude Sonnet 4 is the exception, with a median of 8 when correct against 7 when wrong in Condition A. Table 8 shows the mean confidence when correct versus when wrong.</w:t>
-      </w:r>
-    </w:p>
-    <w:p>
-      <w:pPr>
         <w:jc w:val="center"/>
         <w:rPr>
           <w:rFonts w:ascii="Helvetica Neue" w:cs="Helvetica Neue" w:eastAsia="Helvetica Neue" w:hAnsi="Helvetica Neue"/>
@@ -20952,7 +20953,6 @@
           <w:sz w:val="44"/>
           <w:szCs w:val="44"/>
         </w:rPr>
-        <w:pStyle w:val="Normal"/>
       </w:pPr>
       <w:r>
         <w:rPr>
@@ -21971,6 +21971,7 @@
     </w:tbl>
     <w:p>
       <w:pPr>
+        <w:pStyle w:val="Normal"/>
         <w:jc w:val="both"/>
         <w:rPr>
           <w:rFonts w:ascii="Helvetica Neue" w:cs="Helvetica Neue" w:eastAsia="Helvetica Neue" w:hAnsi="Helvetica Neue"/>
@@ -21979,20 +21980,20 @@
           <w:sz w:val="44"/>
           <w:szCs w:val="44"/>
         </w:rPr>
+      </w:pPr>
+      <w:r>
+        <w:rPr>
+          <w:rFonts w:ascii="Times New Roman" w:cs="Times New Roman" w:eastAsia="Times New Roman" w:hAnsi="Times New Roman"/>
+          <w:sz w:val="20"/>
+          <w:szCs w:val="20"/>
+          <w:rtl w:val="0"/>
+        </w:rPr>
+        <w:t xml:space="preserve">The overconfidence pattern is most pronounced for the GPT-4.1 family, where mean confidence when wrong equals or exceeds confidence when correct (GPT-4.1 9.78 vs 9.41, GPT-4.1 Mini 9.42 vs 9.37, GPT-4.1 Nano 8.81 vs 8.22 in Condition A). For these models confidence scores alone are unreliable for filtering low-quality verifications. Gemini 3.6 Flash is only marginally better (9.59 correct vs 9.47 wrong), its confidence being almost saturated at the top of the scale. Claude Sonnet 4 shows the best calibration, with a positive gap of +0.7 to +0.9 between correct and incorrect confidence.</w:t>
+      </w:r>
+    </w:p>
+    <w:p>
+      <w:pPr>
         <w:pStyle w:val="Normal"/>
-      </w:pPr>
-      <w:r>
-        <w:rPr>
-          <w:rFonts w:ascii="Times New Roman" w:cs="Times New Roman" w:eastAsia="Times New Roman" w:hAnsi="Times New Roman"/>
-          <w:sz w:val="20"/>
-          <w:szCs w:val="20"/>
-          <w:rtl w:val="0"/>
-        </w:rPr>
-        <w:t xml:space="preserve">The overconfidence pattern is most pronounced for the GPT-4.1 family, where mean confidence when wrong equals or exceeds confidence when correct (GPT-4.1 9.78 vs 9.41, GPT-4.1 Mini 9.42 vs 9.37, GPT-4.1 Nano 8.81 vs 8.22 in Condition A). For these models confidence scores alone are unreliable for filtering low-quality verifications. Gemini 3.6 Flash is only marginally better (9.59 correct vs 9.47 wrong), its confidence being almost saturated at the top of the scale. Claude Sonnet 4 shows the best calibration, with a positive gap of +0.7 to +0.9 between correct and incorrect confidence.</w:t>
-      </w:r>
-    </w:p>
-    <w:p>
-      <w:pPr>
         <w:jc w:val="both"/>
         <w:rPr>
           <w:rFonts w:ascii="Helvetica Neue" w:cs="Helvetica Neue" w:eastAsia="Helvetica Neue" w:hAnsi="Helvetica Neue"/>
@@ -22001,14 +22002,14 @@
           <w:sz w:val="44"/>
           <w:szCs w:val="44"/>
         </w:rPr>
+      </w:pPr>
+      <w:r>
+        <w:t/>
+      </w:r>
+    </w:p>
+    <w:p>
+      <w:pPr>
         <w:pStyle w:val="Normal"/>
-      </w:pPr>
-      <w:r>
-        <w:t/>
-      </w:r>
-    </w:p>
-    <w:p>
-      <w:pPr>
         <w:jc w:val="both"/>
         <w:rPr>
           <w:rFonts w:ascii="Helvetica Neue" w:cs="Helvetica Neue" w:eastAsia="Helvetica Neue" w:hAnsi="Helvetica Neue"/>
@@ -22017,20 +22018,20 @@
           <w:sz w:val="44"/>
           <w:szCs w:val="44"/>
         </w:rPr>
+      </w:pPr>
+      <w:r>
+        <w:rPr>
+          <w:rFonts w:ascii="Times New Roman" w:cs="Times New Roman" w:eastAsia="Times New Roman" w:hAnsi="Times New Roman"/>
+          <w:sz w:val="20"/>
+          <w:szCs w:val="20"/>
+          <w:rtl w:val="0"/>
+        </w:rPr>
+        <w:t xml:space="preserve">Gemini 3.6 Flash neither gains nor loses appreciably from a text reference (+0.9pp, p=0.450). Inspection of its outputs suggests why: its confidence is saturated near the top of the scale in every condition, and its verdicts change comparatively rarely when a reference is added. Where it does err, the failure mode is reference-anchored: it reports that the expected state is present, echoing the reference text, when the screenshot does not show it.</w:t>
+      </w:r>
+    </w:p>
+    <w:p>
+      <w:pPr>
         <w:pStyle w:val="Normal"/>
-      </w:pPr>
-      <w:r>
-        <w:rPr>
-          <w:rFonts w:ascii="Times New Roman" w:cs="Times New Roman" w:eastAsia="Times New Roman" w:hAnsi="Times New Roman"/>
-          <w:sz w:val="20"/>
-          <w:szCs w:val="20"/>
-          <w:rtl w:val="0"/>
-        </w:rPr>
-        <w:t xml:space="preserve">Gemini 3.6 Flash neither gains nor loses appreciably from a text reference (+0.9pp, p=0.450). Inspection of its outputs suggests why: its confidence is saturated near the top of the scale in every condition, and its verdicts change comparatively rarely when a reference is added. Where it does err, the failure mode is reference-anchored: it reports that the expected state is present, echoing the reference text, when the screenshot does not show it.</w:t>
-      </w:r>
-    </w:p>
-    <w:p>
-      <w:pPr>
         <w:jc w:val="both"/>
         <w:rPr>
           <w:rFonts w:ascii="Helvetica Neue" w:cs="Helvetica Neue" w:eastAsia="Helvetica Neue" w:hAnsi="Helvetica Neue"/>
@@ -22039,7 +22040,6 @@
           <w:sz w:val="44"/>
           <w:szCs w:val="44"/>
         </w:rPr>
-        <w:pStyle w:val="Normal"/>
       </w:pPr>
       <w:r>
         <w:t/>
@@ -22047,6 +22047,7 @@
     </w:p>
     <w:p>
       <w:pPr>
+        <w:pStyle w:val="Heading2"/>
         <w:jc w:val="both"/>
         <w:rPr>
           <w:rFonts w:ascii="Helvetica Neue" w:cs="Helvetica Neue" w:eastAsia="Helvetica Neue" w:hAnsi="Helvetica Neue"/>
@@ -22055,7 +22056,6 @@
           <w:sz w:val="44"/>
           <w:szCs w:val="44"/>
         </w:rPr>
-        <w:pStyle w:val="Heading2"/>
       </w:pPr>
       <w:r>
         <w:rPr>
@@ -22073,6 +22073,7 @@
     </w:p>
     <w:p>
       <w:pPr>
+        <w:pStyle w:val="Normal"/>
         <w:jc w:val="both"/>
         <w:rPr>
           <w:rFonts w:ascii="Helvetica Neue" w:cs="Helvetica Neue" w:eastAsia="Helvetica Neue" w:hAnsi="Helvetica Neue"/>
@@ -22081,14 +22082,14 @@
           <w:sz w:val="44"/>
           <w:szCs w:val="44"/>
         </w:rPr>
+      </w:pPr>
+      <w:r>
+        <w:t/>
+      </w:r>
+    </w:p>
+    <w:p>
+      <w:pPr>
         <w:pStyle w:val="Normal"/>
-      </w:pPr>
-      <w:r>
-        <w:t/>
-      </w:r>
-    </w:p>
-    <w:p>
-      <w:pPr>
         <w:jc w:val="both"/>
         <w:rPr>
           <w:rFonts w:ascii="Helvetica Neue" w:cs="Helvetica Neue" w:eastAsia="Helvetica Neue" w:hAnsi="Helvetica Neue"/>
@@ -22097,20 +22098,20 @@
           <w:sz w:val="44"/>
           <w:szCs w:val="44"/>
         </w:rPr>
+      </w:pPr>
+      <w:r>
+        <w:rPr>
+          <w:rFonts w:ascii="Times New Roman" w:cs="Times New Roman" w:eastAsia="Times New Roman" w:hAnsi="Times New Roman"/>
+          <w:sz w:val="20"/>
+          <w:szCs w:val="20"/>
+          <w:rtl w:val="0"/>
+        </w:rPr>
+        <w:t xml:space="preserve">Across all five models, on instances where both Conditions A and B produced a valid verdict, text references improved verification in 649 instances and degraded it in 209. We present representative examples of both.</w:t>
+      </w:r>
+    </w:p>
+    <w:p>
+      <w:pPr>
         <w:pStyle w:val="Normal"/>
-      </w:pPr>
-      <w:r>
-        <w:rPr>
-          <w:rFonts w:ascii="Times New Roman" w:cs="Times New Roman" w:eastAsia="Times New Roman" w:hAnsi="Times New Roman"/>
-          <w:sz w:val="20"/>
-          <w:szCs w:val="20"/>
-          <w:rtl w:val="0"/>
-        </w:rPr>
-        <w:t xml:space="preserve">Across all five models, on instances where both Conditions A and B produced a valid verdict, text references improved verification in 649 instances and degraded it in 209. We present representative examples of both.</w:t>
-      </w:r>
-    </w:p>
-    <w:p>
-      <w:pPr>
         <w:jc w:val="both"/>
         <w:rPr>
           <w:rFonts w:ascii="Helvetica Neue" w:cs="Helvetica Neue" w:eastAsia="Helvetica Neue" w:hAnsi="Helvetica Neue"/>
@@ -22119,20 +22120,20 @@
           <w:sz w:val="44"/>
           <w:szCs w:val="44"/>
         </w:rPr>
+      </w:pPr>
+      <w:r>
+        <w:rPr>
+          <w:rFonts w:ascii="Times New Roman" w:cs="Times New Roman" w:eastAsia="Times New Roman" w:hAnsi="Times New Roman"/>
+          <w:sz w:val="20"/>
+          <w:szCs w:val="20"/>
+          <w:rtl w:val="0"/>
+        </w:rPr>
+        <w:t xml:space="preserve">Where text references help: In vwa_classifieds_111 (GT=FAILURE), GPT-4.1 Nano without a reference correctly identifies the task failed but provides incomplete reasoning. With a text reference, it additionally notes the jersey team name mismatch, providing more actionable feedback.</w:t>
+      </w:r>
+    </w:p>
+    <w:p>
+      <w:pPr>
         <w:pStyle w:val="Normal"/>
-      </w:pPr>
-      <w:r>
-        <w:rPr>
-          <w:rFonts w:ascii="Times New Roman" w:cs="Times New Roman" w:eastAsia="Times New Roman" w:hAnsi="Times New Roman"/>
-          <w:sz w:val="20"/>
-          <w:szCs w:val="20"/>
-          <w:rtl w:val="0"/>
-        </w:rPr>
-        <w:t xml:space="preserve">Where text references help: In vwa_classifieds_111 (GT=FAILURE), GPT-4.1 Nano without a reference correctly identifies the task failed but provides incomplete reasoning. With a text reference, it additionally notes the jersey team name mismatch, providing more actionable feedback.</w:t>
-      </w:r>
-    </w:p>
-    <w:p>
-      <w:pPr>
         <w:jc w:val="both"/>
         <w:rPr>
           <w:rFonts w:ascii="Helvetica Neue" w:cs="Helvetica Neue" w:eastAsia="Helvetica Neue" w:hAnsi="Helvetica Neue"/>
@@ -22141,14 +22142,14 @@
           <w:sz w:val="44"/>
           <w:szCs w:val="44"/>
         </w:rPr>
+      </w:pPr>
+      <w:r>
+        <w:t/>
+      </w:r>
+    </w:p>
+    <w:p>
+      <w:pPr>
         <w:pStyle w:val="Normal"/>
-      </w:pPr>
-      <w:r>
-        <w:t/>
-      </w:r>
-    </w:p>
-    <w:p>
-      <w:pPr>
         <w:jc w:val="both"/>
         <w:rPr>
           <w:rFonts w:ascii="Helvetica Neue" w:cs="Helvetica Neue" w:eastAsia="Helvetica Neue" w:hAnsi="Helvetica Neue"/>
@@ -22157,20 +22158,20 @@
           <w:sz w:val="44"/>
           <w:szCs w:val="44"/>
         </w:rPr>
+      </w:pPr>
+      <w:r>
+        <w:rPr>
+          <w:rFonts w:ascii="Times New Roman" w:cs="Times New Roman" w:eastAsia="Times New Roman" w:hAnsi="Times New Roman"/>
+          <w:sz w:val="20"/>
+          <w:szCs w:val="20"/>
+          <w:rtl w:val="0"/>
+        </w:rPr>
+        <w:t xml:space="preserve">Where text references hurt: In vwa_classifieds_144 (GT=FAILURE), GPT-4.1 Mini without a reference correctly identifies that the comment text is lowercase ('how funky...') rather than the required 'How funky...'. With a text reference, it overlooks this case-sensitivity issue, likely because the reference states the expected comment without emphasizing exact case matching.</w:t>
+      </w:r>
+    </w:p>
+    <w:p>
+      <w:pPr>
         <w:pStyle w:val="Normal"/>
-      </w:pPr>
-      <w:r>
-        <w:rPr>
-          <w:rFonts w:ascii="Times New Roman" w:cs="Times New Roman" w:eastAsia="Times New Roman" w:hAnsi="Times New Roman"/>
-          <w:sz w:val="20"/>
-          <w:szCs w:val="20"/>
-          <w:rtl w:val="0"/>
-        </w:rPr>
-        <w:t xml:space="preserve">Where text references hurt: In vwa_classifieds_144 (GT=FAILURE), GPT-4.1 Mini without a reference correctly identifies that the comment text is lowercase ('how funky...') rather than the required 'How funky...'. With a text reference, it overlooks this case-sensitivity issue, likely because the reference states the expected comment without emphasizing exact case matching.</w:t>
-      </w:r>
-    </w:p>
-    <w:p>
-      <w:pPr>
         <w:jc w:val="both"/>
         <w:rPr>
           <w:rFonts w:ascii="Helvetica Neue" w:cs="Helvetica Neue" w:eastAsia="Helvetica Neue" w:hAnsi="Helvetica Neue"/>
@@ -22179,20 +22180,20 @@
           <w:sz w:val="44"/>
           <w:szCs w:val="44"/>
         </w:rPr>
+      </w:pPr>
+      <w:r>
+        <w:rPr>
+          <w:rFonts w:ascii="Times New Roman" w:cs="Times New Roman" w:eastAsia="Times New Roman" w:hAnsi="Times New Roman"/>
+          <w:sz w:val="20"/>
+          <w:szCs w:val="20"/>
+          <w:rtl w:val="0"/>
+        </w:rPr>
+        <w:t xml:space="preserve">These examples illustrate that text references are most helpful when they provide structured evaluation criteria that the verifier can systematically check. They are least helpful when the verifier uses the reference as a proxy for task completion rather than as a checklist.</w:t>
+      </w:r>
+    </w:p>
+    <w:p>
+      <w:pPr>
         <w:pStyle w:val="Normal"/>
-      </w:pPr>
-      <w:r>
-        <w:rPr>
-          <w:rFonts w:ascii="Times New Roman" w:cs="Times New Roman" w:eastAsia="Times New Roman" w:hAnsi="Times New Roman"/>
-          <w:sz w:val="20"/>
-          <w:szCs w:val="20"/>
-          <w:rtl w:val="0"/>
-        </w:rPr>
-        <w:t xml:space="preserve">These examples illustrate that text references are most helpful when they provide structured evaluation criteria that the verifier can systematically check. They are least helpful when the verifier uses the reference as a proxy for task completion rather than as a checklist.</w:t>
-      </w:r>
-    </w:p>
-    <w:p>
-      <w:pPr>
         <w:jc w:val="both"/>
         <w:rPr>
           <w:rFonts w:ascii="Helvetica Neue" w:cs="Helvetica Neue" w:eastAsia="Helvetica Neue" w:hAnsi="Helvetica Neue"/>
@@ -22201,7 +22202,6 @@
           <w:sz w:val="44"/>
           <w:szCs w:val="44"/>
         </w:rPr>
-        <w:pStyle w:val="Normal"/>
       </w:pPr>
       <w:r>
         <w:t/>
@@ -22209,6 +22209,7 @@
     </w:p>
     <w:p>
       <w:pPr>
+        <w:pStyle w:val="Heading2"/>
         <w:jc w:val="both"/>
         <w:rPr>
           <w:rFonts w:ascii="Helvetica Neue" w:cs="Helvetica Neue" w:eastAsia="Helvetica Neue" w:hAnsi="Helvetica Neue"/>
@@ -22217,7 +22218,6 @@
           <w:sz w:val="44"/>
           <w:szCs w:val="44"/>
         </w:rPr>
-        <w:pStyle w:val="Heading2"/>
       </w:pPr>
       <w:r>
         <w:rPr>
@@ -22235,6 +22235,7 @@
     </w:p>
     <w:p>
       <w:pPr>
+        <w:pStyle w:val="Normal"/>
         <w:jc w:val="both"/>
         <w:rPr>
           <w:rFonts w:ascii="Helvetica Neue" w:cs="Helvetica Neue" w:eastAsia="Helvetica Neue" w:hAnsi="Helvetica Neue"/>
@@ -22243,14 +22244,14 @@
           <w:sz w:val="44"/>
           <w:szCs w:val="44"/>
         </w:rPr>
+      </w:pPr>
+      <w:r>
+        <w:t/>
+      </w:r>
+    </w:p>
+    <w:p>
+      <w:pPr>
         <w:pStyle w:val="Normal"/>
-      </w:pPr>
-      <w:r>
-        <w:t/>
-      </w:r>
-    </w:p>
-    <w:p>
-      <w:pPr>
         <w:jc w:val="center"/>
         <w:rPr>
           <w:rFonts w:ascii="Helvetica Neue" w:cs="Helvetica Neue" w:eastAsia="Helvetica Neue" w:hAnsi="Helvetica Neue"/>
@@ -22259,7 +22260,6 @@
           <w:sz w:val="44"/>
           <w:szCs w:val="44"/>
         </w:rPr>
-        <w:pStyle w:val="Normal"/>
       </w:pPr>
       <w:r>
         <w:rPr>
@@ -23278,6 +23278,7 @@
     </w:tbl>
     <w:p>
       <w:pPr>
+        <w:pStyle w:val="Normal"/>
         <w:jc w:val="both"/>
         <w:rPr>
           <w:rFonts w:ascii="Helvetica Neue" w:cs="Helvetica Neue" w:eastAsia="Helvetica Neue" w:hAnsi="Helvetica Neue"/>
@@ -23286,20 +23287,20 @@
           <w:sz w:val="44"/>
           <w:szCs w:val="44"/>
         </w:rPr>
+      </w:pPr>
+      <w:r>
+        <w:rPr>
+          <w:rFonts w:ascii="Times New Roman" w:cs="Times New Roman" w:eastAsia="Times New Roman" w:hAnsi="Times New Roman"/>
+          <w:sz w:val="20"/>
+          <w:szCs w:val="20"/>
+          <w:rtl w:val="0"/>
+        </w:rPr>
+        <w:t xml:space="preserve">GPT-4.1 Nano offers the lowest cost ($0.26 for 909 instances in Condition B) and a good cost-accuracy tradeoff. Claude Sonnet 4 ($9.11) is the most expensive but the most accurate and by far the best calibrated.</w:t>
+      </w:r>
+    </w:p>
+    <w:p>
+      <w:pPr>
         <w:pStyle w:val="Normal"/>
-      </w:pPr>
-      <w:r>
-        <w:rPr>
-          <w:rFonts w:ascii="Times New Roman" w:cs="Times New Roman" w:eastAsia="Times New Roman" w:hAnsi="Times New Roman"/>
-          <w:sz w:val="20"/>
-          <w:szCs w:val="20"/>
-          <w:rtl w:val="0"/>
-        </w:rPr>
-        <w:t xml:space="preserve">GPT-4.1 Nano offers the lowest cost ($0.26 for 909 instances in Condition B) and a good cost-accuracy tradeoff. Claude Sonnet 4 ($9.11) is the most expensive but the most accurate and by far the best calibrated.</w:t>
-      </w:r>
-    </w:p>
-    <w:p>
-      <w:pPr>
         <w:jc w:val="both"/>
         <w:rPr>
           <w:rFonts w:ascii="Helvetica Neue" w:cs="Helvetica Neue" w:eastAsia="Helvetica Neue" w:hAnsi="Helvetica Neue"/>
@@ -23308,14 +23309,14 @@
           <w:sz w:val="44"/>
           <w:szCs w:val="44"/>
         </w:rPr>
+      </w:pPr>
+      <w:r>
+        <w:t/>
+      </w:r>
+    </w:p>
+    <w:p>
+      <w:pPr>
         <w:pStyle w:val="Normal"/>
-      </w:pPr>
-      <w:r>
-        <w:t/>
-      </w:r>
-    </w:p>
-    <w:p>
-      <w:pPr>
         <w:jc w:val="both"/>
         <w:rPr>
           <w:rFonts w:ascii="Helvetica Neue" w:cs="Helvetica Neue" w:eastAsia="Helvetica Neue" w:hAnsi="Helvetica Neue"/>
@@ -23324,14 +23325,14 @@
           <w:sz w:val="44"/>
           <w:szCs w:val="44"/>
         </w:rPr>
+      </w:pPr>
+      <w:r>
+        <w:t/>
+      </w:r>
+    </w:p>
+    <w:p>
+      <w:pPr>
         <w:pStyle w:val="Normal"/>
-      </w:pPr>
-      <w:r>
-        <w:t/>
-      </w:r>
-    </w:p>
-    <w:p>
-      <w:pPr>
         <w:jc w:val="both"/>
         <w:rPr>
           <w:rFonts w:ascii="Helvetica Neue" w:cs="Helvetica Neue" w:eastAsia="Helvetica Neue" w:hAnsi="Helvetica Neue"/>
@@ -23340,20 +23341,20 @@
           <w:sz w:val="44"/>
           <w:szCs w:val="44"/>
         </w:rPr>
+      </w:pPr>
+      <w:r>
+        <w:rPr>
+          <w:rFonts w:ascii="Times New Roman" w:cs="Times New Roman" w:eastAsia="Times New Roman" w:hAnsi="Times New Roman"/>
+          <w:sz w:val="20"/>
+          <w:szCs w:val="20"/>
+          <w:rtl w:val="0"/>
+        </w:rPr>
+        <w:t xml:space="preserve">Visual references add modest cost, between $0.23 and $3.64 per model for Conditions C and D combined on the 147-instance subset, but do not consistently improve verification accuracy, so text references with evaluation criteria remain the better default.</w:t>
+      </w:r>
+    </w:p>
+    <w:p>
+      <w:pPr>
         <w:pStyle w:val="Normal"/>
-      </w:pPr>
-      <w:r>
-        <w:rPr>
-          <w:rFonts w:ascii="Times New Roman" w:cs="Times New Roman" w:eastAsia="Times New Roman" w:hAnsi="Times New Roman"/>
-          <w:sz w:val="20"/>
-          <w:szCs w:val="20"/>
-          <w:rtl w:val="0"/>
-        </w:rPr>
-        <w:t xml:space="preserve">Visual references add modest cost, between $0.23 and $3.64 per model for Conditions C and D combined on the 147-instance subset, but do not consistently improve verification accuracy, so text references with evaluation criteria remain the better default.</w:t>
-      </w:r>
-    </w:p>
-    <w:p>
-      <w:pPr>
         <w:jc w:val="both"/>
         <w:rPr>
           <w:rFonts w:ascii="Helvetica Neue" w:cs="Helvetica Neue" w:eastAsia="Helvetica Neue" w:hAnsi="Helvetica Neue"/>
@@ -23362,7 +23363,6 @@
           <w:sz w:val="44"/>
           <w:szCs w:val="44"/>
         </w:rPr>
-        <w:pStyle w:val="Normal"/>
       </w:pPr>
       <w:r>
         <w:t/>
@@ -44631,7 +44631,7 @@
     <w:sectPr>
       <w:type w:val="continuous"/>
       <w:pgSz w:h="15840" w:w="12240" w:orient="portrait"/>
-      <w:pgMar w:bottom="1440" w:top="1440" w:left="1440" w:right="1440" w:header="720" w:footer="720"/>
+      <w:pgMar w:bottom="1440" w:top="1440" w:left="1440" w:right="1440" w:header="720" w:footer="720" w:gutter="0"/>
       <w:cols w:equalWidth="0" w:num="2">
         <w:col w:space="720" w:w="4320"/>
         <w:col w:space="0" w:w="4320"/>

</xml_diff>